<commit_message>
update GATE class schedule in report template
</commit_message>
<xml_diff>
--- a/config/report_template.docx
+++ b/config/report_template.docx
@@ -16,7 +16,6 @@
         </w:rPr>
         <w:t xml:space="preserve">ASET Performance Report for </w:t>
       </w:r>
-      <w:proofErr w:type="gramStart"/>
       <w:r>
         <w:rPr>
           <w:b/>
@@ -32,43 +31,16 @@
           <w:bCs/>
           <w:color w:val="5B9BD5" w:themeColor="accent5"/>
         </w:rPr>
-        <w:t>student</w:t>
-      </w:r>
-      <w:proofErr w:type="gramEnd"/>
+        <w:t>student_name</w:t>
+      </w:r>
+      <w:proofErr w:type="spellEnd"/>
       <w:r>
         <w:rPr>
           <w:b/>
           <w:bCs/>
           <w:color w:val="5B9BD5" w:themeColor="accent5"/>
         </w:rPr>
-        <w:t>_</w:t>
-      </w:r>
-      <w:proofErr w:type="gramStart"/>
-      <w:r>
-        <w:rPr>
-          <w:b/>
-          <w:bCs/>
-          <w:color w:val="5B9BD5" w:themeColor="accent5"/>
-        </w:rPr>
-        <w:t>name</w:t>
-      </w:r>
-      <w:proofErr w:type="spellEnd"/>
-      <w:r>
-        <w:rPr>
-          <w:b/>
-          <w:bCs/>
-          <w:color w:val="5B9BD5" w:themeColor="accent5"/>
-        </w:rPr>
-        <w:t xml:space="preserve"> }</w:t>
-      </w:r>
-      <w:proofErr w:type="gramEnd"/>
-      <w:r>
-        <w:rPr>
-          <w:b/>
-          <w:bCs/>
-          <w:color w:val="5B9BD5" w:themeColor="accent5"/>
-        </w:rPr>
-        <w:t>}</w:t>
+        <w:t xml:space="preserve"> }}</w:t>
       </w:r>
     </w:p>
     <w:p>
@@ -1025,21 +997,7 @@
         <w:rPr>
           <w:color w:val="000000"/>
         </w:rPr>
-        <w:t xml:space="preserve">Your child’s Total Standard Score (TSS) which is the </w:t>
-      </w:r>
-      <w:proofErr w:type="gramStart"/>
-      <w:r>
-        <w:rPr>
-          <w:color w:val="000000"/>
-        </w:rPr>
-        <w:t>sum total</w:t>
-      </w:r>
-      <w:proofErr w:type="gramEnd"/>
-      <w:r>
-        <w:rPr>
-          <w:color w:val="000000"/>
-        </w:rPr>
-        <w:t xml:space="preserve"> of the four individual standard scores.</w:t>
+        <w:t>Your child’s Total Standard Score (TSS) which is the sum total of the four individual standard scores.</w:t>
       </w:r>
     </w:p>
     <w:p/>
@@ -1151,17 +1109,12 @@
             <w:tcW w:w="2682" w:type="dxa"/>
           </w:tcPr>
           <w:p>
-            <w:proofErr w:type="gramStart"/>
             <w:r>
               <w:t xml:space="preserve">{{ </w:t>
             </w:r>
             <w:proofErr w:type="spellStart"/>
             <w:r>
-              <w:t>reading</w:t>
-            </w:r>
-            <w:proofErr w:type="gramEnd"/>
-            <w:r>
-              <w:t>_score</w:t>
+              <w:t>reading_score</w:t>
             </w:r>
             <w:proofErr w:type="spellEnd"/>
             <w:r>
@@ -1209,17 +1162,12 @@
             <w:tcW w:w="2682" w:type="dxa"/>
           </w:tcPr>
           <w:p>
-            <w:proofErr w:type="gramStart"/>
             <w:r>
               <w:t xml:space="preserve">{{ </w:t>
             </w:r>
             <w:proofErr w:type="spellStart"/>
             <w:r>
-              <w:t>writing</w:t>
-            </w:r>
-            <w:proofErr w:type="gramEnd"/>
-            <w:r>
-              <w:t>_score</w:t>
+              <w:t>writing_score</w:t>
             </w:r>
             <w:proofErr w:type="spellEnd"/>
             <w:r>
@@ -1267,17 +1215,12 @@
             <w:tcW w:w="2682" w:type="dxa"/>
           </w:tcPr>
           <w:p>
-            <w:proofErr w:type="gramStart"/>
             <w:r>
               <w:t xml:space="preserve">{{ </w:t>
             </w:r>
             <w:proofErr w:type="spellStart"/>
             <w:r>
-              <w:t>qr</w:t>
-            </w:r>
-            <w:proofErr w:type="gramEnd"/>
-            <w:r>
-              <w:t>_score</w:t>
+              <w:t>qr_score</w:t>
             </w:r>
             <w:proofErr w:type="spellEnd"/>
             <w:r>
@@ -1325,17 +1268,12 @@
             <w:tcW w:w="2682" w:type="dxa"/>
           </w:tcPr>
           <w:p>
-            <w:proofErr w:type="gramStart"/>
             <w:r>
               <w:t xml:space="preserve">{{ </w:t>
             </w:r>
             <w:proofErr w:type="spellStart"/>
             <w:r>
-              <w:t>ar</w:t>
-            </w:r>
-            <w:proofErr w:type="gramEnd"/>
-            <w:r>
-              <w:t>_score</w:t>
+              <w:t>ar_score</w:t>
             </w:r>
             <w:proofErr w:type="spellEnd"/>
             <w:r>
@@ -1389,7 +1327,6 @@
                 <w:bCs/>
               </w:rPr>
             </w:pPr>
-            <w:proofErr w:type="gramStart"/>
             <w:r>
               <w:rPr>
                 <w:b/>
@@ -1405,16 +1342,7 @@
                 <w:bCs/>
                 <w:color w:val="5B9BD5" w:themeColor="accent5"/>
               </w:rPr>
-              <w:t>total</w:t>
-            </w:r>
-            <w:proofErr w:type="gramEnd"/>
-            <w:r>
-              <w:rPr>
-                <w:b/>
-                <w:bCs/>
-                <w:color w:val="5B9BD5" w:themeColor="accent5"/>
-              </w:rPr>
-              <w:t>_score</w:t>
+              <w:t>total_score</w:t>
             </w:r>
             <w:proofErr w:type="spellEnd"/>
             <w:r>
@@ -2084,7 +2012,6 @@
                 <w:color w:val="000000" w:themeColor="text1"/>
               </w:rPr>
             </w:pPr>
-            <w:proofErr w:type="gramStart"/>
             <w:r>
               <w:rPr>
                 <w:color w:val="000000" w:themeColor="text1"/>
@@ -2096,49 +2023,14 @@
               <w:rPr>
                 <w:color w:val="000000" w:themeColor="text1"/>
               </w:rPr>
-              <w:t>rc</w:t>
-            </w:r>
-            <w:proofErr w:type="gramEnd"/>
+              <w:t>rc.concepts</w:t>
+            </w:r>
+            <w:proofErr w:type="spellEnd"/>
             <w:r>
               <w:rPr>
                 <w:color w:val="000000" w:themeColor="text1"/>
               </w:rPr>
-              <w:t>.</w:t>
-            </w:r>
-            <w:proofErr w:type="gramStart"/>
-            <w:r>
-              <w:rPr>
-                <w:color w:val="000000" w:themeColor="text1"/>
-              </w:rPr>
-              <w:t>concepts</w:t>
-            </w:r>
-            <w:proofErr w:type="spellEnd"/>
-            <w:r>
-              <w:rPr>
-                <w:color w:val="000000" w:themeColor="text1"/>
-              </w:rPr>
-              <w:t>[</w:t>
-            </w:r>
-            <w:proofErr w:type="gramEnd"/>
-            <w:r>
-              <w:rPr>
-                <w:color w:val="000000" w:themeColor="text1"/>
-              </w:rPr>
-              <w:t>0</w:t>
-            </w:r>
-            <w:proofErr w:type="gramStart"/>
-            <w:r>
-              <w:rPr>
-                <w:color w:val="000000" w:themeColor="text1"/>
-              </w:rPr>
-              <w:t>].questions</w:t>
-            </w:r>
-            <w:proofErr w:type="gramEnd"/>
-            <w:r>
-              <w:rPr>
-                <w:color w:val="000000" w:themeColor="text1"/>
-              </w:rPr>
-              <w:t xml:space="preserve"> }}</w:t>
+              <w:t>[0].questions }}</w:t>
             </w:r>
           </w:p>
         </w:tc>
@@ -2165,7 +2057,6 @@
                 <w:color w:val="5B9BD5" w:themeColor="accent5"/>
               </w:rPr>
             </w:pPr>
-            <w:proofErr w:type="gramStart"/>
             <w:r>
               <w:rPr>
                 <w:color w:val="5B9BD5" w:themeColor="accent5"/>
@@ -2177,56 +2068,21 @@
               <w:rPr>
                 <w:color w:val="5B9BD5" w:themeColor="accent5"/>
               </w:rPr>
-              <w:t>rc</w:t>
-            </w:r>
-            <w:proofErr w:type="gramEnd"/>
-            <w:r>
-              <w:rPr>
-                <w:color w:val="5B9BD5" w:themeColor="accent5"/>
-              </w:rPr>
-              <w:t>.</w:t>
-            </w:r>
-            <w:proofErr w:type="gramStart"/>
-            <w:r>
-              <w:rPr>
-                <w:color w:val="5B9BD5" w:themeColor="accent5"/>
-              </w:rPr>
-              <w:t>concepts</w:t>
+              <w:t>rc.concepts</w:t>
             </w:r>
             <w:proofErr w:type="spellEnd"/>
             <w:r>
               <w:rPr>
                 <w:color w:val="5B9BD5" w:themeColor="accent5"/>
               </w:rPr>
-              <w:t>[</w:t>
-            </w:r>
-            <w:proofErr w:type="gramEnd"/>
-            <w:r>
-              <w:rPr>
-                <w:color w:val="5B9BD5" w:themeColor="accent5"/>
-              </w:rPr>
-              <w:t>0</w:t>
-            </w:r>
-            <w:proofErr w:type="gramStart"/>
-            <w:r>
-              <w:rPr>
-                <w:color w:val="5B9BD5" w:themeColor="accent5"/>
-              </w:rPr>
-              <w:t>].</w:t>
+              <w:t>[0].</w:t>
             </w:r>
             <w:proofErr w:type="spellStart"/>
             <w:r>
               <w:rPr>
                 <w:color w:val="5B9BD5" w:themeColor="accent5"/>
               </w:rPr>
-              <w:t>done</w:t>
-            </w:r>
-            <w:proofErr w:type="gramEnd"/>
-            <w:r>
-              <w:rPr>
-                <w:color w:val="5B9BD5" w:themeColor="accent5"/>
-              </w:rPr>
-              <w:t>_well</w:t>
+              <w:t>done_well</w:t>
             </w:r>
             <w:proofErr w:type="spellEnd"/>
             <w:r>
@@ -2260,7 +2116,6 @@
                 <w:color w:val="5B9BD5" w:themeColor="accent5"/>
               </w:rPr>
             </w:pPr>
-            <w:proofErr w:type="gramStart"/>
             <w:r>
               <w:rPr>
                 <w:color w:val="5B9BD5" w:themeColor="accent5"/>
@@ -2272,49 +2127,14 @@
               <w:rPr>
                 <w:color w:val="5B9BD5" w:themeColor="accent5"/>
               </w:rPr>
-              <w:t>rc</w:t>
-            </w:r>
-            <w:proofErr w:type="gramEnd"/>
-            <w:r>
-              <w:rPr>
-                <w:color w:val="5B9BD5" w:themeColor="accent5"/>
-              </w:rPr>
-              <w:t>.</w:t>
-            </w:r>
-            <w:proofErr w:type="gramStart"/>
-            <w:r>
-              <w:rPr>
-                <w:color w:val="5B9BD5" w:themeColor="accent5"/>
-              </w:rPr>
-              <w:t>concepts</w:t>
+              <w:t>rc.concepts</w:t>
             </w:r>
             <w:proofErr w:type="spellEnd"/>
             <w:r>
               <w:rPr>
                 <w:color w:val="5B9BD5" w:themeColor="accent5"/>
               </w:rPr>
-              <w:t>[</w:t>
-            </w:r>
-            <w:proofErr w:type="gramEnd"/>
-            <w:r>
-              <w:rPr>
-                <w:color w:val="5B9BD5" w:themeColor="accent5"/>
-              </w:rPr>
-              <w:t>0</w:t>
-            </w:r>
-            <w:proofErr w:type="gramStart"/>
-            <w:r>
-              <w:rPr>
-                <w:color w:val="5B9BD5" w:themeColor="accent5"/>
-              </w:rPr>
-              <w:t>].improve</w:t>
-            </w:r>
-            <w:proofErr w:type="gramEnd"/>
-            <w:r>
-              <w:rPr>
-                <w:color w:val="5B9BD5" w:themeColor="accent5"/>
-              </w:rPr>
-              <w:t xml:space="preserve"> }}</w:t>
+              <w:t>[0].improve }}</w:t>
             </w:r>
           </w:p>
         </w:tc>
@@ -2368,7 +2188,6 @@
                 <w:color w:val="000000" w:themeColor="text1"/>
               </w:rPr>
             </w:pPr>
-            <w:proofErr w:type="gramStart"/>
             <w:r>
               <w:rPr>
                 <w:color w:val="000000" w:themeColor="text1"/>
@@ -2380,49 +2199,14 @@
               <w:rPr>
                 <w:color w:val="000000" w:themeColor="text1"/>
               </w:rPr>
-              <w:t>rc</w:t>
-            </w:r>
-            <w:proofErr w:type="gramEnd"/>
+              <w:t>rc.concepts</w:t>
+            </w:r>
+            <w:proofErr w:type="spellEnd"/>
             <w:r>
               <w:rPr>
                 <w:color w:val="000000" w:themeColor="text1"/>
               </w:rPr>
-              <w:t>.</w:t>
-            </w:r>
-            <w:proofErr w:type="gramStart"/>
-            <w:r>
-              <w:rPr>
-                <w:color w:val="000000" w:themeColor="text1"/>
-              </w:rPr>
-              <w:t>concepts</w:t>
-            </w:r>
-            <w:proofErr w:type="spellEnd"/>
-            <w:r>
-              <w:rPr>
-                <w:color w:val="000000" w:themeColor="text1"/>
-              </w:rPr>
-              <w:t>[</w:t>
-            </w:r>
-            <w:proofErr w:type="gramEnd"/>
-            <w:r>
-              <w:rPr>
-                <w:color w:val="000000" w:themeColor="text1"/>
-              </w:rPr>
-              <w:t>1</w:t>
-            </w:r>
-            <w:proofErr w:type="gramStart"/>
-            <w:r>
-              <w:rPr>
-                <w:color w:val="000000" w:themeColor="text1"/>
-              </w:rPr>
-              <w:t>].questions</w:t>
-            </w:r>
-            <w:proofErr w:type="gramEnd"/>
-            <w:r>
-              <w:rPr>
-                <w:color w:val="000000" w:themeColor="text1"/>
-              </w:rPr>
-              <w:t xml:space="preserve"> }}</w:t>
+              <w:t>[1].questions }}</w:t>
             </w:r>
           </w:p>
         </w:tc>
@@ -2449,7 +2233,6 @@
                 <w:color w:val="5B9BD5" w:themeColor="accent5"/>
               </w:rPr>
             </w:pPr>
-            <w:proofErr w:type="gramStart"/>
             <w:r>
               <w:rPr>
                 <w:color w:val="5B9BD5" w:themeColor="accent5"/>
@@ -2461,56 +2244,21 @@
               <w:rPr>
                 <w:color w:val="5B9BD5" w:themeColor="accent5"/>
               </w:rPr>
-              <w:t>rc</w:t>
-            </w:r>
-            <w:proofErr w:type="gramEnd"/>
-            <w:r>
-              <w:rPr>
-                <w:color w:val="5B9BD5" w:themeColor="accent5"/>
-              </w:rPr>
-              <w:t>.</w:t>
-            </w:r>
-            <w:proofErr w:type="gramStart"/>
-            <w:r>
-              <w:rPr>
-                <w:color w:val="5B9BD5" w:themeColor="accent5"/>
-              </w:rPr>
-              <w:t>concepts</w:t>
+              <w:t>rc.concepts</w:t>
             </w:r>
             <w:proofErr w:type="spellEnd"/>
             <w:r>
               <w:rPr>
                 <w:color w:val="5B9BD5" w:themeColor="accent5"/>
               </w:rPr>
-              <w:t>[</w:t>
-            </w:r>
-            <w:proofErr w:type="gramEnd"/>
-            <w:r>
-              <w:rPr>
-                <w:color w:val="5B9BD5" w:themeColor="accent5"/>
-              </w:rPr>
-              <w:t>1</w:t>
-            </w:r>
-            <w:proofErr w:type="gramStart"/>
-            <w:r>
-              <w:rPr>
-                <w:color w:val="5B9BD5" w:themeColor="accent5"/>
-              </w:rPr>
-              <w:t>].</w:t>
+              <w:t>[1].</w:t>
             </w:r>
             <w:proofErr w:type="spellStart"/>
             <w:r>
               <w:rPr>
                 <w:color w:val="5B9BD5" w:themeColor="accent5"/>
               </w:rPr>
-              <w:t>done</w:t>
-            </w:r>
-            <w:proofErr w:type="gramEnd"/>
-            <w:r>
-              <w:rPr>
-                <w:color w:val="5B9BD5" w:themeColor="accent5"/>
-              </w:rPr>
-              <w:t>_well</w:t>
+              <w:t>done_well</w:t>
             </w:r>
             <w:proofErr w:type="spellEnd"/>
             <w:r>
@@ -2544,7 +2292,6 @@
                 <w:color w:val="5B9BD5" w:themeColor="accent5"/>
               </w:rPr>
             </w:pPr>
-            <w:proofErr w:type="gramStart"/>
             <w:r>
               <w:rPr>
                 <w:color w:val="5B9BD5" w:themeColor="accent5"/>
@@ -2556,49 +2303,14 @@
               <w:rPr>
                 <w:color w:val="5B9BD5" w:themeColor="accent5"/>
               </w:rPr>
-              <w:t>rc</w:t>
-            </w:r>
-            <w:proofErr w:type="gramEnd"/>
-            <w:r>
-              <w:rPr>
-                <w:color w:val="5B9BD5" w:themeColor="accent5"/>
-              </w:rPr>
-              <w:t>.</w:t>
-            </w:r>
-            <w:proofErr w:type="gramStart"/>
-            <w:r>
-              <w:rPr>
-                <w:color w:val="5B9BD5" w:themeColor="accent5"/>
-              </w:rPr>
-              <w:t>concepts</w:t>
+              <w:t>rc.concepts</w:t>
             </w:r>
             <w:proofErr w:type="spellEnd"/>
             <w:r>
               <w:rPr>
                 <w:color w:val="5B9BD5" w:themeColor="accent5"/>
               </w:rPr>
-              <w:t>[</w:t>
-            </w:r>
-            <w:proofErr w:type="gramEnd"/>
-            <w:r>
-              <w:rPr>
-                <w:color w:val="5B9BD5" w:themeColor="accent5"/>
-              </w:rPr>
-              <w:t>1</w:t>
-            </w:r>
-            <w:proofErr w:type="gramStart"/>
-            <w:r>
-              <w:rPr>
-                <w:color w:val="5B9BD5" w:themeColor="accent5"/>
-              </w:rPr>
-              <w:t>].improve</w:t>
-            </w:r>
-            <w:proofErr w:type="gramEnd"/>
-            <w:r>
-              <w:rPr>
-                <w:color w:val="5B9BD5" w:themeColor="accent5"/>
-              </w:rPr>
-              <w:t xml:space="preserve"> }}</w:t>
+              <w:t>[1].improve }}</w:t>
             </w:r>
           </w:p>
         </w:tc>
@@ -2652,7 +2364,6 @@
                 <w:color w:val="000000" w:themeColor="text1"/>
               </w:rPr>
             </w:pPr>
-            <w:proofErr w:type="gramStart"/>
             <w:r>
               <w:rPr>
                 <w:color w:val="000000" w:themeColor="text1"/>
@@ -2664,49 +2375,14 @@
               <w:rPr>
                 <w:color w:val="000000" w:themeColor="text1"/>
               </w:rPr>
-              <w:t>rc</w:t>
-            </w:r>
-            <w:proofErr w:type="gramEnd"/>
+              <w:t>rc.concepts</w:t>
+            </w:r>
+            <w:proofErr w:type="spellEnd"/>
             <w:r>
               <w:rPr>
                 <w:color w:val="000000" w:themeColor="text1"/>
               </w:rPr>
-              <w:t>.</w:t>
-            </w:r>
-            <w:proofErr w:type="gramStart"/>
-            <w:r>
-              <w:rPr>
-                <w:color w:val="000000" w:themeColor="text1"/>
-              </w:rPr>
-              <w:t>concepts</w:t>
-            </w:r>
-            <w:proofErr w:type="spellEnd"/>
-            <w:r>
-              <w:rPr>
-                <w:color w:val="000000" w:themeColor="text1"/>
-              </w:rPr>
-              <w:t>[</w:t>
-            </w:r>
-            <w:proofErr w:type="gramEnd"/>
-            <w:r>
-              <w:rPr>
-                <w:color w:val="000000" w:themeColor="text1"/>
-              </w:rPr>
-              <w:t>2</w:t>
-            </w:r>
-            <w:proofErr w:type="gramStart"/>
-            <w:r>
-              <w:rPr>
-                <w:color w:val="000000" w:themeColor="text1"/>
-              </w:rPr>
-              <w:t>].questions</w:t>
-            </w:r>
-            <w:proofErr w:type="gramEnd"/>
-            <w:r>
-              <w:rPr>
-                <w:color w:val="000000" w:themeColor="text1"/>
-              </w:rPr>
-              <w:t xml:space="preserve"> }}</w:t>
+              <w:t>[2].questions }}</w:t>
             </w:r>
           </w:p>
         </w:tc>
@@ -2733,7 +2409,6 @@
                 <w:color w:val="5B9BD5" w:themeColor="accent5"/>
               </w:rPr>
             </w:pPr>
-            <w:proofErr w:type="gramStart"/>
             <w:r>
               <w:rPr>
                 <w:color w:val="5B9BD5" w:themeColor="accent5"/>
@@ -2745,56 +2420,21 @@
               <w:rPr>
                 <w:color w:val="5B9BD5" w:themeColor="accent5"/>
               </w:rPr>
-              <w:t>rc</w:t>
-            </w:r>
-            <w:proofErr w:type="gramEnd"/>
-            <w:r>
-              <w:rPr>
-                <w:color w:val="5B9BD5" w:themeColor="accent5"/>
-              </w:rPr>
-              <w:t>.</w:t>
-            </w:r>
-            <w:proofErr w:type="gramStart"/>
-            <w:r>
-              <w:rPr>
-                <w:color w:val="5B9BD5" w:themeColor="accent5"/>
-              </w:rPr>
-              <w:t>concepts</w:t>
+              <w:t>rc.concepts</w:t>
             </w:r>
             <w:proofErr w:type="spellEnd"/>
             <w:r>
               <w:rPr>
                 <w:color w:val="5B9BD5" w:themeColor="accent5"/>
               </w:rPr>
-              <w:t>[</w:t>
-            </w:r>
-            <w:proofErr w:type="gramEnd"/>
-            <w:r>
-              <w:rPr>
-                <w:color w:val="5B9BD5" w:themeColor="accent5"/>
-              </w:rPr>
-              <w:t>2</w:t>
-            </w:r>
-            <w:proofErr w:type="gramStart"/>
-            <w:r>
-              <w:rPr>
-                <w:color w:val="5B9BD5" w:themeColor="accent5"/>
-              </w:rPr>
-              <w:t>].</w:t>
+              <w:t>[2].</w:t>
             </w:r>
             <w:proofErr w:type="spellStart"/>
             <w:r>
               <w:rPr>
                 <w:color w:val="5B9BD5" w:themeColor="accent5"/>
               </w:rPr>
-              <w:t>done</w:t>
-            </w:r>
-            <w:proofErr w:type="gramEnd"/>
-            <w:r>
-              <w:rPr>
-                <w:color w:val="5B9BD5" w:themeColor="accent5"/>
-              </w:rPr>
-              <w:t>_well</w:t>
+              <w:t>done_well</w:t>
             </w:r>
             <w:proofErr w:type="spellEnd"/>
             <w:r>
@@ -2828,7 +2468,6 @@
                 <w:color w:val="5B9BD5" w:themeColor="accent5"/>
               </w:rPr>
             </w:pPr>
-            <w:proofErr w:type="gramStart"/>
             <w:r>
               <w:rPr>
                 <w:color w:val="5B9BD5" w:themeColor="accent5"/>
@@ -2840,49 +2479,14 @@
               <w:rPr>
                 <w:color w:val="5B9BD5" w:themeColor="accent5"/>
               </w:rPr>
-              <w:t>rc</w:t>
-            </w:r>
-            <w:proofErr w:type="gramEnd"/>
-            <w:r>
-              <w:rPr>
-                <w:color w:val="5B9BD5" w:themeColor="accent5"/>
-              </w:rPr>
-              <w:t>.</w:t>
-            </w:r>
-            <w:proofErr w:type="gramStart"/>
-            <w:r>
-              <w:rPr>
-                <w:color w:val="5B9BD5" w:themeColor="accent5"/>
-              </w:rPr>
-              <w:t>concepts</w:t>
+              <w:t>rc.concepts</w:t>
             </w:r>
             <w:proofErr w:type="spellEnd"/>
             <w:r>
               <w:rPr>
                 <w:color w:val="5B9BD5" w:themeColor="accent5"/>
               </w:rPr>
-              <w:t>[</w:t>
-            </w:r>
-            <w:proofErr w:type="gramEnd"/>
-            <w:r>
-              <w:rPr>
-                <w:color w:val="5B9BD5" w:themeColor="accent5"/>
-              </w:rPr>
-              <w:t>2</w:t>
-            </w:r>
-            <w:proofErr w:type="gramStart"/>
-            <w:r>
-              <w:rPr>
-                <w:color w:val="5B9BD5" w:themeColor="accent5"/>
-              </w:rPr>
-              <w:t>].improve</w:t>
-            </w:r>
-            <w:proofErr w:type="gramEnd"/>
-            <w:r>
-              <w:rPr>
-                <w:color w:val="5B9BD5" w:themeColor="accent5"/>
-              </w:rPr>
-              <w:t xml:space="preserve"> }}</w:t>
+              <w:t>[2].improve }}</w:t>
             </w:r>
           </w:p>
         </w:tc>
@@ -2936,7 +2540,6 @@
                 <w:color w:val="000000" w:themeColor="text1"/>
               </w:rPr>
             </w:pPr>
-            <w:proofErr w:type="gramStart"/>
             <w:r>
               <w:rPr>
                 <w:color w:val="000000" w:themeColor="text1"/>
@@ -2948,49 +2551,14 @@
               <w:rPr>
                 <w:color w:val="000000" w:themeColor="text1"/>
               </w:rPr>
-              <w:t>rc</w:t>
-            </w:r>
-            <w:proofErr w:type="gramEnd"/>
+              <w:t>rc.concepts</w:t>
+            </w:r>
+            <w:proofErr w:type="spellEnd"/>
             <w:r>
               <w:rPr>
                 <w:color w:val="000000" w:themeColor="text1"/>
               </w:rPr>
-              <w:t>.</w:t>
-            </w:r>
-            <w:proofErr w:type="gramStart"/>
-            <w:r>
-              <w:rPr>
-                <w:color w:val="000000" w:themeColor="text1"/>
-              </w:rPr>
-              <w:t>concepts</w:t>
-            </w:r>
-            <w:proofErr w:type="spellEnd"/>
-            <w:r>
-              <w:rPr>
-                <w:color w:val="000000" w:themeColor="text1"/>
-              </w:rPr>
-              <w:t>[</w:t>
-            </w:r>
-            <w:proofErr w:type="gramEnd"/>
-            <w:r>
-              <w:rPr>
-                <w:color w:val="000000" w:themeColor="text1"/>
-              </w:rPr>
-              <w:t>3</w:t>
-            </w:r>
-            <w:proofErr w:type="gramStart"/>
-            <w:r>
-              <w:rPr>
-                <w:color w:val="000000" w:themeColor="text1"/>
-              </w:rPr>
-              <w:t>].questions</w:t>
-            </w:r>
-            <w:proofErr w:type="gramEnd"/>
-            <w:r>
-              <w:rPr>
-                <w:color w:val="000000" w:themeColor="text1"/>
-              </w:rPr>
-              <w:t xml:space="preserve"> }}</w:t>
+              <w:t>[3].questions }}</w:t>
             </w:r>
           </w:p>
         </w:tc>
@@ -3017,7 +2585,6 @@
                 <w:color w:val="5B9BD5" w:themeColor="accent5"/>
               </w:rPr>
             </w:pPr>
-            <w:proofErr w:type="gramStart"/>
             <w:r>
               <w:rPr>
                 <w:color w:val="5B9BD5" w:themeColor="accent5"/>
@@ -3029,56 +2596,21 @@
               <w:rPr>
                 <w:color w:val="5B9BD5" w:themeColor="accent5"/>
               </w:rPr>
-              <w:t>rc</w:t>
-            </w:r>
-            <w:proofErr w:type="gramEnd"/>
-            <w:r>
-              <w:rPr>
-                <w:color w:val="5B9BD5" w:themeColor="accent5"/>
-              </w:rPr>
-              <w:t>.</w:t>
-            </w:r>
-            <w:proofErr w:type="gramStart"/>
-            <w:r>
-              <w:rPr>
-                <w:color w:val="5B9BD5" w:themeColor="accent5"/>
-              </w:rPr>
-              <w:t>concepts</w:t>
+              <w:t>rc.concepts</w:t>
             </w:r>
             <w:proofErr w:type="spellEnd"/>
             <w:r>
               <w:rPr>
                 <w:color w:val="5B9BD5" w:themeColor="accent5"/>
               </w:rPr>
-              <w:t>[</w:t>
-            </w:r>
-            <w:proofErr w:type="gramEnd"/>
-            <w:r>
-              <w:rPr>
-                <w:color w:val="5B9BD5" w:themeColor="accent5"/>
-              </w:rPr>
-              <w:t>3</w:t>
-            </w:r>
-            <w:proofErr w:type="gramStart"/>
-            <w:r>
-              <w:rPr>
-                <w:color w:val="5B9BD5" w:themeColor="accent5"/>
-              </w:rPr>
-              <w:t>].</w:t>
+              <w:t>[3].</w:t>
             </w:r>
             <w:proofErr w:type="spellStart"/>
             <w:r>
               <w:rPr>
                 <w:color w:val="5B9BD5" w:themeColor="accent5"/>
               </w:rPr>
-              <w:t>done</w:t>
-            </w:r>
-            <w:proofErr w:type="gramEnd"/>
-            <w:r>
-              <w:rPr>
-                <w:color w:val="5B9BD5" w:themeColor="accent5"/>
-              </w:rPr>
-              <w:t>_well</w:t>
+              <w:t>done_well</w:t>
             </w:r>
             <w:proofErr w:type="spellEnd"/>
             <w:r>
@@ -3112,7 +2644,6 @@
                 <w:color w:val="5B9BD5" w:themeColor="accent5"/>
               </w:rPr>
             </w:pPr>
-            <w:proofErr w:type="gramStart"/>
             <w:r>
               <w:rPr>
                 <w:color w:val="5B9BD5" w:themeColor="accent5"/>
@@ -3124,49 +2655,14 @@
               <w:rPr>
                 <w:color w:val="5B9BD5" w:themeColor="accent5"/>
               </w:rPr>
-              <w:t>rc</w:t>
-            </w:r>
-            <w:proofErr w:type="gramEnd"/>
-            <w:r>
-              <w:rPr>
-                <w:color w:val="5B9BD5" w:themeColor="accent5"/>
-              </w:rPr>
-              <w:t>.</w:t>
-            </w:r>
-            <w:proofErr w:type="gramStart"/>
-            <w:r>
-              <w:rPr>
-                <w:color w:val="5B9BD5" w:themeColor="accent5"/>
-              </w:rPr>
-              <w:t>concepts</w:t>
+              <w:t>rc.concepts</w:t>
             </w:r>
             <w:proofErr w:type="spellEnd"/>
             <w:r>
               <w:rPr>
                 <w:color w:val="5B9BD5" w:themeColor="accent5"/>
               </w:rPr>
-              <w:t>[</w:t>
-            </w:r>
-            <w:proofErr w:type="gramEnd"/>
-            <w:r>
-              <w:rPr>
-                <w:color w:val="5B9BD5" w:themeColor="accent5"/>
-              </w:rPr>
-              <w:t>3</w:t>
-            </w:r>
-            <w:proofErr w:type="gramStart"/>
-            <w:r>
-              <w:rPr>
-                <w:color w:val="5B9BD5" w:themeColor="accent5"/>
-              </w:rPr>
-              <w:t>].improve</w:t>
-            </w:r>
-            <w:proofErr w:type="gramEnd"/>
-            <w:r>
-              <w:rPr>
-                <w:color w:val="5B9BD5" w:themeColor="accent5"/>
-              </w:rPr>
-              <w:t xml:space="preserve"> }}</w:t>
+              <w:t>[3].improve }}</w:t>
             </w:r>
           </w:p>
         </w:tc>
@@ -3220,7 +2716,6 @@
                 <w:color w:val="000000" w:themeColor="text1"/>
               </w:rPr>
             </w:pPr>
-            <w:proofErr w:type="gramStart"/>
             <w:r>
               <w:rPr>
                 <w:color w:val="000000" w:themeColor="text1"/>
@@ -3232,49 +2727,14 @@
               <w:rPr>
                 <w:color w:val="000000" w:themeColor="text1"/>
               </w:rPr>
-              <w:t>rc</w:t>
-            </w:r>
-            <w:proofErr w:type="gramEnd"/>
+              <w:t>rc.concepts</w:t>
+            </w:r>
+            <w:proofErr w:type="spellEnd"/>
             <w:r>
               <w:rPr>
                 <w:color w:val="000000" w:themeColor="text1"/>
               </w:rPr>
-              <w:t>.</w:t>
-            </w:r>
-            <w:proofErr w:type="gramStart"/>
-            <w:r>
-              <w:rPr>
-                <w:color w:val="000000" w:themeColor="text1"/>
-              </w:rPr>
-              <w:t>concepts</w:t>
-            </w:r>
-            <w:proofErr w:type="spellEnd"/>
-            <w:r>
-              <w:rPr>
-                <w:color w:val="000000" w:themeColor="text1"/>
-              </w:rPr>
-              <w:t>[</w:t>
-            </w:r>
-            <w:proofErr w:type="gramEnd"/>
-            <w:r>
-              <w:rPr>
-                <w:color w:val="000000" w:themeColor="text1"/>
-              </w:rPr>
-              <w:t>4</w:t>
-            </w:r>
-            <w:proofErr w:type="gramStart"/>
-            <w:r>
-              <w:rPr>
-                <w:color w:val="000000" w:themeColor="text1"/>
-              </w:rPr>
-              <w:t>].questions</w:t>
-            </w:r>
-            <w:proofErr w:type="gramEnd"/>
-            <w:r>
-              <w:rPr>
-                <w:color w:val="000000" w:themeColor="text1"/>
-              </w:rPr>
-              <w:t xml:space="preserve"> }}</w:t>
+              <w:t>[4].questions }}</w:t>
             </w:r>
           </w:p>
         </w:tc>
@@ -3301,7 +2761,6 @@
                 <w:color w:val="5B9BD5" w:themeColor="accent5"/>
               </w:rPr>
             </w:pPr>
-            <w:proofErr w:type="gramStart"/>
             <w:r>
               <w:rPr>
                 <w:color w:val="5B9BD5" w:themeColor="accent5"/>
@@ -3313,56 +2772,21 @@
               <w:rPr>
                 <w:color w:val="5B9BD5" w:themeColor="accent5"/>
               </w:rPr>
-              <w:t>rc</w:t>
-            </w:r>
-            <w:proofErr w:type="gramEnd"/>
-            <w:r>
-              <w:rPr>
-                <w:color w:val="5B9BD5" w:themeColor="accent5"/>
-              </w:rPr>
-              <w:t>.</w:t>
-            </w:r>
-            <w:proofErr w:type="gramStart"/>
-            <w:r>
-              <w:rPr>
-                <w:color w:val="5B9BD5" w:themeColor="accent5"/>
-              </w:rPr>
-              <w:t>concepts</w:t>
+              <w:t>rc.concepts</w:t>
             </w:r>
             <w:proofErr w:type="spellEnd"/>
             <w:r>
               <w:rPr>
                 <w:color w:val="5B9BD5" w:themeColor="accent5"/>
               </w:rPr>
-              <w:t>[</w:t>
-            </w:r>
-            <w:proofErr w:type="gramEnd"/>
-            <w:r>
-              <w:rPr>
-                <w:color w:val="5B9BD5" w:themeColor="accent5"/>
-              </w:rPr>
-              <w:t>4</w:t>
-            </w:r>
-            <w:proofErr w:type="gramStart"/>
-            <w:r>
-              <w:rPr>
-                <w:color w:val="5B9BD5" w:themeColor="accent5"/>
-              </w:rPr>
-              <w:t>].</w:t>
+              <w:t>[4].</w:t>
             </w:r>
             <w:proofErr w:type="spellStart"/>
             <w:r>
               <w:rPr>
                 <w:color w:val="5B9BD5" w:themeColor="accent5"/>
               </w:rPr>
-              <w:t>done</w:t>
-            </w:r>
-            <w:proofErr w:type="gramEnd"/>
-            <w:r>
-              <w:rPr>
-                <w:color w:val="5B9BD5" w:themeColor="accent5"/>
-              </w:rPr>
-              <w:t>_well</w:t>
+              <w:t>done_well</w:t>
             </w:r>
             <w:proofErr w:type="spellEnd"/>
             <w:r>
@@ -3396,7 +2820,6 @@
                 <w:color w:val="5B9BD5" w:themeColor="accent5"/>
               </w:rPr>
             </w:pPr>
-            <w:proofErr w:type="gramStart"/>
             <w:r>
               <w:rPr>
                 <w:color w:val="5B9BD5" w:themeColor="accent5"/>
@@ -3408,49 +2831,14 @@
               <w:rPr>
                 <w:color w:val="5B9BD5" w:themeColor="accent5"/>
               </w:rPr>
-              <w:t>rc</w:t>
-            </w:r>
-            <w:proofErr w:type="gramEnd"/>
-            <w:r>
-              <w:rPr>
-                <w:color w:val="5B9BD5" w:themeColor="accent5"/>
-              </w:rPr>
-              <w:t>.</w:t>
-            </w:r>
-            <w:proofErr w:type="gramStart"/>
-            <w:r>
-              <w:rPr>
-                <w:color w:val="5B9BD5" w:themeColor="accent5"/>
-              </w:rPr>
-              <w:t>concepts</w:t>
+              <w:t>rc.concepts</w:t>
             </w:r>
             <w:proofErr w:type="spellEnd"/>
             <w:r>
               <w:rPr>
                 <w:color w:val="5B9BD5" w:themeColor="accent5"/>
               </w:rPr>
-              <w:t>[</w:t>
-            </w:r>
-            <w:proofErr w:type="gramEnd"/>
-            <w:r>
-              <w:rPr>
-                <w:color w:val="5B9BD5" w:themeColor="accent5"/>
-              </w:rPr>
-              <w:t>4</w:t>
-            </w:r>
-            <w:proofErr w:type="gramStart"/>
-            <w:r>
-              <w:rPr>
-                <w:color w:val="5B9BD5" w:themeColor="accent5"/>
-              </w:rPr>
-              <w:t>].improve</w:t>
-            </w:r>
-            <w:proofErr w:type="gramEnd"/>
-            <w:r>
-              <w:rPr>
-                <w:color w:val="5B9BD5" w:themeColor="accent5"/>
-              </w:rPr>
-              <w:t xml:space="preserve"> }}</w:t>
+              <w:t>[4].improve }}</w:t>
             </w:r>
           </w:p>
         </w:tc>
@@ -3504,7 +2892,6 @@
                 <w:color w:val="000000" w:themeColor="text1"/>
               </w:rPr>
             </w:pPr>
-            <w:proofErr w:type="gramStart"/>
             <w:r>
               <w:rPr>
                 <w:color w:val="000000" w:themeColor="text1"/>
@@ -3516,49 +2903,14 @@
               <w:rPr>
                 <w:color w:val="000000" w:themeColor="text1"/>
               </w:rPr>
-              <w:t>rc</w:t>
-            </w:r>
-            <w:proofErr w:type="gramEnd"/>
+              <w:t>rc.concepts</w:t>
+            </w:r>
+            <w:proofErr w:type="spellEnd"/>
             <w:r>
               <w:rPr>
                 <w:color w:val="000000" w:themeColor="text1"/>
               </w:rPr>
-              <w:t>.</w:t>
-            </w:r>
-            <w:proofErr w:type="gramStart"/>
-            <w:r>
-              <w:rPr>
-                <w:color w:val="000000" w:themeColor="text1"/>
-              </w:rPr>
-              <w:t>concepts</w:t>
-            </w:r>
-            <w:proofErr w:type="spellEnd"/>
-            <w:r>
-              <w:rPr>
-                <w:color w:val="000000" w:themeColor="text1"/>
-              </w:rPr>
-              <w:t>[</w:t>
-            </w:r>
-            <w:proofErr w:type="gramEnd"/>
-            <w:r>
-              <w:rPr>
-                <w:color w:val="000000" w:themeColor="text1"/>
-              </w:rPr>
-              <w:t>5</w:t>
-            </w:r>
-            <w:proofErr w:type="gramStart"/>
-            <w:r>
-              <w:rPr>
-                <w:color w:val="000000" w:themeColor="text1"/>
-              </w:rPr>
-              <w:t>].questions</w:t>
-            </w:r>
-            <w:proofErr w:type="gramEnd"/>
-            <w:r>
-              <w:rPr>
-                <w:color w:val="000000" w:themeColor="text1"/>
-              </w:rPr>
-              <w:t xml:space="preserve"> }}</w:t>
+              <w:t>[5].questions }}</w:t>
             </w:r>
           </w:p>
         </w:tc>
@@ -3585,7 +2937,6 @@
                 <w:color w:val="5B9BD5" w:themeColor="accent5"/>
               </w:rPr>
             </w:pPr>
-            <w:proofErr w:type="gramStart"/>
             <w:r>
               <w:rPr>
                 <w:color w:val="5B9BD5" w:themeColor="accent5"/>
@@ -3597,56 +2948,21 @@
               <w:rPr>
                 <w:color w:val="5B9BD5" w:themeColor="accent5"/>
               </w:rPr>
-              <w:t>rc</w:t>
-            </w:r>
-            <w:proofErr w:type="gramEnd"/>
-            <w:r>
-              <w:rPr>
-                <w:color w:val="5B9BD5" w:themeColor="accent5"/>
-              </w:rPr>
-              <w:t>.</w:t>
-            </w:r>
-            <w:proofErr w:type="gramStart"/>
-            <w:r>
-              <w:rPr>
-                <w:color w:val="5B9BD5" w:themeColor="accent5"/>
-              </w:rPr>
-              <w:t>concepts</w:t>
+              <w:t>rc.concepts</w:t>
             </w:r>
             <w:proofErr w:type="spellEnd"/>
             <w:r>
               <w:rPr>
                 <w:color w:val="5B9BD5" w:themeColor="accent5"/>
               </w:rPr>
-              <w:t>[</w:t>
-            </w:r>
-            <w:proofErr w:type="gramEnd"/>
-            <w:r>
-              <w:rPr>
-                <w:color w:val="5B9BD5" w:themeColor="accent5"/>
-              </w:rPr>
-              <w:t>5</w:t>
-            </w:r>
-            <w:proofErr w:type="gramStart"/>
-            <w:r>
-              <w:rPr>
-                <w:color w:val="5B9BD5" w:themeColor="accent5"/>
-              </w:rPr>
-              <w:t>].</w:t>
+              <w:t>[5].</w:t>
             </w:r>
             <w:proofErr w:type="spellStart"/>
             <w:r>
               <w:rPr>
                 <w:color w:val="5B9BD5" w:themeColor="accent5"/>
               </w:rPr>
-              <w:t>done</w:t>
-            </w:r>
-            <w:proofErr w:type="gramEnd"/>
-            <w:r>
-              <w:rPr>
-                <w:color w:val="5B9BD5" w:themeColor="accent5"/>
-              </w:rPr>
-              <w:t>_well</w:t>
+              <w:t>done_well</w:t>
             </w:r>
             <w:proofErr w:type="spellEnd"/>
             <w:r>
@@ -3680,7 +2996,6 @@
                 <w:color w:val="5B9BD5" w:themeColor="accent5"/>
               </w:rPr>
             </w:pPr>
-            <w:proofErr w:type="gramStart"/>
             <w:r>
               <w:rPr>
                 <w:color w:val="5B9BD5" w:themeColor="accent5"/>
@@ -3692,49 +3007,14 @@
               <w:rPr>
                 <w:color w:val="5B9BD5" w:themeColor="accent5"/>
               </w:rPr>
-              <w:t>rc</w:t>
-            </w:r>
-            <w:proofErr w:type="gramEnd"/>
-            <w:r>
-              <w:rPr>
-                <w:color w:val="5B9BD5" w:themeColor="accent5"/>
-              </w:rPr>
-              <w:t>.</w:t>
-            </w:r>
-            <w:proofErr w:type="gramStart"/>
-            <w:r>
-              <w:rPr>
-                <w:color w:val="5B9BD5" w:themeColor="accent5"/>
-              </w:rPr>
-              <w:t>concepts</w:t>
+              <w:t>rc.concepts</w:t>
             </w:r>
             <w:proofErr w:type="spellEnd"/>
             <w:r>
               <w:rPr>
                 <w:color w:val="5B9BD5" w:themeColor="accent5"/>
               </w:rPr>
-              <w:t>[</w:t>
-            </w:r>
-            <w:proofErr w:type="gramEnd"/>
-            <w:r>
-              <w:rPr>
-                <w:color w:val="5B9BD5" w:themeColor="accent5"/>
-              </w:rPr>
-              <w:t>5</w:t>
-            </w:r>
-            <w:proofErr w:type="gramStart"/>
-            <w:r>
-              <w:rPr>
-                <w:color w:val="5B9BD5" w:themeColor="accent5"/>
-              </w:rPr>
-              <w:t>].improve</w:t>
-            </w:r>
-            <w:proofErr w:type="gramEnd"/>
-            <w:r>
-              <w:rPr>
-                <w:color w:val="5B9BD5" w:themeColor="accent5"/>
-              </w:rPr>
-              <w:t xml:space="preserve"> }}</w:t>
+              <w:t>[5].improve }}</w:t>
             </w:r>
           </w:p>
         </w:tc>
@@ -3788,7 +3068,6 @@
                 <w:color w:val="000000" w:themeColor="text1"/>
               </w:rPr>
             </w:pPr>
-            <w:proofErr w:type="gramStart"/>
             <w:r>
               <w:rPr>
                 <w:color w:val="000000" w:themeColor="text1"/>
@@ -3800,49 +3079,14 @@
               <w:rPr>
                 <w:color w:val="000000" w:themeColor="text1"/>
               </w:rPr>
-              <w:t>rc</w:t>
-            </w:r>
-            <w:proofErr w:type="gramEnd"/>
+              <w:t>rc.concepts</w:t>
+            </w:r>
+            <w:proofErr w:type="spellEnd"/>
             <w:r>
               <w:rPr>
                 <w:color w:val="000000" w:themeColor="text1"/>
               </w:rPr>
-              <w:t>.</w:t>
-            </w:r>
-            <w:proofErr w:type="gramStart"/>
-            <w:r>
-              <w:rPr>
-                <w:color w:val="000000" w:themeColor="text1"/>
-              </w:rPr>
-              <w:t>concepts</w:t>
-            </w:r>
-            <w:proofErr w:type="spellEnd"/>
-            <w:r>
-              <w:rPr>
-                <w:color w:val="000000" w:themeColor="text1"/>
-              </w:rPr>
-              <w:t>[</w:t>
-            </w:r>
-            <w:proofErr w:type="gramEnd"/>
-            <w:r>
-              <w:rPr>
-                <w:color w:val="000000" w:themeColor="text1"/>
-              </w:rPr>
-              <w:t>6</w:t>
-            </w:r>
-            <w:proofErr w:type="gramStart"/>
-            <w:r>
-              <w:rPr>
-                <w:color w:val="000000" w:themeColor="text1"/>
-              </w:rPr>
-              <w:t>].questions</w:t>
-            </w:r>
-            <w:proofErr w:type="gramEnd"/>
-            <w:r>
-              <w:rPr>
-                <w:color w:val="000000" w:themeColor="text1"/>
-              </w:rPr>
-              <w:t xml:space="preserve"> }}</w:t>
+              <w:t>[6].questions }}</w:t>
             </w:r>
           </w:p>
         </w:tc>
@@ -3869,7 +3113,6 @@
                 <w:color w:val="5B9BD5" w:themeColor="accent5"/>
               </w:rPr>
             </w:pPr>
-            <w:proofErr w:type="gramStart"/>
             <w:r>
               <w:rPr>
                 <w:color w:val="5B9BD5" w:themeColor="accent5"/>
@@ -3881,56 +3124,21 @@
               <w:rPr>
                 <w:color w:val="5B9BD5" w:themeColor="accent5"/>
               </w:rPr>
-              <w:t>rc</w:t>
-            </w:r>
-            <w:proofErr w:type="gramEnd"/>
-            <w:r>
-              <w:rPr>
-                <w:color w:val="5B9BD5" w:themeColor="accent5"/>
-              </w:rPr>
-              <w:t>.</w:t>
-            </w:r>
-            <w:proofErr w:type="gramStart"/>
-            <w:r>
-              <w:rPr>
-                <w:color w:val="5B9BD5" w:themeColor="accent5"/>
-              </w:rPr>
-              <w:t>concepts</w:t>
+              <w:t>rc.concepts</w:t>
             </w:r>
             <w:proofErr w:type="spellEnd"/>
             <w:r>
               <w:rPr>
                 <w:color w:val="5B9BD5" w:themeColor="accent5"/>
               </w:rPr>
-              <w:t>[</w:t>
-            </w:r>
-            <w:proofErr w:type="gramEnd"/>
-            <w:r>
-              <w:rPr>
-                <w:color w:val="5B9BD5" w:themeColor="accent5"/>
-              </w:rPr>
-              <w:t>6</w:t>
-            </w:r>
-            <w:proofErr w:type="gramStart"/>
-            <w:r>
-              <w:rPr>
-                <w:color w:val="5B9BD5" w:themeColor="accent5"/>
-              </w:rPr>
-              <w:t>].</w:t>
+              <w:t>[6].</w:t>
             </w:r>
             <w:proofErr w:type="spellStart"/>
             <w:r>
               <w:rPr>
                 <w:color w:val="5B9BD5" w:themeColor="accent5"/>
               </w:rPr>
-              <w:t>done</w:t>
-            </w:r>
-            <w:proofErr w:type="gramEnd"/>
-            <w:r>
-              <w:rPr>
-                <w:color w:val="5B9BD5" w:themeColor="accent5"/>
-              </w:rPr>
-              <w:t>_well</w:t>
+              <w:t>done_well</w:t>
             </w:r>
             <w:proofErr w:type="spellEnd"/>
             <w:r>
@@ -3964,7 +3172,6 @@
                 <w:color w:val="5B9BD5" w:themeColor="accent5"/>
               </w:rPr>
             </w:pPr>
-            <w:proofErr w:type="gramStart"/>
             <w:r>
               <w:rPr>
                 <w:color w:val="5B9BD5" w:themeColor="accent5"/>
@@ -3976,49 +3183,14 @@
               <w:rPr>
                 <w:color w:val="5B9BD5" w:themeColor="accent5"/>
               </w:rPr>
-              <w:t>rc</w:t>
-            </w:r>
-            <w:proofErr w:type="gramEnd"/>
-            <w:r>
-              <w:rPr>
-                <w:color w:val="5B9BD5" w:themeColor="accent5"/>
-              </w:rPr>
-              <w:t>.</w:t>
-            </w:r>
-            <w:proofErr w:type="gramStart"/>
-            <w:r>
-              <w:rPr>
-                <w:color w:val="5B9BD5" w:themeColor="accent5"/>
-              </w:rPr>
-              <w:t>concepts</w:t>
+              <w:t>rc.concepts</w:t>
             </w:r>
             <w:proofErr w:type="spellEnd"/>
             <w:r>
               <w:rPr>
                 <w:color w:val="5B9BD5" w:themeColor="accent5"/>
               </w:rPr>
-              <w:t>[</w:t>
-            </w:r>
-            <w:proofErr w:type="gramEnd"/>
-            <w:r>
-              <w:rPr>
-                <w:color w:val="5B9BD5" w:themeColor="accent5"/>
-              </w:rPr>
-              <w:t>6</w:t>
-            </w:r>
-            <w:proofErr w:type="gramStart"/>
-            <w:r>
-              <w:rPr>
-                <w:color w:val="5B9BD5" w:themeColor="accent5"/>
-              </w:rPr>
-              <w:t>].improve</w:t>
-            </w:r>
-            <w:proofErr w:type="gramEnd"/>
-            <w:r>
-              <w:rPr>
-                <w:color w:val="5B9BD5" w:themeColor="accent5"/>
-              </w:rPr>
-              <w:t xml:space="preserve"> }}</w:t>
+              <w:t>[6].improve }}</w:t>
             </w:r>
           </w:p>
         </w:tc>
@@ -4072,7 +3244,6 @@
                 <w:color w:val="000000" w:themeColor="text1"/>
               </w:rPr>
             </w:pPr>
-            <w:proofErr w:type="gramStart"/>
             <w:r>
               <w:rPr>
                 <w:color w:val="000000" w:themeColor="text1"/>
@@ -4084,49 +3255,14 @@
               <w:rPr>
                 <w:color w:val="000000" w:themeColor="text1"/>
               </w:rPr>
-              <w:t>rc</w:t>
-            </w:r>
-            <w:proofErr w:type="gramEnd"/>
+              <w:t>rc.concepts</w:t>
+            </w:r>
+            <w:proofErr w:type="spellEnd"/>
             <w:r>
               <w:rPr>
                 <w:color w:val="000000" w:themeColor="text1"/>
               </w:rPr>
-              <w:t>.</w:t>
-            </w:r>
-            <w:proofErr w:type="gramStart"/>
-            <w:r>
-              <w:rPr>
-                <w:color w:val="000000" w:themeColor="text1"/>
-              </w:rPr>
-              <w:t>concepts</w:t>
-            </w:r>
-            <w:proofErr w:type="spellEnd"/>
-            <w:r>
-              <w:rPr>
-                <w:color w:val="000000" w:themeColor="text1"/>
-              </w:rPr>
-              <w:t>[</w:t>
-            </w:r>
-            <w:proofErr w:type="gramEnd"/>
-            <w:r>
-              <w:rPr>
-                <w:color w:val="000000" w:themeColor="text1"/>
-              </w:rPr>
-              <w:t>7</w:t>
-            </w:r>
-            <w:proofErr w:type="gramStart"/>
-            <w:r>
-              <w:rPr>
-                <w:color w:val="000000" w:themeColor="text1"/>
-              </w:rPr>
-              <w:t>].questions</w:t>
-            </w:r>
-            <w:proofErr w:type="gramEnd"/>
-            <w:r>
-              <w:rPr>
-                <w:color w:val="000000" w:themeColor="text1"/>
-              </w:rPr>
-              <w:t xml:space="preserve"> }}</w:t>
+              <w:t>[7].questions }}</w:t>
             </w:r>
           </w:p>
         </w:tc>
@@ -4153,7 +3289,6 @@
                 <w:color w:val="5B9BD5" w:themeColor="accent5"/>
               </w:rPr>
             </w:pPr>
-            <w:proofErr w:type="gramStart"/>
             <w:r>
               <w:rPr>
                 <w:color w:val="5B9BD5" w:themeColor="accent5"/>
@@ -4165,56 +3300,21 @@
               <w:rPr>
                 <w:color w:val="5B9BD5" w:themeColor="accent5"/>
               </w:rPr>
-              <w:t>rc</w:t>
-            </w:r>
-            <w:proofErr w:type="gramEnd"/>
-            <w:r>
-              <w:rPr>
-                <w:color w:val="5B9BD5" w:themeColor="accent5"/>
-              </w:rPr>
-              <w:t>.</w:t>
-            </w:r>
-            <w:proofErr w:type="gramStart"/>
-            <w:r>
-              <w:rPr>
-                <w:color w:val="5B9BD5" w:themeColor="accent5"/>
-              </w:rPr>
-              <w:t>concepts</w:t>
+              <w:t>rc.concepts</w:t>
             </w:r>
             <w:proofErr w:type="spellEnd"/>
             <w:r>
               <w:rPr>
                 <w:color w:val="5B9BD5" w:themeColor="accent5"/>
               </w:rPr>
-              <w:t>[</w:t>
-            </w:r>
-            <w:proofErr w:type="gramEnd"/>
-            <w:r>
-              <w:rPr>
-                <w:color w:val="5B9BD5" w:themeColor="accent5"/>
-              </w:rPr>
-              <w:t>7</w:t>
-            </w:r>
-            <w:proofErr w:type="gramStart"/>
-            <w:r>
-              <w:rPr>
-                <w:color w:val="5B9BD5" w:themeColor="accent5"/>
-              </w:rPr>
-              <w:t>].</w:t>
+              <w:t>[7].</w:t>
             </w:r>
             <w:proofErr w:type="spellStart"/>
             <w:r>
               <w:rPr>
                 <w:color w:val="5B9BD5" w:themeColor="accent5"/>
               </w:rPr>
-              <w:t>done</w:t>
-            </w:r>
-            <w:proofErr w:type="gramEnd"/>
-            <w:r>
-              <w:rPr>
-                <w:color w:val="5B9BD5" w:themeColor="accent5"/>
-              </w:rPr>
-              <w:t>_well</w:t>
+              <w:t>done_well</w:t>
             </w:r>
             <w:proofErr w:type="spellEnd"/>
             <w:r>
@@ -4248,7 +3348,6 @@
                 <w:color w:val="5B9BD5" w:themeColor="accent5"/>
               </w:rPr>
             </w:pPr>
-            <w:proofErr w:type="gramStart"/>
             <w:r>
               <w:rPr>
                 <w:color w:val="5B9BD5" w:themeColor="accent5"/>
@@ -4260,49 +3359,14 @@
               <w:rPr>
                 <w:color w:val="5B9BD5" w:themeColor="accent5"/>
               </w:rPr>
-              <w:t>rc</w:t>
-            </w:r>
-            <w:proofErr w:type="gramEnd"/>
-            <w:r>
-              <w:rPr>
-                <w:color w:val="5B9BD5" w:themeColor="accent5"/>
-              </w:rPr>
-              <w:t>.</w:t>
-            </w:r>
-            <w:proofErr w:type="gramStart"/>
-            <w:r>
-              <w:rPr>
-                <w:color w:val="5B9BD5" w:themeColor="accent5"/>
-              </w:rPr>
-              <w:t>concepts</w:t>
+              <w:t>rc.concepts</w:t>
             </w:r>
             <w:proofErr w:type="spellEnd"/>
             <w:r>
               <w:rPr>
                 <w:color w:val="5B9BD5" w:themeColor="accent5"/>
               </w:rPr>
-              <w:t>[</w:t>
-            </w:r>
-            <w:proofErr w:type="gramEnd"/>
-            <w:r>
-              <w:rPr>
-                <w:color w:val="5B9BD5" w:themeColor="accent5"/>
-              </w:rPr>
-              <w:t>7</w:t>
-            </w:r>
-            <w:proofErr w:type="gramStart"/>
-            <w:r>
-              <w:rPr>
-                <w:color w:val="5B9BD5" w:themeColor="accent5"/>
-              </w:rPr>
-              <w:t>].improve</w:t>
-            </w:r>
-            <w:proofErr w:type="gramEnd"/>
-            <w:r>
-              <w:rPr>
-                <w:color w:val="5B9BD5" w:themeColor="accent5"/>
-              </w:rPr>
-              <w:t xml:space="preserve"> }}</w:t>
+              <w:t>[7].improve }}</w:t>
             </w:r>
           </w:p>
         </w:tc>
@@ -4627,7 +3691,6 @@
                 <w:color w:val="000000" w:themeColor="text1"/>
               </w:rPr>
             </w:pPr>
-            <w:proofErr w:type="gramStart"/>
             <w:r>
               <w:rPr>
                 <w:color w:val="000000" w:themeColor="text1"/>
@@ -4639,49 +3702,14 @@
               <w:rPr>
                 <w:color w:val="000000" w:themeColor="text1"/>
               </w:rPr>
-              <w:t>qr</w:t>
-            </w:r>
-            <w:proofErr w:type="gramEnd"/>
+              <w:t>qr.concepts</w:t>
+            </w:r>
+            <w:proofErr w:type="spellEnd"/>
             <w:r>
               <w:rPr>
                 <w:color w:val="000000" w:themeColor="text1"/>
               </w:rPr>
-              <w:t>.</w:t>
-            </w:r>
-            <w:proofErr w:type="gramStart"/>
-            <w:r>
-              <w:rPr>
-                <w:color w:val="000000" w:themeColor="text1"/>
-              </w:rPr>
-              <w:t>concepts</w:t>
-            </w:r>
-            <w:proofErr w:type="spellEnd"/>
-            <w:r>
-              <w:rPr>
-                <w:color w:val="000000" w:themeColor="text1"/>
-              </w:rPr>
-              <w:t>[</w:t>
-            </w:r>
-            <w:proofErr w:type="gramEnd"/>
-            <w:r>
-              <w:rPr>
-                <w:color w:val="000000" w:themeColor="text1"/>
-              </w:rPr>
-              <w:t>0</w:t>
-            </w:r>
-            <w:proofErr w:type="gramStart"/>
-            <w:r>
-              <w:rPr>
-                <w:color w:val="000000" w:themeColor="text1"/>
-              </w:rPr>
-              <w:t>].questions</w:t>
-            </w:r>
-            <w:proofErr w:type="gramEnd"/>
-            <w:r>
-              <w:rPr>
-                <w:color w:val="000000" w:themeColor="text1"/>
-              </w:rPr>
-              <w:t xml:space="preserve"> }}</w:t>
+              <w:t>[0].questions }}</w:t>
             </w:r>
           </w:p>
         </w:tc>
@@ -4708,7 +3736,6 @@
                 <w:color w:val="5B9BD5" w:themeColor="accent5"/>
               </w:rPr>
             </w:pPr>
-            <w:proofErr w:type="gramStart"/>
             <w:r>
               <w:rPr>
                 <w:color w:val="5B9BD5" w:themeColor="accent5"/>
@@ -4720,56 +3747,21 @@
               <w:rPr>
                 <w:color w:val="5B9BD5" w:themeColor="accent5"/>
               </w:rPr>
-              <w:t>qr</w:t>
-            </w:r>
-            <w:proofErr w:type="gramEnd"/>
-            <w:r>
-              <w:rPr>
-                <w:color w:val="5B9BD5" w:themeColor="accent5"/>
-              </w:rPr>
-              <w:t>.</w:t>
-            </w:r>
-            <w:proofErr w:type="gramStart"/>
-            <w:r>
-              <w:rPr>
-                <w:color w:val="5B9BD5" w:themeColor="accent5"/>
-              </w:rPr>
-              <w:t>concepts</w:t>
+              <w:t>qr.concepts</w:t>
             </w:r>
             <w:proofErr w:type="spellEnd"/>
             <w:r>
               <w:rPr>
                 <w:color w:val="5B9BD5" w:themeColor="accent5"/>
               </w:rPr>
-              <w:t>[</w:t>
-            </w:r>
-            <w:proofErr w:type="gramEnd"/>
-            <w:r>
-              <w:rPr>
-                <w:color w:val="5B9BD5" w:themeColor="accent5"/>
-              </w:rPr>
-              <w:t>0</w:t>
-            </w:r>
-            <w:proofErr w:type="gramStart"/>
-            <w:r>
-              <w:rPr>
-                <w:color w:val="5B9BD5" w:themeColor="accent5"/>
-              </w:rPr>
-              <w:t>].</w:t>
+              <w:t>[0].</w:t>
             </w:r>
             <w:proofErr w:type="spellStart"/>
             <w:r>
               <w:rPr>
                 <w:color w:val="5B9BD5" w:themeColor="accent5"/>
               </w:rPr>
-              <w:t>done</w:t>
-            </w:r>
-            <w:proofErr w:type="gramEnd"/>
-            <w:r>
-              <w:rPr>
-                <w:color w:val="5B9BD5" w:themeColor="accent5"/>
-              </w:rPr>
-              <w:t>_well</w:t>
+              <w:t>done_well</w:t>
             </w:r>
             <w:proofErr w:type="spellEnd"/>
             <w:r>
@@ -4803,7 +3795,6 @@
                 <w:color w:val="5B9BD5" w:themeColor="accent5"/>
               </w:rPr>
             </w:pPr>
-            <w:proofErr w:type="gramStart"/>
             <w:r>
               <w:rPr>
                 <w:color w:val="5B9BD5" w:themeColor="accent5"/>
@@ -4815,49 +3806,14 @@
               <w:rPr>
                 <w:color w:val="5B9BD5" w:themeColor="accent5"/>
               </w:rPr>
-              <w:t>qr</w:t>
-            </w:r>
-            <w:proofErr w:type="gramEnd"/>
-            <w:r>
-              <w:rPr>
-                <w:color w:val="5B9BD5" w:themeColor="accent5"/>
-              </w:rPr>
-              <w:t>.</w:t>
-            </w:r>
-            <w:proofErr w:type="gramStart"/>
-            <w:r>
-              <w:rPr>
-                <w:color w:val="5B9BD5" w:themeColor="accent5"/>
-              </w:rPr>
-              <w:t>concepts</w:t>
+              <w:t>qr.concepts</w:t>
             </w:r>
             <w:proofErr w:type="spellEnd"/>
             <w:r>
               <w:rPr>
                 <w:color w:val="5B9BD5" w:themeColor="accent5"/>
               </w:rPr>
-              <w:t>[</w:t>
-            </w:r>
-            <w:proofErr w:type="gramEnd"/>
-            <w:r>
-              <w:rPr>
-                <w:color w:val="5B9BD5" w:themeColor="accent5"/>
-              </w:rPr>
-              <w:t>0</w:t>
-            </w:r>
-            <w:proofErr w:type="gramStart"/>
-            <w:r>
-              <w:rPr>
-                <w:color w:val="5B9BD5" w:themeColor="accent5"/>
-              </w:rPr>
-              <w:t>].improve</w:t>
-            </w:r>
-            <w:proofErr w:type="gramEnd"/>
-            <w:r>
-              <w:rPr>
-                <w:color w:val="5B9BD5" w:themeColor="accent5"/>
-              </w:rPr>
-              <w:t xml:space="preserve"> }}</w:t>
+              <w:t>[0].improve }}</w:t>
             </w:r>
           </w:p>
         </w:tc>
@@ -4914,7 +3870,6 @@
                 <w:color w:val="000000" w:themeColor="text1"/>
               </w:rPr>
             </w:pPr>
-            <w:proofErr w:type="gramStart"/>
             <w:r>
               <w:rPr>
                 <w:color w:val="000000" w:themeColor="text1"/>
@@ -4926,49 +3881,14 @@
               <w:rPr>
                 <w:color w:val="000000" w:themeColor="text1"/>
               </w:rPr>
-              <w:t>qr</w:t>
-            </w:r>
-            <w:proofErr w:type="gramEnd"/>
+              <w:t>qr.concepts</w:t>
+            </w:r>
+            <w:proofErr w:type="spellEnd"/>
             <w:r>
               <w:rPr>
                 <w:color w:val="000000" w:themeColor="text1"/>
               </w:rPr>
-              <w:t>.</w:t>
-            </w:r>
-            <w:proofErr w:type="gramStart"/>
-            <w:r>
-              <w:rPr>
-                <w:color w:val="000000" w:themeColor="text1"/>
-              </w:rPr>
-              <w:t>concepts</w:t>
-            </w:r>
-            <w:proofErr w:type="spellEnd"/>
-            <w:r>
-              <w:rPr>
-                <w:color w:val="000000" w:themeColor="text1"/>
-              </w:rPr>
-              <w:t>[</w:t>
-            </w:r>
-            <w:proofErr w:type="gramEnd"/>
-            <w:r>
-              <w:rPr>
-                <w:color w:val="000000" w:themeColor="text1"/>
-              </w:rPr>
-              <w:t>1</w:t>
-            </w:r>
-            <w:proofErr w:type="gramStart"/>
-            <w:r>
-              <w:rPr>
-                <w:color w:val="000000" w:themeColor="text1"/>
-              </w:rPr>
-              <w:t>].questions</w:t>
-            </w:r>
-            <w:proofErr w:type="gramEnd"/>
-            <w:r>
-              <w:rPr>
-                <w:color w:val="000000" w:themeColor="text1"/>
-              </w:rPr>
-              <w:t xml:space="preserve"> }}</w:t>
+              <w:t>[1].questions }}</w:t>
             </w:r>
           </w:p>
         </w:tc>
@@ -4995,7 +3915,6 @@
                 <w:color w:val="5B9BD5" w:themeColor="accent5"/>
               </w:rPr>
             </w:pPr>
-            <w:proofErr w:type="gramStart"/>
             <w:r>
               <w:rPr>
                 <w:color w:val="5B9BD5" w:themeColor="accent5"/>
@@ -5007,56 +3926,21 @@
               <w:rPr>
                 <w:color w:val="5B9BD5" w:themeColor="accent5"/>
               </w:rPr>
-              <w:t>qr</w:t>
-            </w:r>
-            <w:proofErr w:type="gramEnd"/>
-            <w:r>
-              <w:rPr>
-                <w:color w:val="5B9BD5" w:themeColor="accent5"/>
-              </w:rPr>
-              <w:t>.</w:t>
-            </w:r>
-            <w:proofErr w:type="gramStart"/>
-            <w:r>
-              <w:rPr>
-                <w:color w:val="5B9BD5" w:themeColor="accent5"/>
-              </w:rPr>
-              <w:t>concepts</w:t>
+              <w:t>qr.concepts</w:t>
             </w:r>
             <w:proofErr w:type="spellEnd"/>
             <w:r>
               <w:rPr>
                 <w:color w:val="5B9BD5" w:themeColor="accent5"/>
               </w:rPr>
-              <w:t>[</w:t>
-            </w:r>
-            <w:proofErr w:type="gramEnd"/>
-            <w:r>
-              <w:rPr>
-                <w:color w:val="5B9BD5" w:themeColor="accent5"/>
-              </w:rPr>
-              <w:t>1</w:t>
-            </w:r>
-            <w:proofErr w:type="gramStart"/>
-            <w:r>
-              <w:rPr>
-                <w:color w:val="5B9BD5" w:themeColor="accent5"/>
-              </w:rPr>
-              <w:t>].</w:t>
+              <w:t>[1].</w:t>
             </w:r>
             <w:proofErr w:type="spellStart"/>
             <w:r>
               <w:rPr>
                 <w:color w:val="5B9BD5" w:themeColor="accent5"/>
               </w:rPr>
-              <w:t>done</w:t>
-            </w:r>
-            <w:proofErr w:type="gramEnd"/>
-            <w:r>
-              <w:rPr>
-                <w:color w:val="5B9BD5" w:themeColor="accent5"/>
-              </w:rPr>
-              <w:t>_well</w:t>
+              <w:t>done_well</w:t>
             </w:r>
             <w:proofErr w:type="spellEnd"/>
             <w:r>
@@ -5090,7 +3974,6 @@
                 <w:color w:val="5B9BD5" w:themeColor="accent5"/>
               </w:rPr>
             </w:pPr>
-            <w:proofErr w:type="gramStart"/>
             <w:r>
               <w:rPr>
                 <w:color w:val="5B9BD5" w:themeColor="accent5"/>
@@ -5102,49 +3985,14 @@
               <w:rPr>
                 <w:color w:val="5B9BD5" w:themeColor="accent5"/>
               </w:rPr>
-              <w:t>qr</w:t>
-            </w:r>
-            <w:proofErr w:type="gramEnd"/>
-            <w:r>
-              <w:rPr>
-                <w:color w:val="5B9BD5" w:themeColor="accent5"/>
-              </w:rPr>
-              <w:t>.</w:t>
-            </w:r>
-            <w:proofErr w:type="gramStart"/>
-            <w:r>
-              <w:rPr>
-                <w:color w:val="5B9BD5" w:themeColor="accent5"/>
-              </w:rPr>
-              <w:t>concepts</w:t>
+              <w:t>qr.concepts</w:t>
             </w:r>
             <w:proofErr w:type="spellEnd"/>
             <w:r>
               <w:rPr>
                 <w:color w:val="5B9BD5" w:themeColor="accent5"/>
               </w:rPr>
-              <w:t>[</w:t>
-            </w:r>
-            <w:proofErr w:type="gramEnd"/>
-            <w:r>
-              <w:rPr>
-                <w:color w:val="5B9BD5" w:themeColor="accent5"/>
-              </w:rPr>
-              <w:t>1</w:t>
-            </w:r>
-            <w:proofErr w:type="gramStart"/>
-            <w:r>
-              <w:rPr>
-                <w:color w:val="5B9BD5" w:themeColor="accent5"/>
-              </w:rPr>
-              <w:t>].improve</w:t>
-            </w:r>
-            <w:proofErr w:type="gramEnd"/>
-            <w:r>
-              <w:rPr>
-                <w:color w:val="5B9BD5" w:themeColor="accent5"/>
-              </w:rPr>
-              <w:t xml:space="preserve"> }}</w:t>
+              <w:t>[1].improve }}</w:t>
             </w:r>
           </w:p>
         </w:tc>
@@ -5201,7 +4049,6 @@
                 <w:color w:val="000000" w:themeColor="text1"/>
               </w:rPr>
             </w:pPr>
-            <w:proofErr w:type="gramStart"/>
             <w:r>
               <w:rPr>
                 <w:color w:val="000000" w:themeColor="text1"/>
@@ -5213,49 +4060,14 @@
               <w:rPr>
                 <w:color w:val="000000" w:themeColor="text1"/>
               </w:rPr>
-              <w:t>qr</w:t>
-            </w:r>
-            <w:proofErr w:type="gramEnd"/>
+              <w:t>qr.concepts</w:t>
+            </w:r>
+            <w:proofErr w:type="spellEnd"/>
             <w:r>
               <w:rPr>
                 <w:color w:val="000000" w:themeColor="text1"/>
               </w:rPr>
-              <w:t>.</w:t>
-            </w:r>
-            <w:proofErr w:type="gramStart"/>
-            <w:r>
-              <w:rPr>
-                <w:color w:val="000000" w:themeColor="text1"/>
-              </w:rPr>
-              <w:t>concepts</w:t>
-            </w:r>
-            <w:proofErr w:type="spellEnd"/>
-            <w:r>
-              <w:rPr>
-                <w:color w:val="000000" w:themeColor="text1"/>
-              </w:rPr>
-              <w:t>[</w:t>
-            </w:r>
-            <w:proofErr w:type="gramEnd"/>
-            <w:r>
-              <w:rPr>
-                <w:color w:val="000000" w:themeColor="text1"/>
-              </w:rPr>
-              <w:t>2</w:t>
-            </w:r>
-            <w:proofErr w:type="gramStart"/>
-            <w:r>
-              <w:rPr>
-                <w:color w:val="000000" w:themeColor="text1"/>
-              </w:rPr>
-              <w:t>].questions</w:t>
-            </w:r>
-            <w:proofErr w:type="gramEnd"/>
-            <w:r>
-              <w:rPr>
-                <w:color w:val="000000" w:themeColor="text1"/>
-              </w:rPr>
-              <w:t xml:space="preserve"> }}</w:t>
+              <w:t>[2].questions }}</w:t>
             </w:r>
           </w:p>
         </w:tc>
@@ -5282,7 +4094,6 @@
                 <w:color w:val="5B9BD5" w:themeColor="accent5"/>
               </w:rPr>
             </w:pPr>
-            <w:proofErr w:type="gramStart"/>
             <w:r>
               <w:rPr>
                 <w:color w:val="5B9BD5" w:themeColor="accent5"/>
@@ -5294,56 +4105,21 @@
               <w:rPr>
                 <w:color w:val="5B9BD5" w:themeColor="accent5"/>
               </w:rPr>
-              <w:t>qr</w:t>
-            </w:r>
-            <w:proofErr w:type="gramEnd"/>
-            <w:r>
-              <w:rPr>
-                <w:color w:val="5B9BD5" w:themeColor="accent5"/>
-              </w:rPr>
-              <w:t>.</w:t>
-            </w:r>
-            <w:proofErr w:type="gramStart"/>
-            <w:r>
-              <w:rPr>
-                <w:color w:val="5B9BD5" w:themeColor="accent5"/>
-              </w:rPr>
-              <w:t>concepts</w:t>
+              <w:t>qr.concepts</w:t>
             </w:r>
             <w:proofErr w:type="spellEnd"/>
             <w:r>
               <w:rPr>
                 <w:color w:val="5B9BD5" w:themeColor="accent5"/>
               </w:rPr>
-              <w:t>[</w:t>
-            </w:r>
-            <w:proofErr w:type="gramEnd"/>
-            <w:r>
-              <w:rPr>
-                <w:color w:val="5B9BD5" w:themeColor="accent5"/>
-              </w:rPr>
-              <w:t>2</w:t>
-            </w:r>
-            <w:proofErr w:type="gramStart"/>
-            <w:r>
-              <w:rPr>
-                <w:color w:val="5B9BD5" w:themeColor="accent5"/>
-              </w:rPr>
-              <w:t>].</w:t>
+              <w:t>[2].</w:t>
             </w:r>
             <w:proofErr w:type="spellStart"/>
             <w:r>
               <w:rPr>
                 <w:color w:val="5B9BD5" w:themeColor="accent5"/>
               </w:rPr>
-              <w:t>done</w:t>
-            </w:r>
-            <w:proofErr w:type="gramEnd"/>
-            <w:r>
-              <w:rPr>
-                <w:color w:val="5B9BD5" w:themeColor="accent5"/>
-              </w:rPr>
-              <w:t>_well</w:t>
+              <w:t>done_well</w:t>
             </w:r>
             <w:proofErr w:type="spellEnd"/>
             <w:r>
@@ -5377,7 +4153,6 @@
                 <w:color w:val="5B9BD5" w:themeColor="accent5"/>
               </w:rPr>
             </w:pPr>
-            <w:proofErr w:type="gramStart"/>
             <w:r>
               <w:rPr>
                 <w:color w:val="5B9BD5" w:themeColor="accent5"/>
@@ -5389,49 +4164,14 @@
               <w:rPr>
                 <w:color w:val="5B9BD5" w:themeColor="accent5"/>
               </w:rPr>
-              <w:t>qr</w:t>
-            </w:r>
-            <w:proofErr w:type="gramEnd"/>
-            <w:r>
-              <w:rPr>
-                <w:color w:val="5B9BD5" w:themeColor="accent5"/>
-              </w:rPr>
-              <w:t>.</w:t>
-            </w:r>
-            <w:proofErr w:type="gramStart"/>
-            <w:r>
-              <w:rPr>
-                <w:color w:val="5B9BD5" w:themeColor="accent5"/>
-              </w:rPr>
-              <w:t>concepts</w:t>
+              <w:t>qr.concepts</w:t>
             </w:r>
             <w:proofErr w:type="spellEnd"/>
             <w:r>
               <w:rPr>
                 <w:color w:val="5B9BD5" w:themeColor="accent5"/>
               </w:rPr>
-              <w:t>[</w:t>
-            </w:r>
-            <w:proofErr w:type="gramEnd"/>
-            <w:r>
-              <w:rPr>
-                <w:color w:val="5B9BD5" w:themeColor="accent5"/>
-              </w:rPr>
-              <w:t>2</w:t>
-            </w:r>
-            <w:proofErr w:type="gramStart"/>
-            <w:r>
-              <w:rPr>
-                <w:color w:val="5B9BD5" w:themeColor="accent5"/>
-              </w:rPr>
-              <w:t>].improve</w:t>
-            </w:r>
-            <w:proofErr w:type="gramEnd"/>
-            <w:r>
-              <w:rPr>
-                <w:color w:val="5B9BD5" w:themeColor="accent5"/>
-              </w:rPr>
-              <w:t xml:space="preserve"> }}</w:t>
+              <w:t>[2].improve }}</w:t>
             </w:r>
           </w:p>
         </w:tc>
@@ -5488,7 +4228,6 @@
                 <w:color w:val="000000" w:themeColor="text1"/>
               </w:rPr>
             </w:pPr>
-            <w:proofErr w:type="gramStart"/>
             <w:r>
               <w:rPr>
                 <w:color w:val="000000" w:themeColor="text1"/>
@@ -5500,49 +4239,14 @@
               <w:rPr>
                 <w:color w:val="000000" w:themeColor="text1"/>
               </w:rPr>
-              <w:t>qr</w:t>
-            </w:r>
-            <w:proofErr w:type="gramEnd"/>
+              <w:t>qr.concepts</w:t>
+            </w:r>
+            <w:proofErr w:type="spellEnd"/>
             <w:r>
               <w:rPr>
                 <w:color w:val="000000" w:themeColor="text1"/>
               </w:rPr>
-              <w:t>.</w:t>
-            </w:r>
-            <w:proofErr w:type="gramStart"/>
-            <w:r>
-              <w:rPr>
-                <w:color w:val="000000" w:themeColor="text1"/>
-              </w:rPr>
-              <w:t>concepts</w:t>
-            </w:r>
-            <w:proofErr w:type="spellEnd"/>
-            <w:r>
-              <w:rPr>
-                <w:color w:val="000000" w:themeColor="text1"/>
-              </w:rPr>
-              <w:t>[</w:t>
-            </w:r>
-            <w:proofErr w:type="gramEnd"/>
-            <w:r>
-              <w:rPr>
-                <w:color w:val="000000" w:themeColor="text1"/>
-              </w:rPr>
-              <w:t>3</w:t>
-            </w:r>
-            <w:proofErr w:type="gramStart"/>
-            <w:r>
-              <w:rPr>
-                <w:color w:val="000000" w:themeColor="text1"/>
-              </w:rPr>
-              <w:t>].questions</w:t>
-            </w:r>
-            <w:proofErr w:type="gramEnd"/>
-            <w:r>
-              <w:rPr>
-                <w:color w:val="000000" w:themeColor="text1"/>
-              </w:rPr>
-              <w:t xml:space="preserve"> }}</w:t>
+              <w:t>[3].questions }}</w:t>
             </w:r>
           </w:p>
         </w:tc>
@@ -5569,7 +4273,6 @@
                 <w:color w:val="5B9BD5" w:themeColor="accent5"/>
               </w:rPr>
             </w:pPr>
-            <w:proofErr w:type="gramStart"/>
             <w:r>
               <w:rPr>
                 <w:color w:val="5B9BD5" w:themeColor="accent5"/>
@@ -5581,56 +4284,21 @@
               <w:rPr>
                 <w:color w:val="5B9BD5" w:themeColor="accent5"/>
               </w:rPr>
-              <w:t>qr</w:t>
-            </w:r>
-            <w:proofErr w:type="gramEnd"/>
-            <w:r>
-              <w:rPr>
-                <w:color w:val="5B9BD5" w:themeColor="accent5"/>
-              </w:rPr>
-              <w:t>.</w:t>
-            </w:r>
-            <w:proofErr w:type="gramStart"/>
-            <w:r>
-              <w:rPr>
-                <w:color w:val="5B9BD5" w:themeColor="accent5"/>
-              </w:rPr>
-              <w:t>concepts</w:t>
+              <w:t>qr.concepts</w:t>
             </w:r>
             <w:proofErr w:type="spellEnd"/>
             <w:r>
               <w:rPr>
                 <w:color w:val="5B9BD5" w:themeColor="accent5"/>
               </w:rPr>
-              <w:t>[</w:t>
-            </w:r>
-            <w:proofErr w:type="gramEnd"/>
-            <w:r>
-              <w:rPr>
-                <w:color w:val="5B9BD5" w:themeColor="accent5"/>
-              </w:rPr>
-              <w:t>3</w:t>
-            </w:r>
-            <w:proofErr w:type="gramStart"/>
-            <w:r>
-              <w:rPr>
-                <w:color w:val="5B9BD5" w:themeColor="accent5"/>
-              </w:rPr>
-              <w:t>].</w:t>
+              <w:t>[3].</w:t>
             </w:r>
             <w:proofErr w:type="spellStart"/>
             <w:r>
               <w:rPr>
                 <w:color w:val="5B9BD5" w:themeColor="accent5"/>
               </w:rPr>
-              <w:t>done</w:t>
-            </w:r>
-            <w:proofErr w:type="gramEnd"/>
-            <w:r>
-              <w:rPr>
-                <w:color w:val="5B9BD5" w:themeColor="accent5"/>
-              </w:rPr>
-              <w:t>_well</w:t>
+              <w:t>done_well</w:t>
             </w:r>
             <w:proofErr w:type="spellEnd"/>
             <w:r>
@@ -5664,7 +4332,6 @@
                 <w:color w:val="5B9BD5" w:themeColor="accent5"/>
               </w:rPr>
             </w:pPr>
-            <w:proofErr w:type="gramStart"/>
             <w:r>
               <w:rPr>
                 <w:color w:val="5B9BD5" w:themeColor="accent5"/>
@@ -5676,49 +4343,14 @@
               <w:rPr>
                 <w:color w:val="5B9BD5" w:themeColor="accent5"/>
               </w:rPr>
-              <w:t>qr</w:t>
-            </w:r>
-            <w:proofErr w:type="gramEnd"/>
-            <w:r>
-              <w:rPr>
-                <w:color w:val="5B9BD5" w:themeColor="accent5"/>
-              </w:rPr>
-              <w:t>.</w:t>
-            </w:r>
-            <w:proofErr w:type="gramStart"/>
-            <w:r>
-              <w:rPr>
-                <w:color w:val="5B9BD5" w:themeColor="accent5"/>
-              </w:rPr>
-              <w:t>concepts</w:t>
+              <w:t>qr.concepts</w:t>
             </w:r>
             <w:proofErr w:type="spellEnd"/>
             <w:r>
               <w:rPr>
                 <w:color w:val="5B9BD5" w:themeColor="accent5"/>
               </w:rPr>
-              <w:t>[</w:t>
-            </w:r>
-            <w:proofErr w:type="gramEnd"/>
-            <w:r>
-              <w:rPr>
-                <w:color w:val="5B9BD5" w:themeColor="accent5"/>
-              </w:rPr>
-              <w:t>3</w:t>
-            </w:r>
-            <w:proofErr w:type="gramStart"/>
-            <w:r>
-              <w:rPr>
-                <w:color w:val="5B9BD5" w:themeColor="accent5"/>
-              </w:rPr>
-              <w:t>].improve</w:t>
-            </w:r>
-            <w:proofErr w:type="gramEnd"/>
-            <w:r>
-              <w:rPr>
-                <w:color w:val="5B9BD5" w:themeColor="accent5"/>
-              </w:rPr>
-              <w:t xml:space="preserve"> }}</w:t>
+              <w:t>[3].improve }}</w:t>
             </w:r>
           </w:p>
         </w:tc>
@@ -5775,7 +4407,6 @@
                 <w:color w:val="000000" w:themeColor="text1"/>
               </w:rPr>
             </w:pPr>
-            <w:proofErr w:type="gramStart"/>
             <w:r>
               <w:rPr>
                 <w:color w:val="000000" w:themeColor="text1"/>
@@ -5787,49 +4418,14 @@
               <w:rPr>
                 <w:color w:val="000000" w:themeColor="text1"/>
               </w:rPr>
-              <w:t>qr</w:t>
-            </w:r>
-            <w:proofErr w:type="gramEnd"/>
+              <w:t>qr.concepts</w:t>
+            </w:r>
+            <w:proofErr w:type="spellEnd"/>
             <w:r>
               <w:rPr>
                 <w:color w:val="000000" w:themeColor="text1"/>
               </w:rPr>
-              <w:t>.</w:t>
-            </w:r>
-            <w:proofErr w:type="gramStart"/>
-            <w:r>
-              <w:rPr>
-                <w:color w:val="000000" w:themeColor="text1"/>
-              </w:rPr>
-              <w:t>concepts</w:t>
-            </w:r>
-            <w:proofErr w:type="spellEnd"/>
-            <w:r>
-              <w:rPr>
-                <w:color w:val="000000" w:themeColor="text1"/>
-              </w:rPr>
-              <w:t>[</w:t>
-            </w:r>
-            <w:proofErr w:type="gramEnd"/>
-            <w:r>
-              <w:rPr>
-                <w:color w:val="000000" w:themeColor="text1"/>
-              </w:rPr>
-              <w:t>4</w:t>
-            </w:r>
-            <w:proofErr w:type="gramStart"/>
-            <w:r>
-              <w:rPr>
-                <w:color w:val="000000" w:themeColor="text1"/>
-              </w:rPr>
-              <w:t>].questions</w:t>
-            </w:r>
-            <w:proofErr w:type="gramEnd"/>
-            <w:r>
-              <w:rPr>
-                <w:color w:val="000000" w:themeColor="text1"/>
-              </w:rPr>
-              <w:t xml:space="preserve"> }}</w:t>
+              <w:t>[4].questions }}</w:t>
             </w:r>
           </w:p>
         </w:tc>
@@ -5856,7 +4452,6 @@
                 <w:color w:val="5B9BD5" w:themeColor="accent5"/>
               </w:rPr>
             </w:pPr>
-            <w:proofErr w:type="gramStart"/>
             <w:r>
               <w:rPr>
                 <w:color w:val="5B9BD5" w:themeColor="accent5"/>
@@ -5868,56 +4463,21 @@
               <w:rPr>
                 <w:color w:val="5B9BD5" w:themeColor="accent5"/>
               </w:rPr>
-              <w:t>qr</w:t>
-            </w:r>
-            <w:proofErr w:type="gramEnd"/>
-            <w:r>
-              <w:rPr>
-                <w:color w:val="5B9BD5" w:themeColor="accent5"/>
-              </w:rPr>
-              <w:t>.</w:t>
-            </w:r>
-            <w:proofErr w:type="gramStart"/>
-            <w:r>
-              <w:rPr>
-                <w:color w:val="5B9BD5" w:themeColor="accent5"/>
-              </w:rPr>
-              <w:t>concepts</w:t>
+              <w:t>qr.concepts</w:t>
             </w:r>
             <w:proofErr w:type="spellEnd"/>
             <w:r>
               <w:rPr>
                 <w:color w:val="5B9BD5" w:themeColor="accent5"/>
               </w:rPr>
-              <w:t>[</w:t>
-            </w:r>
-            <w:proofErr w:type="gramEnd"/>
-            <w:r>
-              <w:rPr>
-                <w:color w:val="5B9BD5" w:themeColor="accent5"/>
-              </w:rPr>
-              <w:t>4</w:t>
-            </w:r>
-            <w:proofErr w:type="gramStart"/>
-            <w:r>
-              <w:rPr>
-                <w:color w:val="5B9BD5" w:themeColor="accent5"/>
-              </w:rPr>
-              <w:t>].</w:t>
+              <w:t>[4].</w:t>
             </w:r>
             <w:proofErr w:type="spellStart"/>
             <w:r>
               <w:rPr>
                 <w:color w:val="5B9BD5" w:themeColor="accent5"/>
               </w:rPr>
-              <w:t>done</w:t>
-            </w:r>
-            <w:proofErr w:type="gramEnd"/>
-            <w:r>
-              <w:rPr>
-                <w:color w:val="5B9BD5" w:themeColor="accent5"/>
-              </w:rPr>
-              <w:t>_well</w:t>
+              <w:t>done_well</w:t>
             </w:r>
             <w:proofErr w:type="spellEnd"/>
             <w:r>
@@ -5951,7 +4511,6 @@
                 <w:color w:val="5B9BD5" w:themeColor="accent5"/>
               </w:rPr>
             </w:pPr>
-            <w:proofErr w:type="gramStart"/>
             <w:r>
               <w:rPr>
                 <w:color w:val="5B9BD5" w:themeColor="accent5"/>
@@ -5963,49 +4522,14 @@
               <w:rPr>
                 <w:color w:val="5B9BD5" w:themeColor="accent5"/>
               </w:rPr>
-              <w:t>qr</w:t>
-            </w:r>
-            <w:proofErr w:type="gramEnd"/>
-            <w:r>
-              <w:rPr>
-                <w:color w:val="5B9BD5" w:themeColor="accent5"/>
-              </w:rPr>
-              <w:t>.</w:t>
-            </w:r>
-            <w:proofErr w:type="gramStart"/>
-            <w:r>
-              <w:rPr>
-                <w:color w:val="5B9BD5" w:themeColor="accent5"/>
-              </w:rPr>
-              <w:t>concepts</w:t>
+              <w:t>qr.concepts</w:t>
             </w:r>
             <w:proofErr w:type="spellEnd"/>
             <w:r>
               <w:rPr>
                 <w:color w:val="5B9BD5" w:themeColor="accent5"/>
               </w:rPr>
-              <w:t>[</w:t>
-            </w:r>
-            <w:proofErr w:type="gramEnd"/>
-            <w:r>
-              <w:rPr>
-                <w:color w:val="5B9BD5" w:themeColor="accent5"/>
-              </w:rPr>
-              <w:t>4</w:t>
-            </w:r>
-            <w:proofErr w:type="gramStart"/>
-            <w:r>
-              <w:rPr>
-                <w:color w:val="5B9BD5" w:themeColor="accent5"/>
-              </w:rPr>
-              <w:t>].improve</w:t>
-            </w:r>
-            <w:proofErr w:type="gramEnd"/>
-            <w:r>
-              <w:rPr>
-                <w:color w:val="5B9BD5" w:themeColor="accent5"/>
-              </w:rPr>
-              <w:t xml:space="preserve"> }}</w:t>
+              <w:t>[4].improve }}</w:t>
             </w:r>
           </w:p>
         </w:tc>
@@ -6062,7 +4586,6 @@
                 <w:color w:val="000000" w:themeColor="text1"/>
               </w:rPr>
             </w:pPr>
-            <w:proofErr w:type="gramStart"/>
             <w:r>
               <w:rPr>
                 <w:color w:val="000000" w:themeColor="text1"/>
@@ -6074,49 +4597,14 @@
               <w:rPr>
                 <w:color w:val="000000" w:themeColor="text1"/>
               </w:rPr>
-              <w:t>qr</w:t>
-            </w:r>
-            <w:proofErr w:type="gramEnd"/>
+              <w:t>qr.concepts</w:t>
+            </w:r>
+            <w:proofErr w:type="spellEnd"/>
             <w:r>
               <w:rPr>
                 <w:color w:val="000000" w:themeColor="text1"/>
               </w:rPr>
-              <w:t>.</w:t>
-            </w:r>
-            <w:proofErr w:type="gramStart"/>
-            <w:r>
-              <w:rPr>
-                <w:color w:val="000000" w:themeColor="text1"/>
-              </w:rPr>
-              <w:t>concepts</w:t>
-            </w:r>
-            <w:proofErr w:type="spellEnd"/>
-            <w:r>
-              <w:rPr>
-                <w:color w:val="000000" w:themeColor="text1"/>
-              </w:rPr>
-              <w:t>[</w:t>
-            </w:r>
-            <w:proofErr w:type="gramEnd"/>
-            <w:r>
-              <w:rPr>
-                <w:color w:val="000000" w:themeColor="text1"/>
-              </w:rPr>
-              <w:t>5</w:t>
-            </w:r>
-            <w:proofErr w:type="gramStart"/>
-            <w:r>
-              <w:rPr>
-                <w:color w:val="000000" w:themeColor="text1"/>
-              </w:rPr>
-              <w:t>].questions</w:t>
-            </w:r>
-            <w:proofErr w:type="gramEnd"/>
-            <w:r>
-              <w:rPr>
-                <w:color w:val="000000" w:themeColor="text1"/>
-              </w:rPr>
-              <w:t xml:space="preserve"> }}</w:t>
+              <w:t>[5].questions }}</w:t>
             </w:r>
           </w:p>
         </w:tc>
@@ -6143,7 +4631,6 @@
                 <w:color w:val="5B9BD5" w:themeColor="accent5"/>
               </w:rPr>
             </w:pPr>
-            <w:proofErr w:type="gramStart"/>
             <w:r>
               <w:rPr>
                 <w:color w:val="5B9BD5" w:themeColor="accent5"/>
@@ -6155,56 +4642,21 @@
               <w:rPr>
                 <w:color w:val="5B9BD5" w:themeColor="accent5"/>
               </w:rPr>
-              <w:t>qr</w:t>
-            </w:r>
-            <w:proofErr w:type="gramEnd"/>
-            <w:r>
-              <w:rPr>
-                <w:color w:val="5B9BD5" w:themeColor="accent5"/>
-              </w:rPr>
-              <w:t>.</w:t>
-            </w:r>
-            <w:proofErr w:type="gramStart"/>
-            <w:r>
-              <w:rPr>
-                <w:color w:val="5B9BD5" w:themeColor="accent5"/>
-              </w:rPr>
-              <w:t>concepts</w:t>
+              <w:t>qr.concepts</w:t>
             </w:r>
             <w:proofErr w:type="spellEnd"/>
             <w:r>
               <w:rPr>
                 <w:color w:val="5B9BD5" w:themeColor="accent5"/>
               </w:rPr>
-              <w:t>[</w:t>
-            </w:r>
-            <w:proofErr w:type="gramEnd"/>
-            <w:r>
-              <w:rPr>
-                <w:color w:val="5B9BD5" w:themeColor="accent5"/>
-              </w:rPr>
-              <w:t>5</w:t>
-            </w:r>
-            <w:proofErr w:type="gramStart"/>
-            <w:r>
-              <w:rPr>
-                <w:color w:val="5B9BD5" w:themeColor="accent5"/>
-              </w:rPr>
-              <w:t>].</w:t>
+              <w:t>[5].</w:t>
             </w:r>
             <w:proofErr w:type="spellStart"/>
             <w:r>
               <w:rPr>
                 <w:color w:val="5B9BD5" w:themeColor="accent5"/>
               </w:rPr>
-              <w:t>done</w:t>
-            </w:r>
-            <w:proofErr w:type="gramEnd"/>
-            <w:r>
-              <w:rPr>
-                <w:color w:val="5B9BD5" w:themeColor="accent5"/>
-              </w:rPr>
-              <w:t>_well</w:t>
+              <w:t>done_well</w:t>
             </w:r>
             <w:proofErr w:type="spellEnd"/>
             <w:r>
@@ -6238,7 +4690,6 @@
                 <w:color w:val="5B9BD5" w:themeColor="accent5"/>
               </w:rPr>
             </w:pPr>
-            <w:proofErr w:type="gramStart"/>
             <w:r>
               <w:rPr>
                 <w:color w:val="5B9BD5" w:themeColor="accent5"/>
@@ -6250,49 +4701,14 @@
               <w:rPr>
                 <w:color w:val="5B9BD5" w:themeColor="accent5"/>
               </w:rPr>
-              <w:t>qr</w:t>
-            </w:r>
-            <w:proofErr w:type="gramEnd"/>
-            <w:r>
-              <w:rPr>
-                <w:color w:val="5B9BD5" w:themeColor="accent5"/>
-              </w:rPr>
-              <w:t>.</w:t>
-            </w:r>
-            <w:proofErr w:type="gramStart"/>
-            <w:r>
-              <w:rPr>
-                <w:color w:val="5B9BD5" w:themeColor="accent5"/>
-              </w:rPr>
-              <w:t>concepts</w:t>
+              <w:t>qr.concepts</w:t>
             </w:r>
             <w:proofErr w:type="spellEnd"/>
             <w:r>
               <w:rPr>
                 <w:color w:val="5B9BD5" w:themeColor="accent5"/>
               </w:rPr>
-              <w:t>[</w:t>
-            </w:r>
-            <w:proofErr w:type="gramEnd"/>
-            <w:r>
-              <w:rPr>
-                <w:color w:val="5B9BD5" w:themeColor="accent5"/>
-              </w:rPr>
-              <w:t>5</w:t>
-            </w:r>
-            <w:proofErr w:type="gramStart"/>
-            <w:r>
-              <w:rPr>
-                <w:color w:val="5B9BD5" w:themeColor="accent5"/>
-              </w:rPr>
-              <w:t>].improve</w:t>
-            </w:r>
-            <w:proofErr w:type="gramEnd"/>
-            <w:r>
-              <w:rPr>
-                <w:color w:val="5B9BD5" w:themeColor="accent5"/>
-              </w:rPr>
-              <w:t xml:space="preserve"> }}</w:t>
+              <w:t>[5].improve }}</w:t>
             </w:r>
           </w:p>
         </w:tc>
@@ -6352,7 +4768,6 @@
                 <w:color w:val="000000" w:themeColor="text1"/>
               </w:rPr>
             </w:pPr>
-            <w:proofErr w:type="gramStart"/>
             <w:r>
               <w:rPr>
                 <w:color w:val="000000" w:themeColor="text1"/>
@@ -6364,49 +4779,14 @@
               <w:rPr>
                 <w:color w:val="000000" w:themeColor="text1"/>
               </w:rPr>
-              <w:t>qr</w:t>
-            </w:r>
-            <w:proofErr w:type="gramEnd"/>
+              <w:t>qr.concepts</w:t>
+            </w:r>
+            <w:proofErr w:type="spellEnd"/>
             <w:r>
               <w:rPr>
                 <w:color w:val="000000" w:themeColor="text1"/>
               </w:rPr>
-              <w:t>.</w:t>
-            </w:r>
-            <w:proofErr w:type="gramStart"/>
-            <w:r>
-              <w:rPr>
-                <w:color w:val="000000" w:themeColor="text1"/>
-              </w:rPr>
-              <w:t>concepts</w:t>
-            </w:r>
-            <w:proofErr w:type="spellEnd"/>
-            <w:r>
-              <w:rPr>
-                <w:color w:val="000000" w:themeColor="text1"/>
-              </w:rPr>
-              <w:t>[</w:t>
-            </w:r>
-            <w:proofErr w:type="gramEnd"/>
-            <w:r>
-              <w:rPr>
-                <w:color w:val="000000" w:themeColor="text1"/>
-              </w:rPr>
-              <w:t>6</w:t>
-            </w:r>
-            <w:proofErr w:type="gramStart"/>
-            <w:r>
-              <w:rPr>
-                <w:color w:val="000000" w:themeColor="text1"/>
-              </w:rPr>
-              <w:t>].questions</w:t>
-            </w:r>
-            <w:proofErr w:type="gramEnd"/>
-            <w:r>
-              <w:rPr>
-                <w:color w:val="000000" w:themeColor="text1"/>
-              </w:rPr>
-              <w:t xml:space="preserve"> }}</w:t>
+              <w:t>[6].questions }}</w:t>
             </w:r>
           </w:p>
         </w:tc>
@@ -6433,7 +4813,6 @@
                 <w:color w:val="5B9BD5" w:themeColor="accent5"/>
               </w:rPr>
             </w:pPr>
-            <w:proofErr w:type="gramStart"/>
             <w:r>
               <w:rPr>
                 <w:color w:val="5B9BD5" w:themeColor="accent5"/>
@@ -6445,56 +4824,21 @@
               <w:rPr>
                 <w:color w:val="5B9BD5" w:themeColor="accent5"/>
               </w:rPr>
-              <w:t>qr</w:t>
-            </w:r>
-            <w:proofErr w:type="gramEnd"/>
-            <w:r>
-              <w:rPr>
-                <w:color w:val="5B9BD5" w:themeColor="accent5"/>
-              </w:rPr>
-              <w:t>.</w:t>
-            </w:r>
-            <w:proofErr w:type="gramStart"/>
-            <w:r>
-              <w:rPr>
-                <w:color w:val="5B9BD5" w:themeColor="accent5"/>
-              </w:rPr>
-              <w:t>concepts</w:t>
+              <w:t>qr.concepts</w:t>
             </w:r>
             <w:proofErr w:type="spellEnd"/>
             <w:r>
               <w:rPr>
                 <w:color w:val="5B9BD5" w:themeColor="accent5"/>
               </w:rPr>
-              <w:t>[</w:t>
-            </w:r>
-            <w:proofErr w:type="gramEnd"/>
-            <w:r>
-              <w:rPr>
-                <w:color w:val="5B9BD5" w:themeColor="accent5"/>
-              </w:rPr>
-              <w:t>6</w:t>
-            </w:r>
-            <w:proofErr w:type="gramStart"/>
-            <w:r>
-              <w:rPr>
-                <w:color w:val="5B9BD5" w:themeColor="accent5"/>
-              </w:rPr>
-              <w:t>].</w:t>
+              <w:t>[6].</w:t>
             </w:r>
             <w:proofErr w:type="spellStart"/>
             <w:r>
               <w:rPr>
                 <w:color w:val="5B9BD5" w:themeColor="accent5"/>
               </w:rPr>
-              <w:t>done</w:t>
-            </w:r>
-            <w:proofErr w:type="gramEnd"/>
-            <w:r>
-              <w:rPr>
-                <w:color w:val="5B9BD5" w:themeColor="accent5"/>
-              </w:rPr>
-              <w:t>_well</w:t>
+              <w:t>done_well</w:t>
             </w:r>
             <w:proofErr w:type="spellEnd"/>
             <w:r>
@@ -6528,7 +4872,6 @@
                 <w:color w:val="5B9BD5" w:themeColor="accent5"/>
               </w:rPr>
             </w:pPr>
-            <w:proofErr w:type="gramStart"/>
             <w:r>
               <w:rPr>
                 <w:color w:val="5B9BD5" w:themeColor="accent5"/>
@@ -6540,49 +4883,14 @@
               <w:rPr>
                 <w:color w:val="5B9BD5" w:themeColor="accent5"/>
               </w:rPr>
-              <w:t>qr</w:t>
-            </w:r>
-            <w:proofErr w:type="gramEnd"/>
-            <w:r>
-              <w:rPr>
-                <w:color w:val="5B9BD5" w:themeColor="accent5"/>
-              </w:rPr>
-              <w:t>.</w:t>
-            </w:r>
-            <w:proofErr w:type="gramStart"/>
-            <w:r>
-              <w:rPr>
-                <w:color w:val="5B9BD5" w:themeColor="accent5"/>
-              </w:rPr>
-              <w:t>concepts</w:t>
+              <w:t>qr.concepts</w:t>
             </w:r>
             <w:proofErr w:type="spellEnd"/>
             <w:r>
               <w:rPr>
                 <w:color w:val="5B9BD5" w:themeColor="accent5"/>
               </w:rPr>
-              <w:t>[</w:t>
-            </w:r>
-            <w:proofErr w:type="gramEnd"/>
-            <w:r>
-              <w:rPr>
-                <w:color w:val="5B9BD5" w:themeColor="accent5"/>
-              </w:rPr>
-              <w:t>6</w:t>
-            </w:r>
-            <w:proofErr w:type="gramStart"/>
-            <w:r>
-              <w:rPr>
-                <w:color w:val="5B9BD5" w:themeColor="accent5"/>
-              </w:rPr>
-              <w:t>].improve</w:t>
-            </w:r>
-            <w:proofErr w:type="gramEnd"/>
-            <w:r>
-              <w:rPr>
-                <w:color w:val="5B9BD5" w:themeColor="accent5"/>
-              </w:rPr>
-              <w:t xml:space="preserve"> }}</w:t>
+              <w:t>[6].improve }}</w:t>
             </w:r>
           </w:p>
         </w:tc>
@@ -6639,7 +4947,6 @@
                 <w:color w:val="000000" w:themeColor="text1"/>
               </w:rPr>
             </w:pPr>
-            <w:proofErr w:type="gramStart"/>
             <w:r>
               <w:rPr>
                 <w:color w:val="000000" w:themeColor="text1"/>
@@ -6651,49 +4958,14 @@
               <w:rPr>
                 <w:color w:val="000000" w:themeColor="text1"/>
               </w:rPr>
-              <w:t>qr</w:t>
-            </w:r>
-            <w:proofErr w:type="gramEnd"/>
+              <w:t>qr.concepts</w:t>
+            </w:r>
+            <w:proofErr w:type="spellEnd"/>
             <w:r>
               <w:rPr>
                 <w:color w:val="000000" w:themeColor="text1"/>
               </w:rPr>
-              <w:t>.</w:t>
-            </w:r>
-            <w:proofErr w:type="gramStart"/>
-            <w:r>
-              <w:rPr>
-                <w:color w:val="000000" w:themeColor="text1"/>
-              </w:rPr>
-              <w:t>concepts</w:t>
-            </w:r>
-            <w:proofErr w:type="spellEnd"/>
-            <w:r>
-              <w:rPr>
-                <w:color w:val="000000" w:themeColor="text1"/>
-              </w:rPr>
-              <w:t>[</w:t>
-            </w:r>
-            <w:proofErr w:type="gramEnd"/>
-            <w:r>
-              <w:rPr>
-                <w:color w:val="000000" w:themeColor="text1"/>
-              </w:rPr>
-              <w:t>7</w:t>
-            </w:r>
-            <w:proofErr w:type="gramStart"/>
-            <w:r>
-              <w:rPr>
-                <w:color w:val="000000" w:themeColor="text1"/>
-              </w:rPr>
-              <w:t>].questions</w:t>
-            </w:r>
-            <w:proofErr w:type="gramEnd"/>
-            <w:r>
-              <w:rPr>
-                <w:color w:val="000000" w:themeColor="text1"/>
-              </w:rPr>
-              <w:t xml:space="preserve"> }}</w:t>
+              <w:t>[7].questions }}</w:t>
             </w:r>
           </w:p>
         </w:tc>
@@ -6720,7 +4992,6 @@
                 <w:color w:val="5B9BD5" w:themeColor="accent5"/>
               </w:rPr>
             </w:pPr>
-            <w:proofErr w:type="gramStart"/>
             <w:r>
               <w:rPr>
                 <w:color w:val="5B9BD5" w:themeColor="accent5"/>
@@ -6732,56 +5003,21 @@
               <w:rPr>
                 <w:color w:val="5B9BD5" w:themeColor="accent5"/>
               </w:rPr>
-              <w:t>qr</w:t>
-            </w:r>
-            <w:proofErr w:type="gramEnd"/>
-            <w:r>
-              <w:rPr>
-                <w:color w:val="5B9BD5" w:themeColor="accent5"/>
-              </w:rPr>
-              <w:t>.</w:t>
-            </w:r>
-            <w:proofErr w:type="gramStart"/>
-            <w:r>
-              <w:rPr>
-                <w:color w:val="5B9BD5" w:themeColor="accent5"/>
-              </w:rPr>
-              <w:t>concepts</w:t>
+              <w:t>qr.concepts</w:t>
             </w:r>
             <w:proofErr w:type="spellEnd"/>
             <w:r>
               <w:rPr>
                 <w:color w:val="5B9BD5" w:themeColor="accent5"/>
               </w:rPr>
-              <w:t>[</w:t>
-            </w:r>
-            <w:proofErr w:type="gramEnd"/>
-            <w:r>
-              <w:rPr>
-                <w:color w:val="5B9BD5" w:themeColor="accent5"/>
-              </w:rPr>
-              <w:t>7</w:t>
-            </w:r>
-            <w:proofErr w:type="gramStart"/>
-            <w:r>
-              <w:rPr>
-                <w:color w:val="5B9BD5" w:themeColor="accent5"/>
-              </w:rPr>
-              <w:t>].</w:t>
+              <w:t>[7].</w:t>
             </w:r>
             <w:proofErr w:type="spellStart"/>
             <w:r>
               <w:rPr>
                 <w:color w:val="5B9BD5" w:themeColor="accent5"/>
               </w:rPr>
-              <w:t>done</w:t>
-            </w:r>
-            <w:proofErr w:type="gramEnd"/>
-            <w:r>
-              <w:rPr>
-                <w:color w:val="5B9BD5" w:themeColor="accent5"/>
-              </w:rPr>
-              <w:t>_well</w:t>
+              <w:t>done_well</w:t>
             </w:r>
             <w:proofErr w:type="spellEnd"/>
             <w:r>
@@ -6815,7 +5051,6 @@
                 <w:color w:val="5B9BD5" w:themeColor="accent5"/>
               </w:rPr>
             </w:pPr>
-            <w:proofErr w:type="gramStart"/>
             <w:r>
               <w:rPr>
                 <w:color w:val="5B9BD5" w:themeColor="accent5"/>
@@ -6827,49 +5062,14 @@
               <w:rPr>
                 <w:color w:val="5B9BD5" w:themeColor="accent5"/>
               </w:rPr>
-              <w:t>qr</w:t>
-            </w:r>
-            <w:proofErr w:type="gramEnd"/>
-            <w:r>
-              <w:rPr>
-                <w:color w:val="5B9BD5" w:themeColor="accent5"/>
-              </w:rPr>
-              <w:t>.</w:t>
-            </w:r>
-            <w:proofErr w:type="gramStart"/>
-            <w:r>
-              <w:rPr>
-                <w:color w:val="5B9BD5" w:themeColor="accent5"/>
-              </w:rPr>
-              <w:t>concepts</w:t>
+              <w:t>qr.concepts</w:t>
             </w:r>
             <w:proofErr w:type="spellEnd"/>
             <w:r>
               <w:rPr>
                 <w:color w:val="5B9BD5" w:themeColor="accent5"/>
               </w:rPr>
-              <w:t>[</w:t>
-            </w:r>
-            <w:proofErr w:type="gramEnd"/>
-            <w:r>
-              <w:rPr>
-                <w:color w:val="5B9BD5" w:themeColor="accent5"/>
-              </w:rPr>
-              <w:t>7</w:t>
-            </w:r>
-            <w:proofErr w:type="gramStart"/>
-            <w:r>
-              <w:rPr>
-                <w:color w:val="5B9BD5" w:themeColor="accent5"/>
-              </w:rPr>
-              <w:t>].improve</w:t>
-            </w:r>
-            <w:proofErr w:type="gramEnd"/>
-            <w:r>
-              <w:rPr>
-                <w:color w:val="5B9BD5" w:themeColor="accent5"/>
-              </w:rPr>
-              <w:t xml:space="preserve"> }}</w:t>
+              <w:t>[7].improve }}</w:t>
             </w:r>
           </w:p>
         </w:tc>
@@ -6926,7 +5126,6 @@
                 <w:color w:val="000000" w:themeColor="text1"/>
               </w:rPr>
             </w:pPr>
-            <w:proofErr w:type="gramStart"/>
             <w:r>
               <w:rPr>
                 <w:color w:val="000000" w:themeColor="text1"/>
@@ -6938,49 +5137,14 @@
               <w:rPr>
                 <w:color w:val="000000" w:themeColor="text1"/>
               </w:rPr>
-              <w:t>qr</w:t>
-            </w:r>
-            <w:proofErr w:type="gramEnd"/>
+              <w:t>qr.concepts</w:t>
+            </w:r>
+            <w:proofErr w:type="spellEnd"/>
             <w:r>
               <w:rPr>
                 <w:color w:val="000000" w:themeColor="text1"/>
               </w:rPr>
-              <w:t>.</w:t>
-            </w:r>
-            <w:proofErr w:type="gramStart"/>
-            <w:r>
-              <w:rPr>
-                <w:color w:val="000000" w:themeColor="text1"/>
-              </w:rPr>
-              <w:t>concepts</w:t>
-            </w:r>
-            <w:proofErr w:type="spellEnd"/>
-            <w:r>
-              <w:rPr>
-                <w:color w:val="000000" w:themeColor="text1"/>
-              </w:rPr>
-              <w:t>[</w:t>
-            </w:r>
-            <w:proofErr w:type="gramEnd"/>
-            <w:r>
-              <w:rPr>
-                <w:color w:val="000000" w:themeColor="text1"/>
-              </w:rPr>
-              <w:t>8</w:t>
-            </w:r>
-            <w:proofErr w:type="gramStart"/>
-            <w:r>
-              <w:rPr>
-                <w:color w:val="000000" w:themeColor="text1"/>
-              </w:rPr>
-              <w:t>].questions</w:t>
-            </w:r>
-            <w:proofErr w:type="gramEnd"/>
-            <w:r>
-              <w:rPr>
-                <w:color w:val="000000" w:themeColor="text1"/>
-              </w:rPr>
-              <w:t xml:space="preserve"> }}</w:t>
+              <w:t>[8].questions }}</w:t>
             </w:r>
           </w:p>
         </w:tc>
@@ -7007,7 +5171,6 @@
                 <w:color w:val="5B9BD5" w:themeColor="accent5"/>
               </w:rPr>
             </w:pPr>
-            <w:proofErr w:type="gramStart"/>
             <w:r>
               <w:rPr>
                 <w:color w:val="5B9BD5" w:themeColor="accent5"/>
@@ -7019,56 +5182,21 @@
               <w:rPr>
                 <w:color w:val="5B9BD5" w:themeColor="accent5"/>
               </w:rPr>
-              <w:t>qr</w:t>
-            </w:r>
-            <w:proofErr w:type="gramEnd"/>
-            <w:r>
-              <w:rPr>
-                <w:color w:val="5B9BD5" w:themeColor="accent5"/>
-              </w:rPr>
-              <w:t>.</w:t>
-            </w:r>
-            <w:proofErr w:type="gramStart"/>
-            <w:r>
-              <w:rPr>
-                <w:color w:val="5B9BD5" w:themeColor="accent5"/>
-              </w:rPr>
-              <w:t>concepts</w:t>
+              <w:t>qr.concepts</w:t>
             </w:r>
             <w:proofErr w:type="spellEnd"/>
             <w:r>
               <w:rPr>
                 <w:color w:val="5B9BD5" w:themeColor="accent5"/>
               </w:rPr>
-              <w:t>[</w:t>
-            </w:r>
-            <w:proofErr w:type="gramEnd"/>
-            <w:r>
-              <w:rPr>
-                <w:color w:val="5B9BD5" w:themeColor="accent5"/>
-              </w:rPr>
-              <w:t>8</w:t>
-            </w:r>
-            <w:proofErr w:type="gramStart"/>
-            <w:r>
-              <w:rPr>
-                <w:color w:val="5B9BD5" w:themeColor="accent5"/>
-              </w:rPr>
-              <w:t>].</w:t>
+              <w:t>[8].</w:t>
             </w:r>
             <w:proofErr w:type="spellStart"/>
             <w:r>
               <w:rPr>
                 <w:color w:val="5B9BD5" w:themeColor="accent5"/>
               </w:rPr>
-              <w:t>done</w:t>
-            </w:r>
-            <w:proofErr w:type="gramEnd"/>
-            <w:r>
-              <w:rPr>
-                <w:color w:val="5B9BD5" w:themeColor="accent5"/>
-              </w:rPr>
-              <w:t>_well</w:t>
+              <w:t>done_well</w:t>
             </w:r>
             <w:proofErr w:type="spellEnd"/>
             <w:r>
@@ -7102,7 +5230,6 @@
                 <w:color w:val="5B9BD5" w:themeColor="accent5"/>
               </w:rPr>
             </w:pPr>
-            <w:proofErr w:type="gramStart"/>
             <w:r>
               <w:rPr>
                 <w:color w:val="5B9BD5" w:themeColor="accent5"/>
@@ -7114,49 +5241,14 @@
               <w:rPr>
                 <w:color w:val="5B9BD5" w:themeColor="accent5"/>
               </w:rPr>
-              <w:t>qr</w:t>
-            </w:r>
-            <w:proofErr w:type="gramEnd"/>
-            <w:r>
-              <w:rPr>
-                <w:color w:val="5B9BD5" w:themeColor="accent5"/>
-              </w:rPr>
-              <w:t>.</w:t>
-            </w:r>
-            <w:proofErr w:type="gramStart"/>
-            <w:r>
-              <w:rPr>
-                <w:color w:val="5B9BD5" w:themeColor="accent5"/>
-              </w:rPr>
-              <w:t>concepts</w:t>
+              <w:t>qr.concepts</w:t>
             </w:r>
             <w:proofErr w:type="spellEnd"/>
             <w:r>
               <w:rPr>
                 <w:color w:val="5B9BD5" w:themeColor="accent5"/>
               </w:rPr>
-              <w:t>[</w:t>
-            </w:r>
-            <w:proofErr w:type="gramEnd"/>
-            <w:r>
-              <w:rPr>
-                <w:color w:val="5B9BD5" w:themeColor="accent5"/>
-              </w:rPr>
-              <w:t>8</w:t>
-            </w:r>
-            <w:proofErr w:type="gramStart"/>
-            <w:r>
-              <w:rPr>
-                <w:color w:val="5B9BD5" w:themeColor="accent5"/>
-              </w:rPr>
-              <w:t>].improve</w:t>
-            </w:r>
-            <w:proofErr w:type="gramEnd"/>
-            <w:r>
-              <w:rPr>
-                <w:color w:val="5B9BD5" w:themeColor="accent5"/>
-              </w:rPr>
-              <w:t xml:space="preserve"> }}</w:t>
+              <w:t>[8].improve }}</w:t>
             </w:r>
           </w:p>
         </w:tc>
@@ -7213,7 +5305,6 @@
                 <w:color w:val="000000" w:themeColor="text1"/>
               </w:rPr>
             </w:pPr>
-            <w:proofErr w:type="gramStart"/>
             <w:r>
               <w:rPr>
                 <w:color w:val="000000" w:themeColor="text1"/>
@@ -7225,49 +5316,14 @@
               <w:rPr>
                 <w:color w:val="000000" w:themeColor="text1"/>
               </w:rPr>
-              <w:t>qr</w:t>
-            </w:r>
-            <w:proofErr w:type="gramEnd"/>
+              <w:t>qr.concepts</w:t>
+            </w:r>
+            <w:proofErr w:type="spellEnd"/>
             <w:r>
               <w:rPr>
                 <w:color w:val="000000" w:themeColor="text1"/>
               </w:rPr>
-              <w:t>.</w:t>
-            </w:r>
-            <w:proofErr w:type="gramStart"/>
-            <w:r>
-              <w:rPr>
-                <w:color w:val="000000" w:themeColor="text1"/>
-              </w:rPr>
-              <w:t>concepts</w:t>
-            </w:r>
-            <w:proofErr w:type="spellEnd"/>
-            <w:r>
-              <w:rPr>
-                <w:color w:val="000000" w:themeColor="text1"/>
-              </w:rPr>
-              <w:t>[</w:t>
-            </w:r>
-            <w:proofErr w:type="gramEnd"/>
-            <w:r>
-              <w:rPr>
-                <w:color w:val="000000" w:themeColor="text1"/>
-              </w:rPr>
-              <w:t>9</w:t>
-            </w:r>
-            <w:proofErr w:type="gramStart"/>
-            <w:r>
-              <w:rPr>
-                <w:color w:val="000000" w:themeColor="text1"/>
-              </w:rPr>
-              <w:t>].questions</w:t>
-            </w:r>
-            <w:proofErr w:type="gramEnd"/>
-            <w:r>
-              <w:rPr>
-                <w:color w:val="000000" w:themeColor="text1"/>
-              </w:rPr>
-              <w:t xml:space="preserve"> }}</w:t>
+              <w:t>[9].questions }}</w:t>
             </w:r>
           </w:p>
         </w:tc>
@@ -7294,7 +5350,6 @@
                 <w:color w:val="5B9BD5" w:themeColor="accent5"/>
               </w:rPr>
             </w:pPr>
-            <w:proofErr w:type="gramStart"/>
             <w:r>
               <w:rPr>
                 <w:color w:val="5B9BD5" w:themeColor="accent5"/>
@@ -7306,56 +5361,21 @@
               <w:rPr>
                 <w:color w:val="5B9BD5" w:themeColor="accent5"/>
               </w:rPr>
-              <w:t>qr</w:t>
-            </w:r>
-            <w:proofErr w:type="gramEnd"/>
-            <w:r>
-              <w:rPr>
-                <w:color w:val="5B9BD5" w:themeColor="accent5"/>
-              </w:rPr>
-              <w:t>.</w:t>
-            </w:r>
-            <w:proofErr w:type="gramStart"/>
-            <w:r>
-              <w:rPr>
-                <w:color w:val="5B9BD5" w:themeColor="accent5"/>
-              </w:rPr>
-              <w:t>concepts</w:t>
+              <w:t>qr.concepts</w:t>
             </w:r>
             <w:proofErr w:type="spellEnd"/>
             <w:r>
               <w:rPr>
                 <w:color w:val="5B9BD5" w:themeColor="accent5"/>
               </w:rPr>
-              <w:t>[</w:t>
-            </w:r>
-            <w:proofErr w:type="gramEnd"/>
-            <w:r>
-              <w:rPr>
-                <w:color w:val="5B9BD5" w:themeColor="accent5"/>
-              </w:rPr>
-              <w:t>9</w:t>
-            </w:r>
-            <w:proofErr w:type="gramStart"/>
-            <w:r>
-              <w:rPr>
-                <w:color w:val="5B9BD5" w:themeColor="accent5"/>
-              </w:rPr>
-              <w:t>].</w:t>
+              <w:t>[9].</w:t>
             </w:r>
             <w:proofErr w:type="spellStart"/>
             <w:r>
               <w:rPr>
                 <w:color w:val="5B9BD5" w:themeColor="accent5"/>
               </w:rPr>
-              <w:t>done</w:t>
-            </w:r>
-            <w:proofErr w:type="gramEnd"/>
-            <w:r>
-              <w:rPr>
-                <w:color w:val="5B9BD5" w:themeColor="accent5"/>
-              </w:rPr>
-              <w:t>_well</w:t>
+              <w:t>done_well</w:t>
             </w:r>
             <w:proofErr w:type="spellEnd"/>
             <w:r>
@@ -7389,7 +5409,6 @@
                 <w:color w:val="5B9BD5" w:themeColor="accent5"/>
               </w:rPr>
             </w:pPr>
-            <w:proofErr w:type="gramStart"/>
             <w:r>
               <w:rPr>
                 <w:color w:val="5B9BD5" w:themeColor="accent5"/>
@@ -7401,49 +5420,14 @@
               <w:rPr>
                 <w:color w:val="5B9BD5" w:themeColor="accent5"/>
               </w:rPr>
-              <w:t>qr</w:t>
-            </w:r>
-            <w:proofErr w:type="gramEnd"/>
-            <w:r>
-              <w:rPr>
-                <w:color w:val="5B9BD5" w:themeColor="accent5"/>
-              </w:rPr>
-              <w:t>.</w:t>
-            </w:r>
-            <w:proofErr w:type="gramStart"/>
-            <w:r>
-              <w:rPr>
-                <w:color w:val="5B9BD5" w:themeColor="accent5"/>
-              </w:rPr>
-              <w:t>concepts</w:t>
+              <w:t>qr.concepts</w:t>
             </w:r>
             <w:proofErr w:type="spellEnd"/>
             <w:r>
               <w:rPr>
                 <w:color w:val="5B9BD5" w:themeColor="accent5"/>
               </w:rPr>
-              <w:t>[</w:t>
-            </w:r>
-            <w:proofErr w:type="gramEnd"/>
-            <w:r>
-              <w:rPr>
-                <w:color w:val="5B9BD5" w:themeColor="accent5"/>
-              </w:rPr>
-              <w:t>9</w:t>
-            </w:r>
-            <w:proofErr w:type="gramStart"/>
-            <w:r>
-              <w:rPr>
-                <w:color w:val="5B9BD5" w:themeColor="accent5"/>
-              </w:rPr>
-              <w:t>].improve</w:t>
-            </w:r>
-            <w:proofErr w:type="gramEnd"/>
-            <w:r>
-              <w:rPr>
-                <w:color w:val="5B9BD5" w:themeColor="accent5"/>
-              </w:rPr>
-              <w:t xml:space="preserve"> }}</w:t>
+              <w:t>[9].improve }}</w:t>
             </w:r>
           </w:p>
         </w:tc>
@@ -7500,7 +5484,6 @@
                 <w:color w:val="000000" w:themeColor="text1"/>
               </w:rPr>
             </w:pPr>
-            <w:proofErr w:type="gramStart"/>
             <w:r>
               <w:rPr>
                 <w:color w:val="000000" w:themeColor="text1"/>
@@ -7512,49 +5495,14 @@
               <w:rPr>
                 <w:color w:val="000000" w:themeColor="text1"/>
               </w:rPr>
-              <w:t>qr</w:t>
-            </w:r>
-            <w:proofErr w:type="gramEnd"/>
+              <w:t>qr.concepts</w:t>
+            </w:r>
+            <w:proofErr w:type="spellEnd"/>
             <w:r>
               <w:rPr>
                 <w:color w:val="000000" w:themeColor="text1"/>
               </w:rPr>
-              <w:t>.</w:t>
-            </w:r>
-            <w:proofErr w:type="gramStart"/>
-            <w:r>
-              <w:rPr>
-                <w:color w:val="000000" w:themeColor="text1"/>
-              </w:rPr>
-              <w:t>concepts</w:t>
-            </w:r>
-            <w:proofErr w:type="spellEnd"/>
-            <w:r>
-              <w:rPr>
-                <w:color w:val="000000" w:themeColor="text1"/>
-              </w:rPr>
-              <w:t>[</w:t>
-            </w:r>
-            <w:proofErr w:type="gramEnd"/>
-            <w:r>
-              <w:rPr>
-                <w:color w:val="000000" w:themeColor="text1"/>
-              </w:rPr>
-              <w:t>10</w:t>
-            </w:r>
-            <w:proofErr w:type="gramStart"/>
-            <w:r>
-              <w:rPr>
-                <w:color w:val="000000" w:themeColor="text1"/>
-              </w:rPr>
-              <w:t>].questions</w:t>
-            </w:r>
-            <w:proofErr w:type="gramEnd"/>
-            <w:r>
-              <w:rPr>
-                <w:color w:val="000000" w:themeColor="text1"/>
-              </w:rPr>
-              <w:t xml:space="preserve"> }}</w:t>
+              <w:t>[10].questions }}</w:t>
             </w:r>
           </w:p>
         </w:tc>
@@ -7581,7 +5529,6 @@
                 <w:color w:val="5B9BD5" w:themeColor="accent5"/>
               </w:rPr>
             </w:pPr>
-            <w:proofErr w:type="gramStart"/>
             <w:r>
               <w:rPr>
                 <w:color w:val="5B9BD5" w:themeColor="accent5"/>
@@ -7593,56 +5540,21 @@
               <w:rPr>
                 <w:color w:val="5B9BD5" w:themeColor="accent5"/>
               </w:rPr>
-              <w:t>qr</w:t>
-            </w:r>
-            <w:proofErr w:type="gramEnd"/>
-            <w:r>
-              <w:rPr>
-                <w:color w:val="5B9BD5" w:themeColor="accent5"/>
-              </w:rPr>
-              <w:t>.</w:t>
-            </w:r>
-            <w:proofErr w:type="gramStart"/>
-            <w:r>
-              <w:rPr>
-                <w:color w:val="5B9BD5" w:themeColor="accent5"/>
-              </w:rPr>
-              <w:t>concepts</w:t>
+              <w:t>qr.concepts</w:t>
             </w:r>
             <w:proofErr w:type="spellEnd"/>
             <w:r>
               <w:rPr>
                 <w:color w:val="5B9BD5" w:themeColor="accent5"/>
               </w:rPr>
-              <w:t>[</w:t>
-            </w:r>
-            <w:proofErr w:type="gramEnd"/>
-            <w:r>
-              <w:rPr>
-                <w:color w:val="5B9BD5" w:themeColor="accent5"/>
-              </w:rPr>
-              <w:t>10</w:t>
-            </w:r>
-            <w:proofErr w:type="gramStart"/>
-            <w:r>
-              <w:rPr>
-                <w:color w:val="5B9BD5" w:themeColor="accent5"/>
-              </w:rPr>
-              <w:t>].</w:t>
+              <w:t>[10].</w:t>
             </w:r>
             <w:proofErr w:type="spellStart"/>
             <w:r>
               <w:rPr>
                 <w:color w:val="5B9BD5" w:themeColor="accent5"/>
               </w:rPr>
-              <w:t>done</w:t>
-            </w:r>
-            <w:proofErr w:type="gramEnd"/>
-            <w:r>
-              <w:rPr>
-                <w:color w:val="5B9BD5" w:themeColor="accent5"/>
-              </w:rPr>
-              <w:t>_well</w:t>
+              <w:t>done_well</w:t>
             </w:r>
             <w:proofErr w:type="spellEnd"/>
             <w:r>
@@ -7676,7 +5588,6 @@
                 <w:color w:val="5B9BD5" w:themeColor="accent5"/>
               </w:rPr>
             </w:pPr>
-            <w:proofErr w:type="gramStart"/>
             <w:r>
               <w:rPr>
                 <w:color w:val="5B9BD5" w:themeColor="accent5"/>
@@ -7688,49 +5599,14 @@
               <w:rPr>
                 <w:color w:val="5B9BD5" w:themeColor="accent5"/>
               </w:rPr>
-              <w:t>qr</w:t>
-            </w:r>
-            <w:proofErr w:type="gramEnd"/>
-            <w:r>
-              <w:rPr>
-                <w:color w:val="5B9BD5" w:themeColor="accent5"/>
-              </w:rPr>
-              <w:t>.</w:t>
-            </w:r>
-            <w:proofErr w:type="gramStart"/>
-            <w:r>
-              <w:rPr>
-                <w:color w:val="5B9BD5" w:themeColor="accent5"/>
-              </w:rPr>
-              <w:t>concepts</w:t>
+              <w:t>qr.concepts</w:t>
             </w:r>
             <w:proofErr w:type="spellEnd"/>
             <w:r>
               <w:rPr>
                 <w:color w:val="5B9BD5" w:themeColor="accent5"/>
               </w:rPr>
-              <w:t>[</w:t>
-            </w:r>
-            <w:proofErr w:type="gramEnd"/>
-            <w:r>
-              <w:rPr>
-                <w:color w:val="5B9BD5" w:themeColor="accent5"/>
-              </w:rPr>
-              <w:t>10</w:t>
-            </w:r>
-            <w:proofErr w:type="gramStart"/>
-            <w:r>
-              <w:rPr>
-                <w:color w:val="5B9BD5" w:themeColor="accent5"/>
-              </w:rPr>
-              <w:t>].improve</w:t>
-            </w:r>
-            <w:proofErr w:type="gramEnd"/>
-            <w:r>
-              <w:rPr>
-                <w:color w:val="5B9BD5" w:themeColor="accent5"/>
-              </w:rPr>
-              <w:t xml:space="preserve"> }}</w:t>
+              <w:t>[10].improve }}</w:t>
             </w:r>
           </w:p>
         </w:tc>
@@ -8056,21 +5932,7 @@
         <w:rPr>
           <w:color w:val="000000"/>
         </w:rPr>
-        <w:t xml:space="preserve">Keep track of patterns you </w:t>
-      </w:r>
-      <w:proofErr w:type="gramStart"/>
-      <w:r>
-        <w:rPr>
-          <w:color w:val="000000"/>
-        </w:rPr>
-        <w:t>weren’t able to</w:t>
-      </w:r>
-      <w:proofErr w:type="gramEnd"/>
-      <w:r>
-        <w:rPr>
-          <w:color w:val="000000"/>
-        </w:rPr>
-        <w:t xml:space="preserve"> figure out by yourself -&gt; Write them down and look through them regularly to keep familiar with these patterns</w:t>
+        <w:t>Keep track of patterns you weren’t able to figure out by yourself -&gt; Write them down and look through them regularly to keep familiar with these patterns</w:t>
       </w:r>
     </w:p>
     <w:p>
@@ -8223,23 +6085,7 @@
         <w:t xml:space="preserve">Leaving Questions Blank: </w:t>
       </w:r>
       <w:r>
-        <w:t xml:space="preserve">Students are leaving a lot of marks on the table by not attempting </w:t>
-      </w:r>
-      <w:proofErr w:type="gramStart"/>
-      <w:r>
-        <w:t>all of</w:t>
-      </w:r>
-      <w:proofErr w:type="gramEnd"/>
-      <w:r>
-        <w:t xml:space="preserve"> the questions. Even if they don’t have enough time to </w:t>
-      </w:r>
-      <w:proofErr w:type="gramStart"/>
-      <w:r>
-        <w:t>actually attempt</w:t>
-      </w:r>
-      <w:proofErr w:type="gramEnd"/>
-      <w:r>
-        <w:t xml:space="preserve"> each question, as soon as they hear that there is 1 minute left, they should guess the questions they didn’t finish, so they at least have a 25% chance of getting it right.</w:t>
+        <w:t>Students are leaving a lot of marks on the table by not attempting all of the questions. Even if they don’t have enough time to actually attempt each question, as soon as they hear that there is 1 minute left, they should guess the questions they didn’t finish, so they at least have a 25% chance of getting it right.</w:t>
       </w:r>
     </w:p>
     <w:p>
@@ -8262,15 +6108,7 @@
         <w:t xml:space="preserve">Spending too long on Questions: </w:t>
       </w:r>
       <w:r>
-        <w:t xml:space="preserve">Students usually have 1 minute or less per question type, they should keep a mental clock on their head so when they are spending too long on a question, they should either guess it or make a note of it to come back to it later and move on. They do not have enough time to thoroughly finish every question. </w:t>
-      </w:r>
-      <w:proofErr w:type="gramStart"/>
-      <w:r>
-        <w:t>It is clear that students</w:t>
-      </w:r>
-      <w:proofErr w:type="gramEnd"/>
-      <w:r>
-        <w:t xml:space="preserve"> need more practice under timed conditions so that they develop the mental timing.</w:t>
+        <w:t>Students usually have 1 minute or less per question type, they should keep a mental clock on their head so when they are spending too long on a question, they should either guess it or make a note of it to come back to it later and move on. They do not have enough time to thoroughly finish every question. It is clear that students need more practice under timed conditions so that they develop the mental timing.</w:t>
       </w:r>
     </w:p>
     <w:p>
@@ -8486,15 +6324,7 @@
         <w:t>Review and Practice</w:t>
       </w:r>
       <w:r>
-        <w:t xml:space="preserve">: Go through the areas marked for improvement in this </w:t>
-      </w:r>
-      <w:proofErr w:type="gramStart"/>
-      <w:r>
-        <w:t>report, and</w:t>
-      </w:r>
-      <w:proofErr w:type="gramEnd"/>
-      <w:r>
-        <w:t xml:space="preserve"> review the related topics. We will provide additional exercises and homework focused on these areas in the coming weeks.</w:t>
+        <w:t>: Go through the areas marked for improvement in this report, and review the related topics. We will provide additional exercises and homework focused on these areas in the coming weeks.</w:t>
       </w:r>
     </w:p>
     <w:p>
@@ -8562,15 +6392,7 @@
         </w:r>
       </w:hyperlink>
       <w:r>
-        <w:t xml:space="preserve">. The platform gives instant feedback, tracks </w:t>
-      </w:r>
-      <w:proofErr w:type="gramStart"/>
-      <w:r>
-        <w:t>progress, and</w:t>
-      </w:r>
-      <w:proofErr w:type="gramEnd"/>
-      <w:r>
-        <w:t xml:space="preserve"> covers a wide range of GATE-style questions. </w:t>
+        <w:t xml:space="preserve">. The platform gives instant feedback, tracks progress, and covers a wide range of GATE-style questions. </w:t>
       </w:r>
       <w:r>
         <w:lastRenderedPageBreak/>
@@ -8612,26 +6434,11 @@
         <w:t>mock</w:t>
       </w:r>
       <w:r>
-        <w:t xml:space="preserve"> exam, and there is still of time before the real ASET: under 3 months for Year 5s, and 14 months for Year 4s. Even if your child didn’t score as hoped, it’s not too late. With the right guidance and effort, they can absolutely work towards </w:t>
-      </w:r>
-      <w:proofErr w:type="gramStart"/>
-      <w:r>
-        <w:t>gaining entry into</w:t>
-      </w:r>
-      <w:proofErr w:type="gramEnd"/>
-      <w:r>
-        <w:t xml:space="preserve"> top GATE schools.</w:t>
+        <w:t xml:space="preserve"> exam, and there is still of time before the real ASET: under 3 months for Year 5s, and 14 months for Year 4s. Even if your child didn’t score as hoped, it’s not too late. With the right guidance and effort, they can absolutely work towards gaining entry into top GATE schools.</w:t>
       </w:r>
     </w:p>
     <w:p/>
     <w:p>
-      <w:pPr>
-        <w:rPr>
-          <w:b/>
-          <w:bCs/>
-          <w:u w:val="single"/>
-        </w:rPr>
-      </w:pPr>
       <w:r>
         <w:rPr>
           <w:b/>
@@ -8647,7 +6454,7 @@
           <w:highlight w:val="yellow"/>
           <w:u w:val="single"/>
         </w:rPr>
-        <w:t>January for the GATE HOLIDAY MASTERCLASS</w:t>
+        <w:t>April for our Weekly Classes in Term 1</w:t>
       </w:r>
       <w:r>
         <w:rPr>
@@ -8664,7 +6471,7 @@
           <w:highlight w:val="yellow"/>
           <w:u w:val="single"/>
         </w:rPr>
-        <w:t>19th - 25th Jan &amp; 27th Jan - Feb 1st</w:t>
+        <w:t>20 Apr to 26th April</w:t>
       </w:r>
       <w:r>
         <w:rPr>
@@ -8672,17 +6479,17 @@
           <w:bCs/>
           <w:u w:val="single"/>
         </w:rPr>
-        <w:t xml:space="preserve">. We also have weekly classes from </w:t>
-      </w:r>
-      <w:r>
+        <w:t>. Year 4&amp;5s will continue with weekly classes. If you’d like your child to continue, please let us know at your earliest convenience so we can confirm their place. We’re looking forward to supporting them this year.</w:t>
+      </w:r>
+    </w:p>
+    <w:p>
+      <w:pPr>
         <w:rPr>
           <w:b/>
           <w:bCs/>
           <w:u w:val="single"/>
         </w:rPr>
-        <w:br/>
-        <w:t>Term 1 2026 from the week of Feb 2nd - Feb 8th. If you’d like your child to continue, please let us know at your earliest convenience so we can confirm their place. We’re looking forward to supporting them next year.</w:t>
-      </w:r>
+      </w:pPr>
     </w:p>
     <w:p>
       <w:pPr>
@@ -8721,38 +6528,16 @@
       </w:pPr>
     </w:p>
     <w:p>
-      <w:pPr>
-        <w:rPr>
-          <w:b/>
-          <w:bCs/>
-          <w:u w:val="single"/>
-        </w:rPr>
-      </w:pPr>
-    </w:p>
-    <w:p>
-      <w:proofErr w:type="gramStart"/>
       <w:r>
         <w:t xml:space="preserve">{{ </w:t>
       </w:r>
       <w:proofErr w:type="spellStart"/>
       <w:r>
-        <w:t>graph</w:t>
-      </w:r>
-      <w:proofErr w:type="gramEnd"/>
-      <w:r>
-        <w:t>_</w:t>
-      </w:r>
-      <w:proofErr w:type="gramStart"/>
-      <w:r>
-        <w:t>image</w:t>
+        <w:t>graph_image</w:t>
       </w:r>
       <w:proofErr w:type="spellEnd"/>
       <w:r>
-        <w:t xml:space="preserve"> }</w:t>
-      </w:r>
-      <w:proofErr w:type="gramEnd"/>
-      <w:r>
-        <w:t>}</w:t>
+        <w:t xml:space="preserve"> }}</w:t>
       </w:r>
     </w:p>
     <w:sectPr>

</xml_diff>

<commit_message>
small fix - name misspelt
</commit_message>
<xml_diff>
--- a/config/report_template.docx
+++ b/config/report_template.docx
@@ -16,6 +16,7 @@
         </w:rPr>
         <w:t xml:space="preserve">ASET Performance Report for </w:t>
       </w:r>
+      <w:proofErr w:type="gramStart"/>
       <w:r>
         <w:rPr>
           <w:b/>
@@ -31,16 +32,43 @@
           <w:bCs/>
           <w:color w:val="5B9BD5" w:themeColor="accent5"/>
         </w:rPr>
-        <w:t>student_name</w:t>
-      </w:r>
-      <w:proofErr w:type="spellEnd"/>
+        <w:t>student</w:t>
+      </w:r>
+      <w:proofErr w:type="gramEnd"/>
       <w:r>
         <w:rPr>
           <w:b/>
           <w:bCs/>
           <w:color w:val="5B9BD5" w:themeColor="accent5"/>
         </w:rPr>
-        <w:t xml:space="preserve"> }}</w:t>
+        <w:t>_</w:t>
+      </w:r>
+      <w:proofErr w:type="gramStart"/>
+      <w:r>
+        <w:rPr>
+          <w:b/>
+          <w:bCs/>
+          <w:color w:val="5B9BD5" w:themeColor="accent5"/>
+        </w:rPr>
+        <w:t>name</w:t>
+      </w:r>
+      <w:proofErr w:type="spellEnd"/>
+      <w:r>
+        <w:rPr>
+          <w:b/>
+          <w:bCs/>
+          <w:color w:val="5B9BD5" w:themeColor="accent5"/>
+        </w:rPr>
+        <w:t xml:space="preserve"> }</w:t>
+      </w:r>
+      <w:proofErr w:type="gramEnd"/>
+      <w:r>
+        <w:rPr>
+          <w:b/>
+          <w:bCs/>
+          <w:color w:val="5B9BD5" w:themeColor="accent5"/>
+        </w:rPr>
+        <w:t>}</w:t>
       </w:r>
     </w:p>
     <w:p>
@@ -997,7 +1025,21 @@
         <w:rPr>
           <w:color w:val="000000"/>
         </w:rPr>
-        <w:t>Your child’s Total Standard Score (TSS) which is the sum total of the four individual standard scores.</w:t>
+        <w:t xml:space="preserve">Your child’s Total Standard Score (TSS) which is the </w:t>
+      </w:r>
+      <w:proofErr w:type="gramStart"/>
+      <w:r>
+        <w:rPr>
+          <w:color w:val="000000"/>
+        </w:rPr>
+        <w:t>sum total</w:t>
+      </w:r>
+      <w:proofErr w:type="gramEnd"/>
+      <w:r>
+        <w:rPr>
+          <w:color w:val="000000"/>
+        </w:rPr>
+        <w:t xml:space="preserve"> of the four individual standard scores.</w:t>
       </w:r>
     </w:p>
     <w:p/>
@@ -1109,12 +1151,17 @@
             <w:tcW w:w="2682" w:type="dxa"/>
           </w:tcPr>
           <w:p>
+            <w:proofErr w:type="gramStart"/>
             <w:r>
               <w:t xml:space="preserve">{{ </w:t>
             </w:r>
             <w:proofErr w:type="spellStart"/>
             <w:r>
-              <w:t>reading_score</w:t>
+              <w:t>reading</w:t>
+            </w:r>
+            <w:proofErr w:type="gramEnd"/>
+            <w:r>
+              <w:t>_score</w:t>
             </w:r>
             <w:proofErr w:type="spellEnd"/>
             <w:r>
@@ -1162,12 +1209,17 @@
             <w:tcW w:w="2682" w:type="dxa"/>
           </w:tcPr>
           <w:p>
+            <w:proofErr w:type="gramStart"/>
             <w:r>
               <w:t xml:space="preserve">{{ </w:t>
             </w:r>
             <w:proofErr w:type="spellStart"/>
             <w:r>
-              <w:t>writing_score</w:t>
+              <w:t>writing</w:t>
+            </w:r>
+            <w:proofErr w:type="gramEnd"/>
+            <w:r>
+              <w:t>_score</w:t>
             </w:r>
             <w:proofErr w:type="spellEnd"/>
             <w:r>
@@ -1215,12 +1267,17 @@
             <w:tcW w:w="2682" w:type="dxa"/>
           </w:tcPr>
           <w:p>
+            <w:proofErr w:type="gramStart"/>
             <w:r>
               <w:t xml:space="preserve">{{ </w:t>
             </w:r>
             <w:proofErr w:type="spellStart"/>
             <w:r>
-              <w:t>qr_score</w:t>
+              <w:t>qr</w:t>
+            </w:r>
+            <w:proofErr w:type="gramEnd"/>
+            <w:r>
+              <w:t>_score</w:t>
             </w:r>
             <w:proofErr w:type="spellEnd"/>
             <w:r>
@@ -1268,12 +1325,17 @@
             <w:tcW w:w="2682" w:type="dxa"/>
           </w:tcPr>
           <w:p>
+            <w:proofErr w:type="gramStart"/>
             <w:r>
               <w:t xml:space="preserve">{{ </w:t>
             </w:r>
             <w:proofErr w:type="spellStart"/>
             <w:r>
-              <w:t>ar_score</w:t>
+              <w:t>ar</w:t>
+            </w:r>
+            <w:proofErr w:type="gramEnd"/>
+            <w:r>
+              <w:t>_score</w:t>
             </w:r>
             <w:proofErr w:type="spellEnd"/>
             <w:r>
@@ -1327,6 +1389,7 @@
                 <w:bCs/>
               </w:rPr>
             </w:pPr>
+            <w:proofErr w:type="gramStart"/>
             <w:r>
               <w:rPr>
                 <w:b/>
@@ -1342,7 +1405,16 @@
                 <w:bCs/>
                 <w:color w:val="5B9BD5" w:themeColor="accent5"/>
               </w:rPr>
-              <w:t>total_score</w:t>
+              <w:t>total</w:t>
+            </w:r>
+            <w:proofErr w:type="gramEnd"/>
+            <w:r>
+              <w:rPr>
+                <w:b/>
+                <w:bCs/>
+                <w:color w:val="5B9BD5" w:themeColor="accent5"/>
+              </w:rPr>
+              <w:t>_score</w:t>
             </w:r>
             <w:proofErr w:type="spellEnd"/>
             <w:r>
@@ -2012,6 +2084,7 @@
                 <w:color w:val="000000" w:themeColor="text1"/>
               </w:rPr>
             </w:pPr>
+            <w:proofErr w:type="gramStart"/>
             <w:r>
               <w:rPr>
                 <w:color w:val="000000" w:themeColor="text1"/>
@@ -2023,14 +2096,49 @@
               <w:rPr>
                 <w:color w:val="000000" w:themeColor="text1"/>
               </w:rPr>
-              <w:t>rc.concepts</w:t>
+              <w:t>rc</w:t>
+            </w:r>
+            <w:proofErr w:type="gramEnd"/>
+            <w:r>
+              <w:rPr>
+                <w:color w:val="000000" w:themeColor="text1"/>
+              </w:rPr>
+              <w:t>.</w:t>
+            </w:r>
+            <w:proofErr w:type="gramStart"/>
+            <w:r>
+              <w:rPr>
+                <w:color w:val="000000" w:themeColor="text1"/>
+              </w:rPr>
+              <w:t>concepts</w:t>
             </w:r>
             <w:proofErr w:type="spellEnd"/>
             <w:r>
               <w:rPr>
                 <w:color w:val="000000" w:themeColor="text1"/>
               </w:rPr>
-              <w:t>[0].questions }}</w:t>
+              <w:t>[</w:t>
+            </w:r>
+            <w:proofErr w:type="gramEnd"/>
+            <w:r>
+              <w:rPr>
+                <w:color w:val="000000" w:themeColor="text1"/>
+              </w:rPr>
+              <w:t>0</w:t>
+            </w:r>
+            <w:proofErr w:type="gramStart"/>
+            <w:r>
+              <w:rPr>
+                <w:color w:val="000000" w:themeColor="text1"/>
+              </w:rPr>
+              <w:t>].questions</w:t>
+            </w:r>
+            <w:proofErr w:type="gramEnd"/>
+            <w:r>
+              <w:rPr>
+                <w:color w:val="000000" w:themeColor="text1"/>
+              </w:rPr>
+              <w:t xml:space="preserve"> }}</w:t>
             </w:r>
           </w:p>
         </w:tc>
@@ -2057,6 +2165,7 @@
                 <w:color w:val="5B9BD5" w:themeColor="accent5"/>
               </w:rPr>
             </w:pPr>
+            <w:proofErr w:type="gramStart"/>
             <w:r>
               <w:rPr>
                 <w:color w:val="5B9BD5" w:themeColor="accent5"/>
@@ -2068,21 +2177,56 @@
               <w:rPr>
                 <w:color w:val="5B9BD5" w:themeColor="accent5"/>
               </w:rPr>
-              <w:t>rc.concepts</w:t>
+              <w:t>rc</w:t>
+            </w:r>
+            <w:proofErr w:type="gramEnd"/>
+            <w:r>
+              <w:rPr>
+                <w:color w:val="5B9BD5" w:themeColor="accent5"/>
+              </w:rPr>
+              <w:t>.</w:t>
+            </w:r>
+            <w:proofErr w:type="gramStart"/>
+            <w:r>
+              <w:rPr>
+                <w:color w:val="5B9BD5" w:themeColor="accent5"/>
+              </w:rPr>
+              <w:t>concepts</w:t>
             </w:r>
             <w:proofErr w:type="spellEnd"/>
             <w:r>
               <w:rPr>
                 <w:color w:val="5B9BD5" w:themeColor="accent5"/>
               </w:rPr>
-              <w:t>[0].</w:t>
+              <w:t>[</w:t>
+            </w:r>
+            <w:proofErr w:type="gramEnd"/>
+            <w:r>
+              <w:rPr>
+                <w:color w:val="5B9BD5" w:themeColor="accent5"/>
+              </w:rPr>
+              <w:t>0</w:t>
+            </w:r>
+            <w:proofErr w:type="gramStart"/>
+            <w:r>
+              <w:rPr>
+                <w:color w:val="5B9BD5" w:themeColor="accent5"/>
+              </w:rPr>
+              <w:t>].</w:t>
             </w:r>
             <w:proofErr w:type="spellStart"/>
             <w:r>
               <w:rPr>
                 <w:color w:val="5B9BD5" w:themeColor="accent5"/>
               </w:rPr>
-              <w:t>done_well</w:t>
+              <w:t>done</w:t>
+            </w:r>
+            <w:proofErr w:type="gramEnd"/>
+            <w:r>
+              <w:rPr>
+                <w:color w:val="5B9BD5" w:themeColor="accent5"/>
+              </w:rPr>
+              <w:t>_well</w:t>
             </w:r>
             <w:proofErr w:type="spellEnd"/>
             <w:r>
@@ -2116,6 +2260,7 @@
                 <w:color w:val="5B9BD5" w:themeColor="accent5"/>
               </w:rPr>
             </w:pPr>
+            <w:proofErr w:type="gramStart"/>
             <w:r>
               <w:rPr>
                 <w:color w:val="5B9BD5" w:themeColor="accent5"/>
@@ -2127,14 +2272,49 @@
               <w:rPr>
                 <w:color w:val="5B9BD5" w:themeColor="accent5"/>
               </w:rPr>
-              <w:t>rc.concepts</w:t>
+              <w:t>rc</w:t>
+            </w:r>
+            <w:proofErr w:type="gramEnd"/>
+            <w:r>
+              <w:rPr>
+                <w:color w:val="5B9BD5" w:themeColor="accent5"/>
+              </w:rPr>
+              <w:t>.</w:t>
+            </w:r>
+            <w:proofErr w:type="gramStart"/>
+            <w:r>
+              <w:rPr>
+                <w:color w:val="5B9BD5" w:themeColor="accent5"/>
+              </w:rPr>
+              <w:t>concepts</w:t>
             </w:r>
             <w:proofErr w:type="spellEnd"/>
             <w:r>
               <w:rPr>
                 <w:color w:val="5B9BD5" w:themeColor="accent5"/>
               </w:rPr>
-              <w:t>[0].improve }}</w:t>
+              <w:t>[</w:t>
+            </w:r>
+            <w:proofErr w:type="gramEnd"/>
+            <w:r>
+              <w:rPr>
+                <w:color w:val="5B9BD5" w:themeColor="accent5"/>
+              </w:rPr>
+              <w:t>0</w:t>
+            </w:r>
+            <w:proofErr w:type="gramStart"/>
+            <w:r>
+              <w:rPr>
+                <w:color w:val="5B9BD5" w:themeColor="accent5"/>
+              </w:rPr>
+              <w:t>].improve</w:t>
+            </w:r>
+            <w:proofErr w:type="gramEnd"/>
+            <w:r>
+              <w:rPr>
+                <w:color w:val="5B9BD5" w:themeColor="accent5"/>
+              </w:rPr>
+              <w:t xml:space="preserve"> }}</w:t>
             </w:r>
           </w:p>
         </w:tc>
@@ -2188,6 +2368,7 @@
                 <w:color w:val="000000" w:themeColor="text1"/>
               </w:rPr>
             </w:pPr>
+            <w:proofErr w:type="gramStart"/>
             <w:r>
               <w:rPr>
                 <w:color w:val="000000" w:themeColor="text1"/>
@@ -2199,14 +2380,49 @@
               <w:rPr>
                 <w:color w:val="000000" w:themeColor="text1"/>
               </w:rPr>
-              <w:t>rc.concepts</w:t>
+              <w:t>rc</w:t>
+            </w:r>
+            <w:proofErr w:type="gramEnd"/>
+            <w:r>
+              <w:rPr>
+                <w:color w:val="000000" w:themeColor="text1"/>
+              </w:rPr>
+              <w:t>.</w:t>
+            </w:r>
+            <w:proofErr w:type="gramStart"/>
+            <w:r>
+              <w:rPr>
+                <w:color w:val="000000" w:themeColor="text1"/>
+              </w:rPr>
+              <w:t>concepts</w:t>
             </w:r>
             <w:proofErr w:type="spellEnd"/>
             <w:r>
               <w:rPr>
                 <w:color w:val="000000" w:themeColor="text1"/>
               </w:rPr>
-              <w:t>[1].questions }}</w:t>
+              <w:t>[</w:t>
+            </w:r>
+            <w:proofErr w:type="gramEnd"/>
+            <w:r>
+              <w:rPr>
+                <w:color w:val="000000" w:themeColor="text1"/>
+              </w:rPr>
+              <w:t>1</w:t>
+            </w:r>
+            <w:proofErr w:type="gramStart"/>
+            <w:r>
+              <w:rPr>
+                <w:color w:val="000000" w:themeColor="text1"/>
+              </w:rPr>
+              <w:t>].questions</w:t>
+            </w:r>
+            <w:proofErr w:type="gramEnd"/>
+            <w:r>
+              <w:rPr>
+                <w:color w:val="000000" w:themeColor="text1"/>
+              </w:rPr>
+              <w:t xml:space="preserve"> }}</w:t>
             </w:r>
           </w:p>
         </w:tc>
@@ -2233,6 +2449,7 @@
                 <w:color w:val="5B9BD5" w:themeColor="accent5"/>
               </w:rPr>
             </w:pPr>
+            <w:proofErr w:type="gramStart"/>
             <w:r>
               <w:rPr>
                 <w:color w:val="5B9BD5" w:themeColor="accent5"/>
@@ -2244,21 +2461,56 @@
               <w:rPr>
                 <w:color w:val="5B9BD5" w:themeColor="accent5"/>
               </w:rPr>
-              <w:t>rc.concepts</w:t>
+              <w:t>rc</w:t>
+            </w:r>
+            <w:proofErr w:type="gramEnd"/>
+            <w:r>
+              <w:rPr>
+                <w:color w:val="5B9BD5" w:themeColor="accent5"/>
+              </w:rPr>
+              <w:t>.</w:t>
+            </w:r>
+            <w:proofErr w:type="gramStart"/>
+            <w:r>
+              <w:rPr>
+                <w:color w:val="5B9BD5" w:themeColor="accent5"/>
+              </w:rPr>
+              <w:t>concepts</w:t>
             </w:r>
             <w:proofErr w:type="spellEnd"/>
             <w:r>
               <w:rPr>
                 <w:color w:val="5B9BD5" w:themeColor="accent5"/>
               </w:rPr>
-              <w:t>[1].</w:t>
+              <w:t>[</w:t>
+            </w:r>
+            <w:proofErr w:type="gramEnd"/>
+            <w:r>
+              <w:rPr>
+                <w:color w:val="5B9BD5" w:themeColor="accent5"/>
+              </w:rPr>
+              <w:t>1</w:t>
+            </w:r>
+            <w:proofErr w:type="gramStart"/>
+            <w:r>
+              <w:rPr>
+                <w:color w:val="5B9BD5" w:themeColor="accent5"/>
+              </w:rPr>
+              <w:t>].</w:t>
             </w:r>
             <w:proofErr w:type="spellStart"/>
             <w:r>
               <w:rPr>
                 <w:color w:val="5B9BD5" w:themeColor="accent5"/>
               </w:rPr>
-              <w:t>done_well</w:t>
+              <w:t>done</w:t>
+            </w:r>
+            <w:proofErr w:type="gramEnd"/>
+            <w:r>
+              <w:rPr>
+                <w:color w:val="5B9BD5" w:themeColor="accent5"/>
+              </w:rPr>
+              <w:t>_well</w:t>
             </w:r>
             <w:proofErr w:type="spellEnd"/>
             <w:r>
@@ -2292,6 +2544,7 @@
                 <w:color w:val="5B9BD5" w:themeColor="accent5"/>
               </w:rPr>
             </w:pPr>
+            <w:proofErr w:type="gramStart"/>
             <w:r>
               <w:rPr>
                 <w:color w:val="5B9BD5" w:themeColor="accent5"/>
@@ -2303,14 +2556,49 @@
               <w:rPr>
                 <w:color w:val="5B9BD5" w:themeColor="accent5"/>
               </w:rPr>
-              <w:t>rc.concepts</w:t>
+              <w:t>rc</w:t>
+            </w:r>
+            <w:proofErr w:type="gramEnd"/>
+            <w:r>
+              <w:rPr>
+                <w:color w:val="5B9BD5" w:themeColor="accent5"/>
+              </w:rPr>
+              <w:t>.</w:t>
+            </w:r>
+            <w:proofErr w:type="gramStart"/>
+            <w:r>
+              <w:rPr>
+                <w:color w:val="5B9BD5" w:themeColor="accent5"/>
+              </w:rPr>
+              <w:t>concepts</w:t>
             </w:r>
             <w:proofErr w:type="spellEnd"/>
             <w:r>
               <w:rPr>
                 <w:color w:val="5B9BD5" w:themeColor="accent5"/>
               </w:rPr>
-              <w:t>[1].improve }}</w:t>
+              <w:t>[</w:t>
+            </w:r>
+            <w:proofErr w:type="gramEnd"/>
+            <w:r>
+              <w:rPr>
+                <w:color w:val="5B9BD5" w:themeColor="accent5"/>
+              </w:rPr>
+              <w:t>1</w:t>
+            </w:r>
+            <w:proofErr w:type="gramStart"/>
+            <w:r>
+              <w:rPr>
+                <w:color w:val="5B9BD5" w:themeColor="accent5"/>
+              </w:rPr>
+              <w:t>].improve</w:t>
+            </w:r>
+            <w:proofErr w:type="gramEnd"/>
+            <w:r>
+              <w:rPr>
+                <w:color w:val="5B9BD5" w:themeColor="accent5"/>
+              </w:rPr>
+              <w:t xml:space="preserve"> }}</w:t>
             </w:r>
           </w:p>
         </w:tc>
@@ -2364,6 +2652,7 @@
                 <w:color w:val="000000" w:themeColor="text1"/>
               </w:rPr>
             </w:pPr>
+            <w:proofErr w:type="gramStart"/>
             <w:r>
               <w:rPr>
                 <w:color w:val="000000" w:themeColor="text1"/>
@@ -2375,14 +2664,49 @@
               <w:rPr>
                 <w:color w:val="000000" w:themeColor="text1"/>
               </w:rPr>
-              <w:t>rc.concepts</w:t>
+              <w:t>rc</w:t>
+            </w:r>
+            <w:proofErr w:type="gramEnd"/>
+            <w:r>
+              <w:rPr>
+                <w:color w:val="000000" w:themeColor="text1"/>
+              </w:rPr>
+              <w:t>.</w:t>
+            </w:r>
+            <w:proofErr w:type="gramStart"/>
+            <w:r>
+              <w:rPr>
+                <w:color w:val="000000" w:themeColor="text1"/>
+              </w:rPr>
+              <w:t>concepts</w:t>
             </w:r>
             <w:proofErr w:type="spellEnd"/>
             <w:r>
               <w:rPr>
                 <w:color w:val="000000" w:themeColor="text1"/>
               </w:rPr>
-              <w:t>[2].questions }}</w:t>
+              <w:t>[</w:t>
+            </w:r>
+            <w:proofErr w:type="gramEnd"/>
+            <w:r>
+              <w:rPr>
+                <w:color w:val="000000" w:themeColor="text1"/>
+              </w:rPr>
+              <w:t>2</w:t>
+            </w:r>
+            <w:proofErr w:type="gramStart"/>
+            <w:r>
+              <w:rPr>
+                <w:color w:val="000000" w:themeColor="text1"/>
+              </w:rPr>
+              <w:t>].questions</w:t>
+            </w:r>
+            <w:proofErr w:type="gramEnd"/>
+            <w:r>
+              <w:rPr>
+                <w:color w:val="000000" w:themeColor="text1"/>
+              </w:rPr>
+              <w:t xml:space="preserve"> }}</w:t>
             </w:r>
           </w:p>
         </w:tc>
@@ -2409,6 +2733,7 @@
                 <w:color w:val="5B9BD5" w:themeColor="accent5"/>
               </w:rPr>
             </w:pPr>
+            <w:proofErr w:type="gramStart"/>
             <w:r>
               <w:rPr>
                 <w:color w:val="5B9BD5" w:themeColor="accent5"/>
@@ -2420,21 +2745,56 @@
               <w:rPr>
                 <w:color w:val="5B9BD5" w:themeColor="accent5"/>
               </w:rPr>
-              <w:t>rc.concepts</w:t>
+              <w:t>rc</w:t>
+            </w:r>
+            <w:proofErr w:type="gramEnd"/>
+            <w:r>
+              <w:rPr>
+                <w:color w:val="5B9BD5" w:themeColor="accent5"/>
+              </w:rPr>
+              <w:t>.</w:t>
+            </w:r>
+            <w:proofErr w:type="gramStart"/>
+            <w:r>
+              <w:rPr>
+                <w:color w:val="5B9BD5" w:themeColor="accent5"/>
+              </w:rPr>
+              <w:t>concepts</w:t>
             </w:r>
             <w:proofErr w:type="spellEnd"/>
             <w:r>
               <w:rPr>
                 <w:color w:val="5B9BD5" w:themeColor="accent5"/>
               </w:rPr>
-              <w:t>[2].</w:t>
+              <w:t>[</w:t>
+            </w:r>
+            <w:proofErr w:type="gramEnd"/>
+            <w:r>
+              <w:rPr>
+                <w:color w:val="5B9BD5" w:themeColor="accent5"/>
+              </w:rPr>
+              <w:t>2</w:t>
+            </w:r>
+            <w:proofErr w:type="gramStart"/>
+            <w:r>
+              <w:rPr>
+                <w:color w:val="5B9BD5" w:themeColor="accent5"/>
+              </w:rPr>
+              <w:t>].</w:t>
             </w:r>
             <w:proofErr w:type="spellStart"/>
             <w:r>
               <w:rPr>
                 <w:color w:val="5B9BD5" w:themeColor="accent5"/>
               </w:rPr>
-              <w:t>done_well</w:t>
+              <w:t>done</w:t>
+            </w:r>
+            <w:proofErr w:type="gramEnd"/>
+            <w:r>
+              <w:rPr>
+                <w:color w:val="5B9BD5" w:themeColor="accent5"/>
+              </w:rPr>
+              <w:t>_well</w:t>
             </w:r>
             <w:proofErr w:type="spellEnd"/>
             <w:r>
@@ -2468,6 +2828,7 @@
                 <w:color w:val="5B9BD5" w:themeColor="accent5"/>
               </w:rPr>
             </w:pPr>
+            <w:proofErr w:type="gramStart"/>
             <w:r>
               <w:rPr>
                 <w:color w:val="5B9BD5" w:themeColor="accent5"/>
@@ -2479,14 +2840,49 @@
               <w:rPr>
                 <w:color w:val="5B9BD5" w:themeColor="accent5"/>
               </w:rPr>
-              <w:t>rc.concepts</w:t>
+              <w:t>rc</w:t>
+            </w:r>
+            <w:proofErr w:type="gramEnd"/>
+            <w:r>
+              <w:rPr>
+                <w:color w:val="5B9BD5" w:themeColor="accent5"/>
+              </w:rPr>
+              <w:t>.</w:t>
+            </w:r>
+            <w:proofErr w:type="gramStart"/>
+            <w:r>
+              <w:rPr>
+                <w:color w:val="5B9BD5" w:themeColor="accent5"/>
+              </w:rPr>
+              <w:t>concepts</w:t>
             </w:r>
             <w:proofErr w:type="spellEnd"/>
             <w:r>
               <w:rPr>
                 <w:color w:val="5B9BD5" w:themeColor="accent5"/>
               </w:rPr>
-              <w:t>[2].improve }}</w:t>
+              <w:t>[</w:t>
+            </w:r>
+            <w:proofErr w:type="gramEnd"/>
+            <w:r>
+              <w:rPr>
+                <w:color w:val="5B9BD5" w:themeColor="accent5"/>
+              </w:rPr>
+              <w:t>2</w:t>
+            </w:r>
+            <w:proofErr w:type="gramStart"/>
+            <w:r>
+              <w:rPr>
+                <w:color w:val="5B9BD5" w:themeColor="accent5"/>
+              </w:rPr>
+              <w:t>].improve</w:t>
+            </w:r>
+            <w:proofErr w:type="gramEnd"/>
+            <w:r>
+              <w:rPr>
+                <w:color w:val="5B9BD5" w:themeColor="accent5"/>
+              </w:rPr>
+              <w:t xml:space="preserve"> }}</w:t>
             </w:r>
           </w:p>
         </w:tc>
@@ -2540,6 +2936,7 @@
                 <w:color w:val="000000" w:themeColor="text1"/>
               </w:rPr>
             </w:pPr>
+            <w:proofErr w:type="gramStart"/>
             <w:r>
               <w:rPr>
                 <w:color w:val="000000" w:themeColor="text1"/>
@@ -2551,14 +2948,49 @@
               <w:rPr>
                 <w:color w:val="000000" w:themeColor="text1"/>
               </w:rPr>
-              <w:t>rc.concepts</w:t>
+              <w:t>rc</w:t>
+            </w:r>
+            <w:proofErr w:type="gramEnd"/>
+            <w:r>
+              <w:rPr>
+                <w:color w:val="000000" w:themeColor="text1"/>
+              </w:rPr>
+              <w:t>.</w:t>
+            </w:r>
+            <w:proofErr w:type="gramStart"/>
+            <w:r>
+              <w:rPr>
+                <w:color w:val="000000" w:themeColor="text1"/>
+              </w:rPr>
+              <w:t>concepts</w:t>
             </w:r>
             <w:proofErr w:type="spellEnd"/>
             <w:r>
               <w:rPr>
                 <w:color w:val="000000" w:themeColor="text1"/>
               </w:rPr>
-              <w:t>[3].questions }}</w:t>
+              <w:t>[</w:t>
+            </w:r>
+            <w:proofErr w:type="gramEnd"/>
+            <w:r>
+              <w:rPr>
+                <w:color w:val="000000" w:themeColor="text1"/>
+              </w:rPr>
+              <w:t>3</w:t>
+            </w:r>
+            <w:proofErr w:type="gramStart"/>
+            <w:r>
+              <w:rPr>
+                <w:color w:val="000000" w:themeColor="text1"/>
+              </w:rPr>
+              <w:t>].questions</w:t>
+            </w:r>
+            <w:proofErr w:type="gramEnd"/>
+            <w:r>
+              <w:rPr>
+                <w:color w:val="000000" w:themeColor="text1"/>
+              </w:rPr>
+              <w:t xml:space="preserve"> }}</w:t>
             </w:r>
           </w:p>
         </w:tc>
@@ -2585,6 +3017,7 @@
                 <w:color w:val="5B9BD5" w:themeColor="accent5"/>
               </w:rPr>
             </w:pPr>
+            <w:proofErr w:type="gramStart"/>
             <w:r>
               <w:rPr>
                 <w:color w:val="5B9BD5" w:themeColor="accent5"/>
@@ -2596,21 +3029,56 @@
               <w:rPr>
                 <w:color w:val="5B9BD5" w:themeColor="accent5"/>
               </w:rPr>
-              <w:t>rc.concepts</w:t>
+              <w:t>rc</w:t>
+            </w:r>
+            <w:proofErr w:type="gramEnd"/>
+            <w:r>
+              <w:rPr>
+                <w:color w:val="5B9BD5" w:themeColor="accent5"/>
+              </w:rPr>
+              <w:t>.</w:t>
+            </w:r>
+            <w:proofErr w:type="gramStart"/>
+            <w:r>
+              <w:rPr>
+                <w:color w:val="5B9BD5" w:themeColor="accent5"/>
+              </w:rPr>
+              <w:t>concepts</w:t>
             </w:r>
             <w:proofErr w:type="spellEnd"/>
             <w:r>
               <w:rPr>
                 <w:color w:val="5B9BD5" w:themeColor="accent5"/>
               </w:rPr>
-              <w:t>[3].</w:t>
+              <w:t>[</w:t>
+            </w:r>
+            <w:proofErr w:type="gramEnd"/>
+            <w:r>
+              <w:rPr>
+                <w:color w:val="5B9BD5" w:themeColor="accent5"/>
+              </w:rPr>
+              <w:t>3</w:t>
+            </w:r>
+            <w:proofErr w:type="gramStart"/>
+            <w:r>
+              <w:rPr>
+                <w:color w:val="5B9BD5" w:themeColor="accent5"/>
+              </w:rPr>
+              <w:t>].</w:t>
             </w:r>
             <w:proofErr w:type="spellStart"/>
             <w:r>
               <w:rPr>
                 <w:color w:val="5B9BD5" w:themeColor="accent5"/>
               </w:rPr>
-              <w:t>done_well</w:t>
+              <w:t>done</w:t>
+            </w:r>
+            <w:proofErr w:type="gramEnd"/>
+            <w:r>
+              <w:rPr>
+                <w:color w:val="5B9BD5" w:themeColor="accent5"/>
+              </w:rPr>
+              <w:t>_well</w:t>
             </w:r>
             <w:proofErr w:type="spellEnd"/>
             <w:r>
@@ -2644,6 +3112,7 @@
                 <w:color w:val="5B9BD5" w:themeColor="accent5"/>
               </w:rPr>
             </w:pPr>
+            <w:proofErr w:type="gramStart"/>
             <w:r>
               <w:rPr>
                 <w:color w:val="5B9BD5" w:themeColor="accent5"/>
@@ -2655,14 +3124,49 @@
               <w:rPr>
                 <w:color w:val="5B9BD5" w:themeColor="accent5"/>
               </w:rPr>
-              <w:t>rc.concepts</w:t>
+              <w:t>rc</w:t>
+            </w:r>
+            <w:proofErr w:type="gramEnd"/>
+            <w:r>
+              <w:rPr>
+                <w:color w:val="5B9BD5" w:themeColor="accent5"/>
+              </w:rPr>
+              <w:t>.</w:t>
+            </w:r>
+            <w:proofErr w:type="gramStart"/>
+            <w:r>
+              <w:rPr>
+                <w:color w:val="5B9BD5" w:themeColor="accent5"/>
+              </w:rPr>
+              <w:t>concepts</w:t>
             </w:r>
             <w:proofErr w:type="spellEnd"/>
             <w:r>
               <w:rPr>
                 <w:color w:val="5B9BD5" w:themeColor="accent5"/>
               </w:rPr>
-              <w:t>[3].improve }}</w:t>
+              <w:t>[</w:t>
+            </w:r>
+            <w:proofErr w:type="gramEnd"/>
+            <w:r>
+              <w:rPr>
+                <w:color w:val="5B9BD5" w:themeColor="accent5"/>
+              </w:rPr>
+              <w:t>3</w:t>
+            </w:r>
+            <w:proofErr w:type="gramStart"/>
+            <w:r>
+              <w:rPr>
+                <w:color w:val="5B9BD5" w:themeColor="accent5"/>
+              </w:rPr>
+              <w:t>].improve</w:t>
+            </w:r>
+            <w:proofErr w:type="gramEnd"/>
+            <w:r>
+              <w:rPr>
+                <w:color w:val="5B9BD5" w:themeColor="accent5"/>
+              </w:rPr>
+              <w:t xml:space="preserve"> }}</w:t>
             </w:r>
           </w:p>
         </w:tc>
@@ -2716,6 +3220,7 @@
                 <w:color w:val="000000" w:themeColor="text1"/>
               </w:rPr>
             </w:pPr>
+            <w:proofErr w:type="gramStart"/>
             <w:r>
               <w:rPr>
                 <w:color w:val="000000" w:themeColor="text1"/>
@@ -2727,14 +3232,49 @@
               <w:rPr>
                 <w:color w:val="000000" w:themeColor="text1"/>
               </w:rPr>
-              <w:t>rc.concepts</w:t>
+              <w:t>rc</w:t>
+            </w:r>
+            <w:proofErr w:type="gramEnd"/>
+            <w:r>
+              <w:rPr>
+                <w:color w:val="000000" w:themeColor="text1"/>
+              </w:rPr>
+              <w:t>.</w:t>
+            </w:r>
+            <w:proofErr w:type="gramStart"/>
+            <w:r>
+              <w:rPr>
+                <w:color w:val="000000" w:themeColor="text1"/>
+              </w:rPr>
+              <w:t>concepts</w:t>
             </w:r>
             <w:proofErr w:type="spellEnd"/>
             <w:r>
               <w:rPr>
                 <w:color w:val="000000" w:themeColor="text1"/>
               </w:rPr>
-              <w:t>[4].questions }}</w:t>
+              <w:t>[</w:t>
+            </w:r>
+            <w:proofErr w:type="gramEnd"/>
+            <w:r>
+              <w:rPr>
+                <w:color w:val="000000" w:themeColor="text1"/>
+              </w:rPr>
+              <w:t>4</w:t>
+            </w:r>
+            <w:proofErr w:type="gramStart"/>
+            <w:r>
+              <w:rPr>
+                <w:color w:val="000000" w:themeColor="text1"/>
+              </w:rPr>
+              <w:t>].questions</w:t>
+            </w:r>
+            <w:proofErr w:type="gramEnd"/>
+            <w:r>
+              <w:rPr>
+                <w:color w:val="000000" w:themeColor="text1"/>
+              </w:rPr>
+              <w:t xml:space="preserve"> }}</w:t>
             </w:r>
           </w:p>
         </w:tc>
@@ -2761,6 +3301,7 @@
                 <w:color w:val="5B9BD5" w:themeColor="accent5"/>
               </w:rPr>
             </w:pPr>
+            <w:proofErr w:type="gramStart"/>
             <w:r>
               <w:rPr>
                 <w:color w:val="5B9BD5" w:themeColor="accent5"/>
@@ -2772,21 +3313,56 @@
               <w:rPr>
                 <w:color w:val="5B9BD5" w:themeColor="accent5"/>
               </w:rPr>
-              <w:t>rc.concepts</w:t>
+              <w:t>rc</w:t>
+            </w:r>
+            <w:proofErr w:type="gramEnd"/>
+            <w:r>
+              <w:rPr>
+                <w:color w:val="5B9BD5" w:themeColor="accent5"/>
+              </w:rPr>
+              <w:t>.</w:t>
+            </w:r>
+            <w:proofErr w:type="gramStart"/>
+            <w:r>
+              <w:rPr>
+                <w:color w:val="5B9BD5" w:themeColor="accent5"/>
+              </w:rPr>
+              <w:t>concepts</w:t>
             </w:r>
             <w:proofErr w:type="spellEnd"/>
             <w:r>
               <w:rPr>
                 <w:color w:val="5B9BD5" w:themeColor="accent5"/>
               </w:rPr>
-              <w:t>[4].</w:t>
+              <w:t>[</w:t>
+            </w:r>
+            <w:proofErr w:type="gramEnd"/>
+            <w:r>
+              <w:rPr>
+                <w:color w:val="5B9BD5" w:themeColor="accent5"/>
+              </w:rPr>
+              <w:t>4</w:t>
+            </w:r>
+            <w:proofErr w:type="gramStart"/>
+            <w:r>
+              <w:rPr>
+                <w:color w:val="5B9BD5" w:themeColor="accent5"/>
+              </w:rPr>
+              <w:t>].</w:t>
             </w:r>
             <w:proofErr w:type="spellStart"/>
             <w:r>
               <w:rPr>
                 <w:color w:val="5B9BD5" w:themeColor="accent5"/>
               </w:rPr>
-              <w:t>done_well</w:t>
+              <w:t>done</w:t>
+            </w:r>
+            <w:proofErr w:type="gramEnd"/>
+            <w:r>
+              <w:rPr>
+                <w:color w:val="5B9BD5" w:themeColor="accent5"/>
+              </w:rPr>
+              <w:t>_well</w:t>
             </w:r>
             <w:proofErr w:type="spellEnd"/>
             <w:r>
@@ -2820,6 +3396,7 @@
                 <w:color w:val="5B9BD5" w:themeColor="accent5"/>
               </w:rPr>
             </w:pPr>
+            <w:proofErr w:type="gramStart"/>
             <w:r>
               <w:rPr>
                 <w:color w:val="5B9BD5" w:themeColor="accent5"/>
@@ -2831,14 +3408,49 @@
               <w:rPr>
                 <w:color w:val="5B9BD5" w:themeColor="accent5"/>
               </w:rPr>
-              <w:t>rc.concepts</w:t>
+              <w:t>rc</w:t>
+            </w:r>
+            <w:proofErr w:type="gramEnd"/>
+            <w:r>
+              <w:rPr>
+                <w:color w:val="5B9BD5" w:themeColor="accent5"/>
+              </w:rPr>
+              <w:t>.</w:t>
+            </w:r>
+            <w:proofErr w:type="gramStart"/>
+            <w:r>
+              <w:rPr>
+                <w:color w:val="5B9BD5" w:themeColor="accent5"/>
+              </w:rPr>
+              <w:t>concepts</w:t>
             </w:r>
             <w:proofErr w:type="spellEnd"/>
             <w:r>
               <w:rPr>
                 <w:color w:val="5B9BD5" w:themeColor="accent5"/>
               </w:rPr>
-              <w:t>[4].improve }}</w:t>
+              <w:t>[</w:t>
+            </w:r>
+            <w:proofErr w:type="gramEnd"/>
+            <w:r>
+              <w:rPr>
+                <w:color w:val="5B9BD5" w:themeColor="accent5"/>
+              </w:rPr>
+              <w:t>4</w:t>
+            </w:r>
+            <w:proofErr w:type="gramStart"/>
+            <w:r>
+              <w:rPr>
+                <w:color w:val="5B9BD5" w:themeColor="accent5"/>
+              </w:rPr>
+              <w:t>].improve</w:t>
+            </w:r>
+            <w:proofErr w:type="gramEnd"/>
+            <w:r>
+              <w:rPr>
+                <w:color w:val="5B9BD5" w:themeColor="accent5"/>
+              </w:rPr>
+              <w:t xml:space="preserve"> }}</w:t>
             </w:r>
           </w:p>
         </w:tc>
@@ -2892,6 +3504,7 @@
                 <w:color w:val="000000" w:themeColor="text1"/>
               </w:rPr>
             </w:pPr>
+            <w:proofErr w:type="gramStart"/>
             <w:r>
               <w:rPr>
                 <w:color w:val="000000" w:themeColor="text1"/>
@@ -2903,14 +3516,49 @@
               <w:rPr>
                 <w:color w:val="000000" w:themeColor="text1"/>
               </w:rPr>
-              <w:t>rc.concepts</w:t>
+              <w:t>rc</w:t>
+            </w:r>
+            <w:proofErr w:type="gramEnd"/>
+            <w:r>
+              <w:rPr>
+                <w:color w:val="000000" w:themeColor="text1"/>
+              </w:rPr>
+              <w:t>.</w:t>
+            </w:r>
+            <w:proofErr w:type="gramStart"/>
+            <w:r>
+              <w:rPr>
+                <w:color w:val="000000" w:themeColor="text1"/>
+              </w:rPr>
+              <w:t>concepts</w:t>
             </w:r>
             <w:proofErr w:type="spellEnd"/>
             <w:r>
               <w:rPr>
                 <w:color w:val="000000" w:themeColor="text1"/>
               </w:rPr>
-              <w:t>[5].questions }}</w:t>
+              <w:t>[</w:t>
+            </w:r>
+            <w:proofErr w:type="gramEnd"/>
+            <w:r>
+              <w:rPr>
+                <w:color w:val="000000" w:themeColor="text1"/>
+              </w:rPr>
+              <w:t>5</w:t>
+            </w:r>
+            <w:proofErr w:type="gramStart"/>
+            <w:r>
+              <w:rPr>
+                <w:color w:val="000000" w:themeColor="text1"/>
+              </w:rPr>
+              <w:t>].questions</w:t>
+            </w:r>
+            <w:proofErr w:type="gramEnd"/>
+            <w:r>
+              <w:rPr>
+                <w:color w:val="000000" w:themeColor="text1"/>
+              </w:rPr>
+              <w:t xml:space="preserve"> }}</w:t>
             </w:r>
           </w:p>
         </w:tc>
@@ -2937,6 +3585,7 @@
                 <w:color w:val="5B9BD5" w:themeColor="accent5"/>
               </w:rPr>
             </w:pPr>
+            <w:proofErr w:type="gramStart"/>
             <w:r>
               <w:rPr>
                 <w:color w:val="5B9BD5" w:themeColor="accent5"/>
@@ -2948,21 +3597,56 @@
               <w:rPr>
                 <w:color w:val="5B9BD5" w:themeColor="accent5"/>
               </w:rPr>
-              <w:t>rc.concepts</w:t>
+              <w:t>rc</w:t>
+            </w:r>
+            <w:proofErr w:type="gramEnd"/>
+            <w:r>
+              <w:rPr>
+                <w:color w:val="5B9BD5" w:themeColor="accent5"/>
+              </w:rPr>
+              <w:t>.</w:t>
+            </w:r>
+            <w:proofErr w:type="gramStart"/>
+            <w:r>
+              <w:rPr>
+                <w:color w:val="5B9BD5" w:themeColor="accent5"/>
+              </w:rPr>
+              <w:t>concepts</w:t>
             </w:r>
             <w:proofErr w:type="spellEnd"/>
             <w:r>
               <w:rPr>
                 <w:color w:val="5B9BD5" w:themeColor="accent5"/>
               </w:rPr>
-              <w:t>[5].</w:t>
+              <w:t>[</w:t>
+            </w:r>
+            <w:proofErr w:type="gramEnd"/>
+            <w:r>
+              <w:rPr>
+                <w:color w:val="5B9BD5" w:themeColor="accent5"/>
+              </w:rPr>
+              <w:t>5</w:t>
+            </w:r>
+            <w:proofErr w:type="gramStart"/>
+            <w:r>
+              <w:rPr>
+                <w:color w:val="5B9BD5" w:themeColor="accent5"/>
+              </w:rPr>
+              <w:t>].</w:t>
             </w:r>
             <w:proofErr w:type="spellStart"/>
             <w:r>
               <w:rPr>
                 <w:color w:val="5B9BD5" w:themeColor="accent5"/>
               </w:rPr>
-              <w:t>done_well</w:t>
+              <w:t>done</w:t>
+            </w:r>
+            <w:proofErr w:type="gramEnd"/>
+            <w:r>
+              <w:rPr>
+                <w:color w:val="5B9BD5" w:themeColor="accent5"/>
+              </w:rPr>
+              <w:t>_well</w:t>
             </w:r>
             <w:proofErr w:type="spellEnd"/>
             <w:r>
@@ -2996,6 +3680,7 @@
                 <w:color w:val="5B9BD5" w:themeColor="accent5"/>
               </w:rPr>
             </w:pPr>
+            <w:proofErr w:type="gramStart"/>
             <w:r>
               <w:rPr>
                 <w:color w:val="5B9BD5" w:themeColor="accent5"/>
@@ -3007,14 +3692,49 @@
               <w:rPr>
                 <w:color w:val="5B9BD5" w:themeColor="accent5"/>
               </w:rPr>
-              <w:t>rc.concepts</w:t>
+              <w:t>rc</w:t>
+            </w:r>
+            <w:proofErr w:type="gramEnd"/>
+            <w:r>
+              <w:rPr>
+                <w:color w:val="5B9BD5" w:themeColor="accent5"/>
+              </w:rPr>
+              <w:t>.</w:t>
+            </w:r>
+            <w:proofErr w:type="gramStart"/>
+            <w:r>
+              <w:rPr>
+                <w:color w:val="5B9BD5" w:themeColor="accent5"/>
+              </w:rPr>
+              <w:t>concepts</w:t>
             </w:r>
             <w:proofErr w:type="spellEnd"/>
             <w:r>
               <w:rPr>
                 <w:color w:val="5B9BD5" w:themeColor="accent5"/>
               </w:rPr>
-              <w:t>[5].improve }}</w:t>
+              <w:t>[</w:t>
+            </w:r>
+            <w:proofErr w:type="gramEnd"/>
+            <w:r>
+              <w:rPr>
+                <w:color w:val="5B9BD5" w:themeColor="accent5"/>
+              </w:rPr>
+              <w:t>5</w:t>
+            </w:r>
+            <w:proofErr w:type="gramStart"/>
+            <w:r>
+              <w:rPr>
+                <w:color w:val="5B9BD5" w:themeColor="accent5"/>
+              </w:rPr>
+              <w:t>].improve</w:t>
+            </w:r>
+            <w:proofErr w:type="gramEnd"/>
+            <w:r>
+              <w:rPr>
+                <w:color w:val="5B9BD5" w:themeColor="accent5"/>
+              </w:rPr>
+              <w:t xml:space="preserve"> }}</w:t>
             </w:r>
           </w:p>
         </w:tc>
@@ -3068,6 +3788,7 @@
                 <w:color w:val="000000" w:themeColor="text1"/>
               </w:rPr>
             </w:pPr>
+            <w:proofErr w:type="gramStart"/>
             <w:r>
               <w:rPr>
                 <w:color w:val="000000" w:themeColor="text1"/>
@@ -3079,14 +3800,49 @@
               <w:rPr>
                 <w:color w:val="000000" w:themeColor="text1"/>
               </w:rPr>
-              <w:t>rc.concepts</w:t>
+              <w:t>rc</w:t>
+            </w:r>
+            <w:proofErr w:type="gramEnd"/>
+            <w:r>
+              <w:rPr>
+                <w:color w:val="000000" w:themeColor="text1"/>
+              </w:rPr>
+              <w:t>.</w:t>
+            </w:r>
+            <w:proofErr w:type="gramStart"/>
+            <w:r>
+              <w:rPr>
+                <w:color w:val="000000" w:themeColor="text1"/>
+              </w:rPr>
+              <w:t>concepts</w:t>
             </w:r>
             <w:proofErr w:type="spellEnd"/>
             <w:r>
               <w:rPr>
                 <w:color w:val="000000" w:themeColor="text1"/>
               </w:rPr>
-              <w:t>[6].questions }}</w:t>
+              <w:t>[</w:t>
+            </w:r>
+            <w:proofErr w:type="gramEnd"/>
+            <w:r>
+              <w:rPr>
+                <w:color w:val="000000" w:themeColor="text1"/>
+              </w:rPr>
+              <w:t>6</w:t>
+            </w:r>
+            <w:proofErr w:type="gramStart"/>
+            <w:r>
+              <w:rPr>
+                <w:color w:val="000000" w:themeColor="text1"/>
+              </w:rPr>
+              <w:t>].questions</w:t>
+            </w:r>
+            <w:proofErr w:type="gramEnd"/>
+            <w:r>
+              <w:rPr>
+                <w:color w:val="000000" w:themeColor="text1"/>
+              </w:rPr>
+              <w:t xml:space="preserve"> }}</w:t>
             </w:r>
           </w:p>
         </w:tc>
@@ -3113,6 +3869,7 @@
                 <w:color w:val="5B9BD5" w:themeColor="accent5"/>
               </w:rPr>
             </w:pPr>
+            <w:proofErr w:type="gramStart"/>
             <w:r>
               <w:rPr>
                 <w:color w:val="5B9BD5" w:themeColor="accent5"/>
@@ -3124,21 +3881,56 @@
               <w:rPr>
                 <w:color w:val="5B9BD5" w:themeColor="accent5"/>
               </w:rPr>
-              <w:t>rc.concepts</w:t>
+              <w:t>rc</w:t>
+            </w:r>
+            <w:proofErr w:type="gramEnd"/>
+            <w:r>
+              <w:rPr>
+                <w:color w:val="5B9BD5" w:themeColor="accent5"/>
+              </w:rPr>
+              <w:t>.</w:t>
+            </w:r>
+            <w:proofErr w:type="gramStart"/>
+            <w:r>
+              <w:rPr>
+                <w:color w:val="5B9BD5" w:themeColor="accent5"/>
+              </w:rPr>
+              <w:t>concepts</w:t>
             </w:r>
             <w:proofErr w:type="spellEnd"/>
             <w:r>
               <w:rPr>
                 <w:color w:val="5B9BD5" w:themeColor="accent5"/>
               </w:rPr>
-              <w:t>[6].</w:t>
+              <w:t>[</w:t>
+            </w:r>
+            <w:proofErr w:type="gramEnd"/>
+            <w:r>
+              <w:rPr>
+                <w:color w:val="5B9BD5" w:themeColor="accent5"/>
+              </w:rPr>
+              <w:t>6</w:t>
+            </w:r>
+            <w:proofErr w:type="gramStart"/>
+            <w:r>
+              <w:rPr>
+                <w:color w:val="5B9BD5" w:themeColor="accent5"/>
+              </w:rPr>
+              <w:t>].</w:t>
             </w:r>
             <w:proofErr w:type="spellStart"/>
             <w:r>
               <w:rPr>
                 <w:color w:val="5B9BD5" w:themeColor="accent5"/>
               </w:rPr>
-              <w:t>done_well</w:t>
+              <w:t>done</w:t>
+            </w:r>
+            <w:proofErr w:type="gramEnd"/>
+            <w:r>
+              <w:rPr>
+                <w:color w:val="5B9BD5" w:themeColor="accent5"/>
+              </w:rPr>
+              <w:t>_well</w:t>
             </w:r>
             <w:proofErr w:type="spellEnd"/>
             <w:r>
@@ -3172,6 +3964,7 @@
                 <w:color w:val="5B9BD5" w:themeColor="accent5"/>
               </w:rPr>
             </w:pPr>
+            <w:proofErr w:type="gramStart"/>
             <w:r>
               <w:rPr>
                 <w:color w:val="5B9BD5" w:themeColor="accent5"/>
@@ -3183,14 +3976,49 @@
               <w:rPr>
                 <w:color w:val="5B9BD5" w:themeColor="accent5"/>
               </w:rPr>
-              <w:t>rc.concepts</w:t>
+              <w:t>rc</w:t>
+            </w:r>
+            <w:proofErr w:type="gramEnd"/>
+            <w:r>
+              <w:rPr>
+                <w:color w:val="5B9BD5" w:themeColor="accent5"/>
+              </w:rPr>
+              <w:t>.</w:t>
+            </w:r>
+            <w:proofErr w:type="gramStart"/>
+            <w:r>
+              <w:rPr>
+                <w:color w:val="5B9BD5" w:themeColor="accent5"/>
+              </w:rPr>
+              <w:t>concepts</w:t>
             </w:r>
             <w:proofErr w:type="spellEnd"/>
             <w:r>
               <w:rPr>
                 <w:color w:val="5B9BD5" w:themeColor="accent5"/>
               </w:rPr>
-              <w:t>[6].improve }}</w:t>
+              <w:t>[</w:t>
+            </w:r>
+            <w:proofErr w:type="gramEnd"/>
+            <w:r>
+              <w:rPr>
+                <w:color w:val="5B9BD5" w:themeColor="accent5"/>
+              </w:rPr>
+              <w:t>6</w:t>
+            </w:r>
+            <w:proofErr w:type="gramStart"/>
+            <w:r>
+              <w:rPr>
+                <w:color w:val="5B9BD5" w:themeColor="accent5"/>
+              </w:rPr>
+              <w:t>].improve</w:t>
+            </w:r>
+            <w:proofErr w:type="gramEnd"/>
+            <w:r>
+              <w:rPr>
+                <w:color w:val="5B9BD5" w:themeColor="accent5"/>
+              </w:rPr>
+              <w:t xml:space="preserve"> }}</w:t>
             </w:r>
           </w:p>
         </w:tc>
@@ -3244,6 +4072,7 @@
                 <w:color w:val="000000" w:themeColor="text1"/>
               </w:rPr>
             </w:pPr>
+            <w:proofErr w:type="gramStart"/>
             <w:r>
               <w:rPr>
                 <w:color w:val="000000" w:themeColor="text1"/>
@@ -3255,14 +4084,49 @@
               <w:rPr>
                 <w:color w:val="000000" w:themeColor="text1"/>
               </w:rPr>
-              <w:t>rc.concepts</w:t>
+              <w:t>rc</w:t>
+            </w:r>
+            <w:proofErr w:type="gramEnd"/>
+            <w:r>
+              <w:rPr>
+                <w:color w:val="000000" w:themeColor="text1"/>
+              </w:rPr>
+              <w:t>.</w:t>
+            </w:r>
+            <w:proofErr w:type="gramStart"/>
+            <w:r>
+              <w:rPr>
+                <w:color w:val="000000" w:themeColor="text1"/>
+              </w:rPr>
+              <w:t>concepts</w:t>
             </w:r>
             <w:proofErr w:type="spellEnd"/>
             <w:r>
               <w:rPr>
                 <w:color w:val="000000" w:themeColor="text1"/>
               </w:rPr>
-              <w:t>[7].questions }}</w:t>
+              <w:t>[</w:t>
+            </w:r>
+            <w:proofErr w:type="gramEnd"/>
+            <w:r>
+              <w:rPr>
+                <w:color w:val="000000" w:themeColor="text1"/>
+              </w:rPr>
+              <w:t>7</w:t>
+            </w:r>
+            <w:proofErr w:type="gramStart"/>
+            <w:r>
+              <w:rPr>
+                <w:color w:val="000000" w:themeColor="text1"/>
+              </w:rPr>
+              <w:t>].questions</w:t>
+            </w:r>
+            <w:proofErr w:type="gramEnd"/>
+            <w:r>
+              <w:rPr>
+                <w:color w:val="000000" w:themeColor="text1"/>
+              </w:rPr>
+              <w:t xml:space="preserve"> }}</w:t>
             </w:r>
           </w:p>
         </w:tc>
@@ -3289,6 +4153,7 @@
                 <w:color w:val="5B9BD5" w:themeColor="accent5"/>
               </w:rPr>
             </w:pPr>
+            <w:proofErr w:type="gramStart"/>
             <w:r>
               <w:rPr>
                 <w:color w:val="5B9BD5" w:themeColor="accent5"/>
@@ -3300,21 +4165,56 @@
               <w:rPr>
                 <w:color w:val="5B9BD5" w:themeColor="accent5"/>
               </w:rPr>
-              <w:t>rc.concepts</w:t>
+              <w:t>rc</w:t>
+            </w:r>
+            <w:proofErr w:type="gramEnd"/>
+            <w:r>
+              <w:rPr>
+                <w:color w:val="5B9BD5" w:themeColor="accent5"/>
+              </w:rPr>
+              <w:t>.</w:t>
+            </w:r>
+            <w:proofErr w:type="gramStart"/>
+            <w:r>
+              <w:rPr>
+                <w:color w:val="5B9BD5" w:themeColor="accent5"/>
+              </w:rPr>
+              <w:t>concepts</w:t>
             </w:r>
             <w:proofErr w:type="spellEnd"/>
             <w:r>
               <w:rPr>
                 <w:color w:val="5B9BD5" w:themeColor="accent5"/>
               </w:rPr>
-              <w:t>[7].</w:t>
+              <w:t>[</w:t>
+            </w:r>
+            <w:proofErr w:type="gramEnd"/>
+            <w:r>
+              <w:rPr>
+                <w:color w:val="5B9BD5" w:themeColor="accent5"/>
+              </w:rPr>
+              <w:t>7</w:t>
+            </w:r>
+            <w:proofErr w:type="gramStart"/>
+            <w:r>
+              <w:rPr>
+                <w:color w:val="5B9BD5" w:themeColor="accent5"/>
+              </w:rPr>
+              <w:t>].</w:t>
             </w:r>
             <w:proofErr w:type="spellStart"/>
             <w:r>
               <w:rPr>
                 <w:color w:val="5B9BD5" w:themeColor="accent5"/>
               </w:rPr>
-              <w:t>done_well</w:t>
+              <w:t>done</w:t>
+            </w:r>
+            <w:proofErr w:type="gramEnd"/>
+            <w:r>
+              <w:rPr>
+                <w:color w:val="5B9BD5" w:themeColor="accent5"/>
+              </w:rPr>
+              <w:t>_well</w:t>
             </w:r>
             <w:proofErr w:type="spellEnd"/>
             <w:r>
@@ -3348,6 +4248,7 @@
                 <w:color w:val="5B9BD5" w:themeColor="accent5"/>
               </w:rPr>
             </w:pPr>
+            <w:proofErr w:type="gramStart"/>
             <w:r>
               <w:rPr>
                 <w:color w:val="5B9BD5" w:themeColor="accent5"/>
@@ -3359,14 +4260,49 @@
               <w:rPr>
                 <w:color w:val="5B9BD5" w:themeColor="accent5"/>
               </w:rPr>
-              <w:t>rc.concepts</w:t>
+              <w:t>rc</w:t>
+            </w:r>
+            <w:proofErr w:type="gramEnd"/>
+            <w:r>
+              <w:rPr>
+                <w:color w:val="5B9BD5" w:themeColor="accent5"/>
+              </w:rPr>
+              <w:t>.</w:t>
+            </w:r>
+            <w:proofErr w:type="gramStart"/>
+            <w:r>
+              <w:rPr>
+                <w:color w:val="5B9BD5" w:themeColor="accent5"/>
+              </w:rPr>
+              <w:t>concepts</w:t>
             </w:r>
             <w:proofErr w:type="spellEnd"/>
             <w:r>
               <w:rPr>
                 <w:color w:val="5B9BD5" w:themeColor="accent5"/>
               </w:rPr>
-              <w:t>[7].improve }}</w:t>
+              <w:t>[</w:t>
+            </w:r>
+            <w:proofErr w:type="gramEnd"/>
+            <w:r>
+              <w:rPr>
+                <w:color w:val="5B9BD5" w:themeColor="accent5"/>
+              </w:rPr>
+              <w:t>7</w:t>
+            </w:r>
+            <w:proofErr w:type="gramStart"/>
+            <w:r>
+              <w:rPr>
+                <w:color w:val="5B9BD5" w:themeColor="accent5"/>
+              </w:rPr>
+              <w:t>].improve</w:t>
+            </w:r>
+            <w:proofErr w:type="gramEnd"/>
+            <w:r>
+              <w:rPr>
+                <w:color w:val="5B9BD5" w:themeColor="accent5"/>
+              </w:rPr>
+              <w:t xml:space="preserve"> }}</w:t>
             </w:r>
           </w:p>
         </w:tc>
@@ -3691,6 +4627,7 @@
                 <w:color w:val="000000" w:themeColor="text1"/>
               </w:rPr>
             </w:pPr>
+            <w:proofErr w:type="gramStart"/>
             <w:r>
               <w:rPr>
                 <w:color w:val="000000" w:themeColor="text1"/>
@@ -3702,14 +4639,49 @@
               <w:rPr>
                 <w:color w:val="000000" w:themeColor="text1"/>
               </w:rPr>
-              <w:t>qr.concepts</w:t>
+              <w:t>qr</w:t>
+            </w:r>
+            <w:proofErr w:type="gramEnd"/>
+            <w:r>
+              <w:rPr>
+                <w:color w:val="000000" w:themeColor="text1"/>
+              </w:rPr>
+              <w:t>.</w:t>
+            </w:r>
+            <w:proofErr w:type="gramStart"/>
+            <w:r>
+              <w:rPr>
+                <w:color w:val="000000" w:themeColor="text1"/>
+              </w:rPr>
+              <w:t>concepts</w:t>
             </w:r>
             <w:proofErr w:type="spellEnd"/>
             <w:r>
               <w:rPr>
                 <w:color w:val="000000" w:themeColor="text1"/>
               </w:rPr>
-              <w:t>[0].questions }}</w:t>
+              <w:t>[</w:t>
+            </w:r>
+            <w:proofErr w:type="gramEnd"/>
+            <w:r>
+              <w:rPr>
+                <w:color w:val="000000" w:themeColor="text1"/>
+              </w:rPr>
+              <w:t>0</w:t>
+            </w:r>
+            <w:proofErr w:type="gramStart"/>
+            <w:r>
+              <w:rPr>
+                <w:color w:val="000000" w:themeColor="text1"/>
+              </w:rPr>
+              <w:t>].questions</w:t>
+            </w:r>
+            <w:proofErr w:type="gramEnd"/>
+            <w:r>
+              <w:rPr>
+                <w:color w:val="000000" w:themeColor="text1"/>
+              </w:rPr>
+              <w:t xml:space="preserve"> }}</w:t>
             </w:r>
           </w:p>
         </w:tc>
@@ -3736,6 +4708,7 @@
                 <w:color w:val="5B9BD5" w:themeColor="accent5"/>
               </w:rPr>
             </w:pPr>
+            <w:proofErr w:type="gramStart"/>
             <w:r>
               <w:rPr>
                 <w:color w:val="5B9BD5" w:themeColor="accent5"/>
@@ -3747,21 +4720,56 @@
               <w:rPr>
                 <w:color w:val="5B9BD5" w:themeColor="accent5"/>
               </w:rPr>
-              <w:t>qr.concepts</w:t>
+              <w:t>qr</w:t>
+            </w:r>
+            <w:proofErr w:type="gramEnd"/>
+            <w:r>
+              <w:rPr>
+                <w:color w:val="5B9BD5" w:themeColor="accent5"/>
+              </w:rPr>
+              <w:t>.</w:t>
+            </w:r>
+            <w:proofErr w:type="gramStart"/>
+            <w:r>
+              <w:rPr>
+                <w:color w:val="5B9BD5" w:themeColor="accent5"/>
+              </w:rPr>
+              <w:t>concepts</w:t>
             </w:r>
             <w:proofErr w:type="spellEnd"/>
             <w:r>
               <w:rPr>
                 <w:color w:val="5B9BD5" w:themeColor="accent5"/>
               </w:rPr>
-              <w:t>[0].</w:t>
+              <w:t>[</w:t>
+            </w:r>
+            <w:proofErr w:type="gramEnd"/>
+            <w:r>
+              <w:rPr>
+                <w:color w:val="5B9BD5" w:themeColor="accent5"/>
+              </w:rPr>
+              <w:t>0</w:t>
+            </w:r>
+            <w:proofErr w:type="gramStart"/>
+            <w:r>
+              <w:rPr>
+                <w:color w:val="5B9BD5" w:themeColor="accent5"/>
+              </w:rPr>
+              <w:t>].</w:t>
             </w:r>
             <w:proofErr w:type="spellStart"/>
             <w:r>
               <w:rPr>
                 <w:color w:val="5B9BD5" w:themeColor="accent5"/>
               </w:rPr>
-              <w:t>done_well</w:t>
+              <w:t>done</w:t>
+            </w:r>
+            <w:proofErr w:type="gramEnd"/>
+            <w:r>
+              <w:rPr>
+                <w:color w:val="5B9BD5" w:themeColor="accent5"/>
+              </w:rPr>
+              <w:t>_well</w:t>
             </w:r>
             <w:proofErr w:type="spellEnd"/>
             <w:r>
@@ -3795,6 +4803,7 @@
                 <w:color w:val="5B9BD5" w:themeColor="accent5"/>
               </w:rPr>
             </w:pPr>
+            <w:proofErr w:type="gramStart"/>
             <w:r>
               <w:rPr>
                 <w:color w:val="5B9BD5" w:themeColor="accent5"/>
@@ -3806,14 +4815,49 @@
               <w:rPr>
                 <w:color w:val="5B9BD5" w:themeColor="accent5"/>
               </w:rPr>
-              <w:t>qr.concepts</w:t>
+              <w:t>qr</w:t>
+            </w:r>
+            <w:proofErr w:type="gramEnd"/>
+            <w:r>
+              <w:rPr>
+                <w:color w:val="5B9BD5" w:themeColor="accent5"/>
+              </w:rPr>
+              <w:t>.</w:t>
+            </w:r>
+            <w:proofErr w:type="gramStart"/>
+            <w:r>
+              <w:rPr>
+                <w:color w:val="5B9BD5" w:themeColor="accent5"/>
+              </w:rPr>
+              <w:t>concepts</w:t>
             </w:r>
             <w:proofErr w:type="spellEnd"/>
             <w:r>
               <w:rPr>
                 <w:color w:val="5B9BD5" w:themeColor="accent5"/>
               </w:rPr>
-              <w:t>[0].improve }}</w:t>
+              <w:t>[</w:t>
+            </w:r>
+            <w:proofErr w:type="gramEnd"/>
+            <w:r>
+              <w:rPr>
+                <w:color w:val="5B9BD5" w:themeColor="accent5"/>
+              </w:rPr>
+              <w:t>0</w:t>
+            </w:r>
+            <w:proofErr w:type="gramStart"/>
+            <w:r>
+              <w:rPr>
+                <w:color w:val="5B9BD5" w:themeColor="accent5"/>
+              </w:rPr>
+              <w:t>].improve</w:t>
+            </w:r>
+            <w:proofErr w:type="gramEnd"/>
+            <w:r>
+              <w:rPr>
+                <w:color w:val="5B9BD5" w:themeColor="accent5"/>
+              </w:rPr>
+              <w:t xml:space="preserve"> }}</w:t>
             </w:r>
           </w:p>
         </w:tc>
@@ -3870,6 +4914,7 @@
                 <w:color w:val="000000" w:themeColor="text1"/>
               </w:rPr>
             </w:pPr>
+            <w:proofErr w:type="gramStart"/>
             <w:r>
               <w:rPr>
                 <w:color w:val="000000" w:themeColor="text1"/>
@@ -3881,14 +4926,49 @@
               <w:rPr>
                 <w:color w:val="000000" w:themeColor="text1"/>
               </w:rPr>
-              <w:t>qr.concepts</w:t>
+              <w:t>qr</w:t>
+            </w:r>
+            <w:proofErr w:type="gramEnd"/>
+            <w:r>
+              <w:rPr>
+                <w:color w:val="000000" w:themeColor="text1"/>
+              </w:rPr>
+              <w:t>.</w:t>
+            </w:r>
+            <w:proofErr w:type="gramStart"/>
+            <w:r>
+              <w:rPr>
+                <w:color w:val="000000" w:themeColor="text1"/>
+              </w:rPr>
+              <w:t>concepts</w:t>
             </w:r>
             <w:proofErr w:type="spellEnd"/>
             <w:r>
               <w:rPr>
                 <w:color w:val="000000" w:themeColor="text1"/>
               </w:rPr>
-              <w:t>[1].questions }}</w:t>
+              <w:t>[</w:t>
+            </w:r>
+            <w:proofErr w:type="gramEnd"/>
+            <w:r>
+              <w:rPr>
+                <w:color w:val="000000" w:themeColor="text1"/>
+              </w:rPr>
+              <w:t>1</w:t>
+            </w:r>
+            <w:proofErr w:type="gramStart"/>
+            <w:r>
+              <w:rPr>
+                <w:color w:val="000000" w:themeColor="text1"/>
+              </w:rPr>
+              <w:t>].questions</w:t>
+            </w:r>
+            <w:proofErr w:type="gramEnd"/>
+            <w:r>
+              <w:rPr>
+                <w:color w:val="000000" w:themeColor="text1"/>
+              </w:rPr>
+              <w:t xml:space="preserve"> }}</w:t>
             </w:r>
           </w:p>
         </w:tc>
@@ -3915,6 +4995,7 @@
                 <w:color w:val="5B9BD5" w:themeColor="accent5"/>
               </w:rPr>
             </w:pPr>
+            <w:proofErr w:type="gramStart"/>
             <w:r>
               <w:rPr>
                 <w:color w:val="5B9BD5" w:themeColor="accent5"/>
@@ -3926,21 +5007,56 @@
               <w:rPr>
                 <w:color w:val="5B9BD5" w:themeColor="accent5"/>
               </w:rPr>
-              <w:t>qr.concepts</w:t>
+              <w:t>qr</w:t>
+            </w:r>
+            <w:proofErr w:type="gramEnd"/>
+            <w:r>
+              <w:rPr>
+                <w:color w:val="5B9BD5" w:themeColor="accent5"/>
+              </w:rPr>
+              <w:t>.</w:t>
+            </w:r>
+            <w:proofErr w:type="gramStart"/>
+            <w:r>
+              <w:rPr>
+                <w:color w:val="5B9BD5" w:themeColor="accent5"/>
+              </w:rPr>
+              <w:t>concepts</w:t>
             </w:r>
             <w:proofErr w:type="spellEnd"/>
             <w:r>
               <w:rPr>
                 <w:color w:val="5B9BD5" w:themeColor="accent5"/>
               </w:rPr>
-              <w:t>[1].</w:t>
+              <w:t>[</w:t>
+            </w:r>
+            <w:proofErr w:type="gramEnd"/>
+            <w:r>
+              <w:rPr>
+                <w:color w:val="5B9BD5" w:themeColor="accent5"/>
+              </w:rPr>
+              <w:t>1</w:t>
+            </w:r>
+            <w:proofErr w:type="gramStart"/>
+            <w:r>
+              <w:rPr>
+                <w:color w:val="5B9BD5" w:themeColor="accent5"/>
+              </w:rPr>
+              <w:t>].</w:t>
             </w:r>
             <w:proofErr w:type="spellStart"/>
             <w:r>
               <w:rPr>
                 <w:color w:val="5B9BD5" w:themeColor="accent5"/>
               </w:rPr>
-              <w:t>done_well</w:t>
+              <w:t>done</w:t>
+            </w:r>
+            <w:proofErr w:type="gramEnd"/>
+            <w:r>
+              <w:rPr>
+                <w:color w:val="5B9BD5" w:themeColor="accent5"/>
+              </w:rPr>
+              <w:t>_well</w:t>
             </w:r>
             <w:proofErr w:type="spellEnd"/>
             <w:r>
@@ -3974,6 +5090,7 @@
                 <w:color w:val="5B9BD5" w:themeColor="accent5"/>
               </w:rPr>
             </w:pPr>
+            <w:proofErr w:type="gramStart"/>
             <w:r>
               <w:rPr>
                 <w:color w:val="5B9BD5" w:themeColor="accent5"/>
@@ -3985,14 +5102,49 @@
               <w:rPr>
                 <w:color w:val="5B9BD5" w:themeColor="accent5"/>
               </w:rPr>
-              <w:t>qr.concepts</w:t>
+              <w:t>qr</w:t>
+            </w:r>
+            <w:proofErr w:type="gramEnd"/>
+            <w:r>
+              <w:rPr>
+                <w:color w:val="5B9BD5" w:themeColor="accent5"/>
+              </w:rPr>
+              <w:t>.</w:t>
+            </w:r>
+            <w:proofErr w:type="gramStart"/>
+            <w:r>
+              <w:rPr>
+                <w:color w:val="5B9BD5" w:themeColor="accent5"/>
+              </w:rPr>
+              <w:t>concepts</w:t>
             </w:r>
             <w:proofErr w:type="spellEnd"/>
             <w:r>
               <w:rPr>
                 <w:color w:val="5B9BD5" w:themeColor="accent5"/>
               </w:rPr>
-              <w:t>[1].improve }}</w:t>
+              <w:t>[</w:t>
+            </w:r>
+            <w:proofErr w:type="gramEnd"/>
+            <w:r>
+              <w:rPr>
+                <w:color w:val="5B9BD5" w:themeColor="accent5"/>
+              </w:rPr>
+              <w:t>1</w:t>
+            </w:r>
+            <w:proofErr w:type="gramStart"/>
+            <w:r>
+              <w:rPr>
+                <w:color w:val="5B9BD5" w:themeColor="accent5"/>
+              </w:rPr>
+              <w:t>].improve</w:t>
+            </w:r>
+            <w:proofErr w:type="gramEnd"/>
+            <w:r>
+              <w:rPr>
+                <w:color w:val="5B9BD5" w:themeColor="accent5"/>
+              </w:rPr>
+              <w:t xml:space="preserve"> }}</w:t>
             </w:r>
           </w:p>
         </w:tc>
@@ -4049,6 +5201,7 @@
                 <w:color w:val="000000" w:themeColor="text1"/>
               </w:rPr>
             </w:pPr>
+            <w:proofErr w:type="gramStart"/>
             <w:r>
               <w:rPr>
                 <w:color w:val="000000" w:themeColor="text1"/>
@@ -4060,14 +5213,49 @@
               <w:rPr>
                 <w:color w:val="000000" w:themeColor="text1"/>
               </w:rPr>
-              <w:t>qr.concepts</w:t>
+              <w:t>qr</w:t>
+            </w:r>
+            <w:proofErr w:type="gramEnd"/>
+            <w:r>
+              <w:rPr>
+                <w:color w:val="000000" w:themeColor="text1"/>
+              </w:rPr>
+              <w:t>.</w:t>
+            </w:r>
+            <w:proofErr w:type="gramStart"/>
+            <w:r>
+              <w:rPr>
+                <w:color w:val="000000" w:themeColor="text1"/>
+              </w:rPr>
+              <w:t>concepts</w:t>
             </w:r>
             <w:proofErr w:type="spellEnd"/>
             <w:r>
               <w:rPr>
                 <w:color w:val="000000" w:themeColor="text1"/>
               </w:rPr>
-              <w:t>[2].questions }}</w:t>
+              <w:t>[</w:t>
+            </w:r>
+            <w:proofErr w:type="gramEnd"/>
+            <w:r>
+              <w:rPr>
+                <w:color w:val="000000" w:themeColor="text1"/>
+              </w:rPr>
+              <w:t>2</w:t>
+            </w:r>
+            <w:proofErr w:type="gramStart"/>
+            <w:r>
+              <w:rPr>
+                <w:color w:val="000000" w:themeColor="text1"/>
+              </w:rPr>
+              <w:t>].questions</w:t>
+            </w:r>
+            <w:proofErr w:type="gramEnd"/>
+            <w:r>
+              <w:rPr>
+                <w:color w:val="000000" w:themeColor="text1"/>
+              </w:rPr>
+              <w:t xml:space="preserve"> }}</w:t>
             </w:r>
           </w:p>
         </w:tc>
@@ -4094,6 +5282,7 @@
                 <w:color w:val="5B9BD5" w:themeColor="accent5"/>
               </w:rPr>
             </w:pPr>
+            <w:proofErr w:type="gramStart"/>
             <w:r>
               <w:rPr>
                 <w:color w:val="5B9BD5" w:themeColor="accent5"/>
@@ -4105,21 +5294,56 @@
               <w:rPr>
                 <w:color w:val="5B9BD5" w:themeColor="accent5"/>
               </w:rPr>
-              <w:t>qr.concepts</w:t>
+              <w:t>qr</w:t>
+            </w:r>
+            <w:proofErr w:type="gramEnd"/>
+            <w:r>
+              <w:rPr>
+                <w:color w:val="5B9BD5" w:themeColor="accent5"/>
+              </w:rPr>
+              <w:t>.</w:t>
+            </w:r>
+            <w:proofErr w:type="gramStart"/>
+            <w:r>
+              <w:rPr>
+                <w:color w:val="5B9BD5" w:themeColor="accent5"/>
+              </w:rPr>
+              <w:t>concepts</w:t>
             </w:r>
             <w:proofErr w:type="spellEnd"/>
             <w:r>
               <w:rPr>
                 <w:color w:val="5B9BD5" w:themeColor="accent5"/>
               </w:rPr>
-              <w:t>[2].</w:t>
+              <w:t>[</w:t>
+            </w:r>
+            <w:proofErr w:type="gramEnd"/>
+            <w:r>
+              <w:rPr>
+                <w:color w:val="5B9BD5" w:themeColor="accent5"/>
+              </w:rPr>
+              <w:t>2</w:t>
+            </w:r>
+            <w:proofErr w:type="gramStart"/>
+            <w:r>
+              <w:rPr>
+                <w:color w:val="5B9BD5" w:themeColor="accent5"/>
+              </w:rPr>
+              <w:t>].</w:t>
             </w:r>
             <w:proofErr w:type="spellStart"/>
             <w:r>
               <w:rPr>
                 <w:color w:val="5B9BD5" w:themeColor="accent5"/>
               </w:rPr>
-              <w:t>done_well</w:t>
+              <w:t>done</w:t>
+            </w:r>
+            <w:proofErr w:type="gramEnd"/>
+            <w:r>
+              <w:rPr>
+                <w:color w:val="5B9BD5" w:themeColor="accent5"/>
+              </w:rPr>
+              <w:t>_well</w:t>
             </w:r>
             <w:proofErr w:type="spellEnd"/>
             <w:r>
@@ -4153,6 +5377,7 @@
                 <w:color w:val="5B9BD5" w:themeColor="accent5"/>
               </w:rPr>
             </w:pPr>
+            <w:proofErr w:type="gramStart"/>
             <w:r>
               <w:rPr>
                 <w:color w:val="5B9BD5" w:themeColor="accent5"/>
@@ -4164,14 +5389,49 @@
               <w:rPr>
                 <w:color w:val="5B9BD5" w:themeColor="accent5"/>
               </w:rPr>
-              <w:t>qr.concepts</w:t>
+              <w:t>qr</w:t>
+            </w:r>
+            <w:proofErr w:type="gramEnd"/>
+            <w:r>
+              <w:rPr>
+                <w:color w:val="5B9BD5" w:themeColor="accent5"/>
+              </w:rPr>
+              <w:t>.</w:t>
+            </w:r>
+            <w:proofErr w:type="gramStart"/>
+            <w:r>
+              <w:rPr>
+                <w:color w:val="5B9BD5" w:themeColor="accent5"/>
+              </w:rPr>
+              <w:t>concepts</w:t>
             </w:r>
             <w:proofErr w:type="spellEnd"/>
             <w:r>
               <w:rPr>
                 <w:color w:val="5B9BD5" w:themeColor="accent5"/>
               </w:rPr>
-              <w:t>[2].improve }}</w:t>
+              <w:t>[</w:t>
+            </w:r>
+            <w:proofErr w:type="gramEnd"/>
+            <w:r>
+              <w:rPr>
+                <w:color w:val="5B9BD5" w:themeColor="accent5"/>
+              </w:rPr>
+              <w:t>2</w:t>
+            </w:r>
+            <w:proofErr w:type="gramStart"/>
+            <w:r>
+              <w:rPr>
+                <w:color w:val="5B9BD5" w:themeColor="accent5"/>
+              </w:rPr>
+              <w:t>].improve</w:t>
+            </w:r>
+            <w:proofErr w:type="gramEnd"/>
+            <w:r>
+              <w:rPr>
+                <w:color w:val="5B9BD5" w:themeColor="accent5"/>
+              </w:rPr>
+              <w:t xml:space="preserve"> }}</w:t>
             </w:r>
           </w:p>
         </w:tc>
@@ -4228,6 +5488,7 @@
                 <w:color w:val="000000" w:themeColor="text1"/>
               </w:rPr>
             </w:pPr>
+            <w:proofErr w:type="gramStart"/>
             <w:r>
               <w:rPr>
                 <w:color w:val="000000" w:themeColor="text1"/>
@@ -4239,14 +5500,49 @@
               <w:rPr>
                 <w:color w:val="000000" w:themeColor="text1"/>
               </w:rPr>
-              <w:t>qr.concepts</w:t>
+              <w:t>qr</w:t>
+            </w:r>
+            <w:proofErr w:type="gramEnd"/>
+            <w:r>
+              <w:rPr>
+                <w:color w:val="000000" w:themeColor="text1"/>
+              </w:rPr>
+              <w:t>.</w:t>
+            </w:r>
+            <w:proofErr w:type="gramStart"/>
+            <w:r>
+              <w:rPr>
+                <w:color w:val="000000" w:themeColor="text1"/>
+              </w:rPr>
+              <w:t>concepts</w:t>
             </w:r>
             <w:proofErr w:type="spellEnd"/>
             <w:r>
               <w:rPr>
                 <w:color w:val="000000" w:themeColor="text1"/>
               </w:rPr>
-              <w:t>[3].questions }}</w:t>
+              <w:t>[</w:t>
+            </w:r>
+            <w:proofErr w:type="gramEnd"/>
+            <w:r>
+              <w:rPr>
+                <w:color w:val="000000" w:themeColor="text1"/>
+              </w:rPr>
+              <w:t>3</w:t>
+            </w:r>
+            <w:proofErr w:type="gramStart"/>
+            <w:r>
+              <w:rPr>
+                <w:color w:val="000000" w:themeColor="text1"/>
+              </w:rPr>
+              <w:t>].questions</w:t>
+            </w:r>
+            <w:proofErr w:type="gramEnd"/>
+            <w:r>
+              <w:rPr>
+                <w:color w:val="000000" w:themeColor="text1"/>
+              </w:rPr>
+              <w:t xml:space="preserve"> }}</w:t>
             </w:r>
           </w:p>
         </w:tc>
@@ -4273,6 +5569,7 @@
                 <w:color w:val="5B9BD5" w:themeColor="accent5"/>
               </w:rPr>
             </w:pPr>
+            <w:proofErr w:type="gramStart"/>
             <w:r>
               <w:rPr>
                 <w:color w:val="5B9BD5" w:themeColor="accent5"/>
@@ -4284,21 +5581,56 @@
               <w:rPr>
                 <w:color w:val="5B9BD5" w:themeColor="accent5"/>
               </w:rPr>
-              <w:t>qr.concepts</w:t>
+              <w:t>qr</w:t>
+            </w:r>
+            <w:proofErr w:type="gramEnd"/>
+            <w:r>
+              <w:rPr>
+                <w:color w:val="5B9BD5" w:themeColor="accent5"/>
+              </w:rPr>
+              <w:t>.</w:t>
+            </w:r>
+            <w:proofErr w:type="gramStart"/>
+            <w:r>
+              <w:rPr>
+                <w:color w:val="5B9BD5" w:themeColor="accent5"/>
+              </w:rPr>
+              <w:t>concepts</w:t>
             </w:r>
             <w:proofErr w:type="spellEnd"/>
             <w:r>
               <w:rPr>
                 <w:color w:val="5B9BD5" w:themeColor="accent5"/>
               </w:rPr>
-              <w:t>[3].</w:t>
+              <w:t>[</w:t>
+            </w:r>
+            <w:proofErr w:type="gramEnd"/>
+            <w:r>
+              <w:rPr>
+                <w:color w:val="5B9BD5" w:themeColor="accent5"/>
+              </w:rPr>
+              <w:t>3</w:t>
+            </w:r>
+            <w:proofErr w:type="gramStart"/>
+            <w:r>
+              <w:rPr>
+                <w:color w:val="5B9BD5" w:themeColor="accent5"/>
+              </w:rPr>
+              <w:t>].</w:t>
             </w:r>
             <w:proofErr w:type="spellStart"/>
             <w:r>
               <w:rPr>
                 <w:color w:val="5B9BD5" w:themeColor="accent5"/>
               </w:rPr>
-              <w:t>done_well</w:t>
+              <w:t>done</w:t>
+            </w:r>
+            <w:proofErr w:type="gramEnd"/>
+            <w:r>
+              <w:rPr>
+                <w:color w:val="5B9BD5" w:themeColor="accent5"/>
+              </w:rPr>
+              <w:t>_well</w:t>
             </w:r>
             <w:proofErr w:type="spellEnd"/>
             <w:r>
@@ -4332,6 +5664,7 @@
                 <w:color w:val="5B9BD5" w:themeColor="accent5"/>
               </w:rPr>
             </w:pPr>
+            <w:proofErr w:type="gramStart"/>
             <w:r>
               <w:rPr>
                 <w:color w:val="5B9BD5" w:themeColor="accent5"/>
@@ -4343,14 +5676,49 @@
               <w:rPr>
                 <w:color w:val="5B9BD5" w:themeColor="accent5"/>
               </w:rPr>
-              <w:t>qr.concepts</w:t>
+              <w:t>qr</w:t>
+            </w:r>
+            <w:proofErr w:type="gramEnd"/>
+            <w:r>
+              <w:rPr>
+                <w:color w:val="5B9BD5" w:themeColor="accent5"/>
+              </w:rPr>
+              <w:t>.</w:t>
+            </w:r>
+            <w:proofErr w:type="gramStart"/>
+            <w:r>
+              <w:rPr>
+                <w:color w:val="5B9BD5" w:themeColor="accent5"/>
+              </w:rPr>
+              <w:t>concepts</w:t>
             </w:r>
             <w:proofErr w:type="spellEnd"/>
             <w:r>
               <w:rPr>
                 <w:color w:val="5B9BD5" w:themeColor="accent5"/>
               </w:rPr>
-              <w:t>[3].improve }}</w:t>
+              <w:t>[</w:t>
+            </w:r>
+            <w:proofErr w:type="gramEnd"/>
+            <w:r>
+              <w:rPr>
+                <w:color w:val="5B9BD5" w:themeColor="accent5"/>
+              </w:rPr>
+              <w:t>3</w:t>
+            </w:r>
+            <w:proofErr w:type="gramStart"/>
+            <w:r>
+              <w:rPr>
+                <w:color w:val="5B9BD5" w:themeColor="accent5"/>
+              </w:rPr>
+              <w:t>].improve</w:t>
+            </w:r>
+            <w:proofErr w:type="gramEnd"/>
+            <w:r>
+              <w:rPr>
+                <w:color w:val="5B9BD5" w:themeColor="accent5"/>
+              </w:rPr>
+              <w:t xml:space="preserve"> }}</w:t>
             </w:r>
           </w:p>
         </w:tc>
@@ -4407,6 +5775,7 @@
                 <w:color w:val="000000" w:themeColor="text1"/>
               </w:rPr>
             </w:pPr>
+            <w:proofErr w:type="gramStart"/>
             <w:r>
               <w:rPr>
                 <w:color w:val="000000" w:themeColor="text1"/>
@@ -4418,14 +5787,49 @@
               <w:rPr>
                 <w:color w:val="000000" w:themeColor="text1"/>
               </w:rPr>
-              <w:t>qr.concepts</w:t>
+              <w:t>qr</w:t>
+            </w:r>
+            <w:proofErr w:type="gramEnd"/>
+            <w:r>
+              <w:rPr>
+                <w:color w:val="000000" w:themeColor="text1"/>
+              </w:rPr>
+              <w:t>.</w:t>
+            </w:r>
+            <w:proofErr w:type="gramStart"/>
+            <w:r>
+              <w:rPr>
+                <w:color w:val="000000" w:themeColor="text1"/>
+              </w:rPr>
+              <w:t>concepts</w:t>
             </w:r>
             <w:proofErr w:type="spellEnd"/>
             <w:r>
               <w:rPr>
                 <w:color w:val="000000" w:themeColor="text1"/>
               </w:rPr>
-              <w:t>[4].questions }}</w:t>
+              <w:t>[</w:t>
+            </w:r>
+            <w:proofErr w:type="gramEnd"/>
+            <w:r>
+              <w:rPr>
+                <w:color w:val="000000" w:themeColor="text1"/>
+              </w:rPr>
+              <w:t>4</w:t>
+            </w:r>
+            <w:proofErr w:type="gramStart"/>
+            <w:r>
+              <w:rPr>
+                <w:color w:val="000000" w:themeColor="text1"/>
+              </w:rPr>
+              <w:t>].questions</w:t>
+            </w:r>
+            <w:proofErr w:type="gramEnd"/>
+            <w:r>
+              <w:rPr>
+                <w:color w:val="000000" w:themeColor="text1"/>
+              </w:rPr>
+              <w:t xml:space="preserve"> }}</w:t>
             </w:r>
           </w:p>
         </w:tc>
@@ -4452,6 +5856,7 @@
                 <w:color w:val="5B9BD5" w:themeColor="accent5"/>
               </w:rPr>
             </w:pPr>
+            <w:proofErr w:type="gramStart"/>
             <w:r>
               <w:rPr>
                 <w:color w:val="5B9BD5" w:themeColor="accent5"/>
@@ -4463,21 +5868,56 @@
               <w:rPr>
                 <w:color w:val="5B9BD5" w:themeColor="accent5"/>
               </w:rPr>
-              <w:t>qr.concepts</w:t>
+              <w:t>qr</w:t>
+            </w:r>
+            <w:proofErr w:type="gramEnd"/>
+            <w:r>
+              <w:rPr>
+                <w:color w:val="5B9BD5" w:themeColor="accent5"/>
+              </w:rPr>
+              <w:t>.</w:t>
+            </w:r>
+            <w:proofErr w:type="gramStart"/>
+            <w:r>
+              <w:rPr>
+                <w:color w:val="5B9BD5" w:themeColor="accent5"/>
+              </w:rPr>
+              <w:t>concepts</w:t>
             </w:r>
             <w:proofErr w:type="spellEnd"/>
             <w:r>
               <w:rPr>
                 <w:color w:val="5B9BD5" w:themeColor="accent5"/>
               </w:rPr>
-              <w:t>[4].</w:t>
+              <w:t>[</w:t>
+            </w:r>
+            <w:proofErr w:type="gramEnd"/>
+            <w:r>
+              <w:rPr>
+                <w:color w:val="5B9BD5" w:themeColor="accent5"/>
+              </w:rPr>
+              <w:t>4</w:t>
+            </w:r>
+            <w:proofErr w:type="gramStart"/>
+            <w:r>
+              <w:rPr>
+                <w:color w:val="5B9BD5" w:themeColor="accent5"/>
+              </w:rPr>
+              <w:t>].</w:t>
             </w:r>
             <w:proofErr w:type="spellStart"/>
             <w:r>
               <w:rPr>
                 <w:color w:val="5B9BD5" w:themeColor="accent5"/>
               </w:rPr>
-              <w:t>done_well</w:t>
+              <w:t>done</w:t>
+            </w:r>
+            <w:proofErr w:type="gramEnd"/>
+            <w:r>
+              <w:rPr>
+                <w:color w:val="5B9BD5" w:themeColor="accent5"/>
+              </w:rPr>
+              <w:t>_well</w:t>
             </w:r>
             <w:proofErr w:type="spellEnd"/>
             <w:r>
@@ -4511,6 +5951,7 @@
                 <w:color w:val="5B9BD5" w:themeColor="accent5"/>
               </w:rPr>
             </w:pPr>
+            <w:proofErr w:type="gramStart"/>
             <w:r>
               <w:rPr>
                 <w:color w:val="5B9BD5" w:themeColor="accent5"/>
@@ -4522,14 +5963,49 @@
               <w:rPr>
                 <w:color w:val="5B9BD5" w:themeColor="accent5"/>
               </w:rPr>
-              <w:t>qr.concepts</w:t>
+              <w:t>qr</w:t>
+            </w:r>
+            <w:proofErr w:type="gramEnd"/>
+            <w:r>
+              <w:rPr>
+                <w:color w:val="5B9BD5" w:themeColor="accent5"/>
+              </w:rPr>
+              <w:t>.</w:t>
+            </w:r>
+            <w:proofErr w:type="gramStart"/>
+            <w:r>
+              <w:rPr>
+                <w:color w:val="5B9BD5" w:themeColor="accent5"/>
+              </w:rPr>
+              <w:t>concepts</w:t>
             </w:r>
             <w:proofErr w:type="spellEnd"/>
             <w:r>
               <w:rPr>
                 <w:color w:val="5B9BD5" w:themeColor="accent5"/>
               </w:rPr>
-              <w:t>[4].improve }}</w:t>
+              <w:t>[</w:t>
+            </w:r>
+            <w:proofErr w:type="gramEnd"/>
+            <w:r>
+              <w:rPr>
+                <w:color w:val="5B9BD5" w:themeColor="accent5"/>
+              </w:rPr>
+              <w:t>4</w:t>
+            </w:r>
+            <w:proofErr w:type="gramStart"/>
+            <w:r>
+              <w:rPr>
+                <w:color w:val="5B9BD5" w:themeColor="accent5"/>
+              </w:rPr>
+              <w:t>].improve</w:t>
+            </w:r>
+            <w:proofErr w:type="gramEnd"/>
+            <w:r>
+              <w:rPr>
+                <w:color w:val="5B9BD5" w:themeColor="accent5"/>
+              </w:rPr>
+              <w:t xml:space="preserve"> }}</w:t>
             </w:r>
           </w:p>
         </w:tc>
@@ -4586,6 +6062,7 @@
                 <w:color w:val="000000" w:themeColor="text1"/>
               </w:rPr>
             </w:pPr>
+            <w:proofErr w:type="gramStart"/>
             <w:r>
               <w:rPr>
                 <w:color w:val="000000" w:themeColor="text1"/>
@@ -4597,14 +6074,49 @@
               <w:rPr>
                 <w:color w:val="000000" w:themeColor="text1"/>
               </w:rPr>
-              <w:t>qr.concepts</w:t>
+              <w:t>qr</w:t>
+            </w:r>
+            <w:proofErr w:type="gramEnd"/>
+            <w:r>
+              <w:rPr>
+                <w:color w:val="000000" w:themeColor="text1"/>
+              </w:rPr>
+              <w:t>.</w:t>
+            </w:r>
+            <w:proofErr w:type="gramStart"/>
+            <w:r>
+              <w:rPr>
+                <w:color w:val="000000" w:themeColor="text1"/>
+              </w:rPr>
+              <w:t>concepts</w:t>
             </w:r>
             <w:proofErr w:type="spellEnd"/>
             <w:r>
               <w:rPr>
                 <w:color w:val="000000" w:themeColor="text1"/>
               </w:rPr>
-              <w:t>[5].questions }}</w:t>
+              <w:t>[</w:t>
+            </w:r>
+            <w:proofErr w:type="gramEnd"/>
+            <w:r>
+              <w:rPr>
+                <w:color w:val="000000" w:themeColor="text1"/>
+              </w:rPr>
+              <w:t>5</w:t>
+            </w:r>
+            <w:proofErr w:type="gramStart"/>
+            <w:r>
+              <w:rPr>
+                <w:color w:val="000000" w:themeColor="text1"/>
+              </w:rPr>
+              <w:t>].questions</w:t>
+            </w:r>
+            <w:proofErr w:type="gramEnd"/>
+            <w:r>
+              <w:rPr>
+                <w:color w:val="000000" w:themeColor="text1"/>
+              </w:rPr>
+              <w:t xml:space="preserve"> }}</w:t>
             </w:r>
           </w:p>
         </w:tc>
@@ -4631,6 +6143,7 @@
                 <w:color w:val="5B9BD5" w:themeColor="accent5"/>
               </w:rPr>
             </w:pPr>
+            <w:proofErr w:type="gramStart"/>
             <w:r>
               <w:rPr>
                 <w:color w:val="5B9BD5" w:themeColor="accent5"/>
@@ -4642,21 +6155,56 @@
               <w:rPr>
                 <w:color w:val="5B9BD5" w:themeColor="accent5"/>
               </w:rPr>
-              <w:t>qr.concepts</w:t>
+              <w:t>qr</w:t>
+            </w:r>
+            <w:proofErr w:type="gramEnd"/>
+            <w:r>
+              <w:rPr>
+                <w:color w:val="5B9BD5" w:themeColor="accent5"/>
+              </w:rPr>
+              <w:t>.</w:t>
+            </w:r>
+            <w:proofErr w:type="gramStart"/>
+            <w:r>
+              <w:rPr>
+                <w:color w:val="5B9BD5" w:themeColor="accent5"/>
+              </w:rPr>
+              <w:t>concepts</w:t>
             </w:r>
             <w:proofErr w:type="spellEnd"/>
             <w:r>
               <w:rPr>
                 <w:color w:val="5B9BD5" w:themeColor="accent5"/>
               </w:rPr>
-              <w:t>[5].</w:t>
+              <w:t>[</w:t>
+            </w:r>
+            <w:proofErr w:type="gramEnd"/>
+            <w:r>
+              <w:rPr>
+                <w:color w:val="5B9BD5" w:themeColor="accent5"/>
+              </w:rPr>
+              <w:t>5</w:t>
+            </w:r>
+            <w:proofErr w:type="gramStart"/>
+            <w:r>
+              <w:rPr>
+                <w:color w:val="5B9BD5" w:themeColor="accent5"/>
+              </w:rPr>
+              <w:t>].</w:t>
             </w:r>
             <w:proofErr w:type="spellStart"/>
             <w:r>
               <w:rPr>
                 <w:color w:val="5B9BD5" w:themeColor="accent5"/>
               </w:rPr>
-              <w:t>done_well</w:t>
+              <w:t>done</w:t>
+            </w:r>
+            <w:proofErr w:type="gramEnd"/>
+            <w:r>
+              <w:rPr>
+                <w:color w:val="5B9BD5" w:themeColor="accent5"/>
+              </w:rPr>
+              <w:t>_well</w:t>
             </w:r>
             <w:proofErr w:type="spellEnd"/>
             <w:r>
@@ -4690,6 +6238,7 @@
                 <w:color w:val="5B9BD5" w:themeColor="accent5"/>
               </w:rPr>
             </w:pPr>
+            <w:proofErr w:type="gramStart"/>
             <w:r>
               <w:rPr>
                 <w:color w:val="5B9BD5" w:themeColor="accent5"/>
@@ -4701,14 +6250,49 @@
               <w:rPr>
                 <w:color w:val="5B9BD5" w:themeColor="accent5"/>
               </w:rPr>
-              <w:t>qr.concepts</w:t>
+              <w:t>qr</w:t>
+            </w:r>
+            <w:proofErr w:type="gramEnd"/>
+            <w:r>
+              <w:rPr>
+                <w:color w:val="5B9BD5" w:themeColor="accent5"/>
+              </w:rPr>
+              <w:t>.</w:t>
+            </w:r>
+            <w:proofErr w:type="gramStart"/>
+            <w:r>
+              <w:rPr>
+                <w:color w:val="5B9BD5" w:themeColor="accent5"/>
+              </w:rPr>
+              <w:t>concepts</w:t>
             </w:r>
             <w:proofErr w:type="spellEnd"/>
             <w:r>
               <w:rPr>
                 <w:color w:val="5B9BD5" w:themeColor="accent5"/>
               </w:rPr>
-              <w:t>[5].improve }}</w:t>
+              <w:t>[</w:t>
+            </w:r>
+            <w:proofErr w:type="gramEnd"/>
+            <w:r>
+              <w:rPr>
+                <w:color w:val="5B9BD5" w:themeColor="accent5"/>
+              </w:rPr>
+              <w:t>5</w:t>
+            </w:r>
+            <w:proofErr w:type="gramStart"/>
+            <w:r>
+              <w:rPr>
+                <w:color w:val="5B9BD5" w:themeColor="accent5"/>
+              </w:rPr>
+              <w:t>].improve</w:t>
+            </w:r>
+            <w:proofErr w:type="gramEnd"/>
+            <w:r>
+              <w:rPr>
+                <w:color w:val="5B9BD5" w:themeColor="accent5"/>
+              </w:rPr>
+              <w:t xml:space="preserve"> }}</w:t>
             </w:r>
           </w:p>
         </w:tc>
@@ -4768,6 +6352,7 @@
                 <w:color w:val="000000" w:themeColor="text1"/>
               </w:rPr>
             </w:pPr>
+            <w:proofErr w:type="gramStart"/>
             <w:r>
               <w:rPr>
                 <w:color w:val="000000" w:themeColor="text1"/>
@@ -4779,14 +6364,49 @@
               <w:rPr>
                 <w:color w:val="000000" w:themeColor="text1"/>
               </w:rPr>
-              <w:t>qr.concepts</w:t>
+              <w:t>qr</w:t>
+            </w:r>
+            <w:proofErr w:type="gramEnd"/>
+            <w:r>
+              <w:rPr>
+                <w:color w:val="000000" w:themeColor="text1"/>
+              </w:rPr>
+              <w:t>.</w:t>
+            </w:r>
+            <w:proofErr w:type="gramStart"/>
+            <w:r>
+              <w:rPr>
+                <w:color w:val="000000" w:themeColor="text1"/>
+              </w:rPr>
+              <w:t>concepts</w:t>
             </w:r>
             <w:proofErr w:type="spellEnd"/>
             <w:r>
               <w:rPr>
                 <w:color w:val="000000" w:themeColor="text1"/>
               </w:rPr>
-              <w:t>[6].questions }}</w:t>
+              <w:t>[</w:t>
+            </w:r>
+            <w:proofErr w:type="gramEnd"/>
+            <w:r>
+              <w:rPr>
+                <w:color w:val="000000" w:themeColor="text1"/>
+              </w:rPr>
+              <w:t>6</w:t>
+            </w:r>
+            <w:proofErr w:type="gramStart"/>
+            <w:r>
+              <w:rPr>
+                <w:color w:val="000000" w:themeColor="text1"/>
+              </w:rPr>
+              <w:t>].questions</w:t>
+            </w:r>
+            <w:proofErr w:type="gramEnd"/>
+            <w:r>
+              <w:rPr>
+                <w:color w:val="000000" w:themeColor="text1"/>
+              </w:rPr>
+              <w:t xml:space="preserve"> }}</w:t>
             </w:r>
           </w:p>
         </w:tc>
@@ -4813,6 +6433,7 @@
                 <w:color w:val="5B9BD5" w:themeColor="accent5"/>
               </w:rPr>
             </w:pPr>
+            <w:proofErr w:type="gramStart"/>
             <w:r>
               <w:rPr>
                 <w:color w:val="5B9BD5" w:themeColor="accent5"/>
@@ -4824,21 +6445,56 @@
               <w:rPr>
                 <w:color w:val="5B9BD5" w:themeColor="accent5"/>
               </w:rPr>
-              <w:t>qr.concepts</w:t>
+              <w:t>qr</w:t>
+            </w:r>
+            <w:proofErr w:type="gramEnd"/>
+            <w:r>
+              <w:rPr>
+                <w:color w:val="5B9BD5" w:themeColor="accent5"/>
+              </w:rPr>
+              <w:t>.</w:t>
+            </w:r>
+            <w:proofErr w:type="gramStart"/>
+            <w:r>
+              <w:rPr>
+                <w:color w:val="5B9BD5" w:themeColor="accent5"/>
+              </w:rPr>
+              <w:t>concepts</w:t>
             </w:r>
             <w:proofErr w:type="spellEnd"/>
             <w:r>
               <w:rPr>
                 <w:color w:val="5B9BD5" w:themeColor="accent5"/>
               </w:rPr>
-              <w:t>[6].</w:t>
+              <w:t>[</w:t>
+            </w:r>
+            <w:proofErr w:type="gramEnd"/>
+            <w:r>
+              <w:rPr>
+                <w:color w:val="5B9BD5" w:themeColor="accent5"/>
+              </w:rPr>
+              <w:t>6</w:t>
+            </w:r>
+            <w:proofErr w:type="gramStart"/>
+            <w:r>
+              <w:rPr>
+                <w:color w:val="5B9BD5" w:themeColor="accent5"/>
+              </w:rPr>
+              <w:t>].</w:t>
             </w:r>
             <w:proofErr w:type="spellStart"/>
             <w:r>
               <w:rPr>
                 <w:color w:val="5B9BD5" w:themeColor="accent5"/>
               </w:rPr>
-              <w:t>done_well</w:t>
+              <w:t>done</w:t>
+            </w:r>
+            <w:proofErr w:type="gramEnd"/>
+            <w:r>
+              <w:rPr>
+                <w:color w:val="5B9BD5" w:themeColor="accent5"/>
+              </w:rPr>
+              <w:t>_well</w:t>
             </w:r>
             <w:proofErr w:type="spellEnd"/>
             <w:r>
@@ -4872,6 +6528,7 @@
                 <w:color w:val="5B9BD5" w:themeColor="accent5"/>
               </w:rPr>
             </w:pPr>
+            <w:proofErr w:type="gramStart"/>
             <w:r>
               <w:rPr>
                 <w:color w:val="5B9BD5" w:themeColor="accent5"/>
@@ -4883,14 +6540,49 @@
               <w:rPr>
                 <w:color w:val="5B9BD5" w:themeColor="accent5"/>
               </w:rPr>
-              <w:t>qr.concepts</w:t>
+              <w:t>qr</w:t>
+            </w:r>
+            <w:proofErr w:type="gramEnd"/>
+            <w:r>
+              <w:rPr>
+                <w:color w:val="5B9BD5" w:themeColor="accent5"/>
+              </w:rPr>
+              <w:t>.</w:t>
+            </w:r>
+            <w:proofErr w:type="gramStart"/>
+            <w:r>
+              <w:rPr>
+                <w:color w:val="5B9BD5" w:themeColor="accent5"/>
+              </w:rPr>
+              <w:t>concepts</w:t>
             </w:r>
             <w:proofErr w:type="spellEnd"/>
             <w:r>
               <w:rPr>
                 <w:color w:val="5B9BD5" w:themeColor="accent5"/>
               </w:rPr>
-              <w:t>[6].improve }}</w:t>
+              <w:t>[</w:t>
+            </w:r>
+            <w:proofErr w:type="gramEnd"/>
+            <w:r>
+              <w:rPr>
+                <w:color w:val="5B9BD5" w:themeColor="accent5"/>
+              </w:rPr>
+              <w:t>6</w:t>
+            </w:r>
+            <w:proofErr w:type="gramStart"/>
+            <w:r>
+              <w:rPr>
+                <w:color w:val="5B9BD5" w:themeColor="accent5"/>
+              </w:rPr>
+              <w:t>].improve</w:t>
+            </w:r>
+            <w:proofErr w:type="gramEnd"/>
+            <w:r>
+              <w:rPr>
+                <w:color w:val="5B9BD5" w:themeColor="accent5"/>
+              </w:rPr>
+              <w:t xml:space="preserve"> }}</w:t>
             </w:r>
           </w:p>
         </w:tc>
@@ -4947,6 +6639,7 @@
                 <w:color w:val="000000" w:themeColor="text1"/>
               </w:rPr>
             </w:pPr>
+            <w:proofErr w:type="gramStart"/>
             <w:r>
               <w:rPr>
                 <w:color w:val="000000" w:themeColor="text1"/>
@@ -4958,14 +6651,49 @@
               <w:rPr>
                 <w:color w:val="000000" w:themeColor="text1"/>
               </w:rPr>
-              <w:t>qr.concepts</w:t>
+              <w:t>qr</w:t>
+            </w:r>
+            <w:proofErr w:type="gramEnd"/>
+            <w:r>
+              <w:rPr>
+                <w:color w:val="000000" w:themeColor="text1"/>
+              </w:rPr>
+              <w:t>.</w:t>
+            </w:r>
+            <w:proofErr w:type="gramStart"/>
+            <w:r>
+              <w:rPr>
+                <w:color w:val="000000" w:themeColor="text1"/>
+              </w:rPr>
+              <w:t>concepts</w:t>
             </w:r>
             <w:proofErr w:type="spellEnd"/>
             <w:r>
               <w:rPr>
                 <w:color w:val="000000" w:themeColor="text1"/>
               </w:rPr>
-              <w:t>[7].questions }}</w:t>
+              <w:t>[</w:t>
+            </w:r>
+            <w:proofErr w:type="gramEnd"/>
+            <w:r>
+              <w:rPr>
+                <w:color w:val="000000" w:themeColor="text1"/>
+              </w:rPr>
+              <w:t>7</w:t>
+            </w:r>
+            <w:proofErr w:type="gramStart"/>
+            <w:r>
+              <w:rPr>
+                <w:color w:val="000000" w:themeColor="text1"/>
+              </w:rPr>
+              <w:t>].questions</w:t>
+            </w:r>
+            <w:proofErr w:type="gramEnd"/>
+            <w:r>
+              <w:rPr>
+                <w:color w:val="000000" w:themeColor="text1"/>
+              </w:rPr>
+              <w:t xml:space="preserve"> }}</w:t>
             </w:r>
           </w:p>
         </w:tc>
@@ -4992,6 +6720,7 @@
                 <w:color w:val="5B9BD5" w:themeColor="accent5"/>
               </w:rPr>
             </w:pPr>
+            <w:proofErr w:type="gramStart"/>
             <w:r>
               <w:rPr>
                 <w:color w:val="5B9BD5" w:themeColor="accent5"/>
@@ -5003,21 +6732,56 @@
               <w:rPr>
                 <w:color w:val="5B9BD5" w:themeColor="accent5"/>
               </w:rPr>
-              <w:t>qr.concepts</w:t>
+              <w:t>qr</w:t>
+            </w:r>
+            <w:proofErr w:type="gramEnd"/>
+            <w:r>
+              <w:rPr>
+                <w:color w:val="5B9BD5" w:themeColor="accent5"/>
+              </w:rPr>
+              <w:t>.</w:t>
+            </w:r>
+            <w:proofErr w:type="gramStart"/>
+            <w:r>
+              <w:rPr>
+                <w:color w:val="5B9BD5" w:themeColor="accent5"/>
+              </w:rPr>
+              <w:t>concepts</w:t>
             </w:r>
             <w:proofErr w:type="spellEnd"/>
             <w:r>
               <w:rPr>
                 <w:color w:val="5B9BD5" w:themeColor="accent5"/>
               </w:rPr>
-              <w:t>[7].</w:t>
+              <w:t>[</w:t>
+            </w:r>
+            <w:proofErr w:type="gramEnd"/>
+            <w:r>
+              <w:rPr>
+                <w:color w:val="5B9BD5" w:themeColor="accent5"/>
+              </w:rPr>
+              <w:t>7</w:t>
+            </w:r>
+            <w:proofErr w:type="gramStart"/>
+            <w:r>
+              <w:rPr>
+                <w:color w:val="5B9BD5" w:themeColor="accent5"/>
+              </w:rPr>
+              <w:t>].</w:t>
             </w:r>
             <w:proofErr w:type="spellStart"/>
             <w:r>
               <w:rPr>
                 <w:color w:val="5B9BD5" w:themeColor="accent5"/>
               </w:rPr>
-              <w:t>done_well</w:t>
+              <w:t>done</w:t>
+            </w:r>
+            <w:proofErr w:type="gramEnd"/>
+            <w:r>
+              <w:rPr>
+                <w:color w:val="5B9BD5" w:themeColor="accent5"/>
+              </w:rPr>
+              <w:t>_well</w:t>
             </w:r>
             <w:proofErr w:type="spellEnd"/>
             <w:r>
@@ -5051,6 +6815,7 @@
                 <w:color w:val="5B9BD5" w:themeColor="accent5"/>
               </w:rPr>
             </w:pPr>
+            <w:proofErr w:type="gramStart"/>
             <w:r>
               <w:rPr>
                 <w:color w:val="5B9BD5" w:themeColor="accent5"/>
@@ -5062,14 +6827,49 @@
               <w:rPr>
                 <w:color w:val="5B9BD5" w:themeColor="accent5"/>
               </w:rPr>
-              <w:t>qr.concepts</w:t>
+              <w:t>qr</w:t>
+            </w:r>
+            <w:proofErr w:type="gramEnd"/>
+            <w:r>
+              <w:rPr>
+                <w:color w:val="5B9BD5" w:themeColor="accent5"/>
+              </w:rPr>
+              <w:t>.</w:t>
+            </w:r>
+            <w:proofErr w:type="gramStart"/>
+            <w:r>
+              <w:rPr>
+                <w:color w:val="5B9BD5" w:themeColor="accent5"/>
+              </w:rPr>
+              <w:t>concepts</w:t>
             </w:r>
             <w:proofErr w:type="spellEnd"/>
             <w:r>
               <w:rPr>
                 <w:color w:val="5B9BD5" w:themeColor="accent5"/>
               </w:rPr>
-              <w:t>[7].improve }}</w:t>
+              <w:t>[</w:t>
+            </w:r>
+            <w:proofErr w:type="gramEnd"/>
+            <w:r>
+              <w:rPr>
+                <w:color w:val="5B9BD5" w:themeColor="accent5"/>
+              </w:rPr>
+              <w:t>7</w:t>
+            </w:r>
+            <w:proofErr w:type="gramStart"/>
+            <w:r>
+              <w:rPr>
+                <w:color w:val="5B9BD5" w:themeColor="accent5"/>
+              </w:rPr>
+              <w:t>].improve</w:t>
+            </w:r>
+            <w:proofErr w:type="gramEnd"/>
+            <w:r>
+              <w:rPr>
+                <w:color w:val="5B9BD5" w:themeColor="accent5"/>
+              </w:rPr>
+              <w:t xml:space="preserve"> }}</w:t>
             </w:r>
           </w:p>
         </w:tc>
@@ -5126,6 +6926,7 @@
                 <w:color w:val="000000" w:themeColor="text1"/>
               </w:rPr>
             </w:pPr>
+            <w:proofErr w:type="gramStart"/>
             <w:r>
               <w:rPr>
                 <w:color w:val="000000" w:themeColor="text1"/>
@@ -5137,14 +6938,49 @@
               <w:rPr>
                 <w:color w:val="000000" w:themeColor="text1"/>
               </w:rPr>
-              <w:t>qr.concepts</w:t>
+              <w:t>qr</w:t>
+            </w:r>
+            <w:proofErr w:type="gramEnd"/>
+            <w:r>
+              <w:rPr>
+                <w:color w:val="000000" w:themeColor="text1"/>
+              </w:rPr>
+              <w:t>.</w:t>
+            </w:r>
+            <w:proofErr w:type="gramStart"/>
+            <w:r>
+              <w:rPr>
+                <w:color w:val="000000" w:themeColor="text1"/>
+              </w:rPr>
+              <w:t>concepts</w:t>
             </w:r>
             <w:proofErr w:type="spellEnd"/>
             <w:r>
               <w:rPr>
                 <w:color w:val="000000" w:themeColor="text1"/>
               </w:rPr>
-              <w:t>[8].questions }}</w:t>
+              <w:t>[</w:t>
+            </w:r>
+            <w:proofErr w:type="gramEnd"/>
+            <w:r>
+              <w:rPr>
+                <w:color w:val="000000" w:themeColor="text1"/>
+              </w:rPr>
+              <w:t>8</w:t>
+            </w:r>
+            <w:proofErr w:type="gramStart"/>
+            <w:r>
+              <w:rPr>
+                <w:color w:val="000000" w:themeColor="text1"/>
+              </w:rPr>
+              <w:t>].questions</w:t>
+            </w:r>
+            <w:proofErr w:type="gramEnd"/>
+            <w:r>
+              <w:rPr>
+                <w:color w:val="000000" w:themeColor="text1"/>
+              </w:rPr>
+              <w:t xml:space="preserve"> }}</w:t>
             </w:r>
           </w:p>
         </w:tc>
@@ -5171,6 +7007,7 @@
                 <w:color w:val="5B9BD5" w:themeColor="accent5"/>
               </w:rPr>
             </w:pPr>
+            <w:proofErr w:type="gramStart"/>
             <w:r>
               <w:rPr>
                 <w:color w:val="5B9BD5" w:themeColor="accent5"/>
@@ -5182,21 +7019,56 @@
               <w:rPr>
                 <w:color w:val="5B9BD5" w:themeColor="accent5"/>
               </w:rPr>
-              <w:t>qr.concepts</w:t>
+              <w:t>qr</w:t>
+            </w:r>
+            <w:proofErr w:type="gramEnd"/>
+            <w:r>
+              <w:rPr>
+                <w:color w:val="5B9BD5" w:themeColor="accent5"/>
+              </w:rPr>
+              <w:t>.</w:t>
+            </w:r>
+            <w:proofErr w:type="gramStart"/>
+            <w:r>
+              <w:rPr>
+                <w:color w:val="5B9BD5" w:themeColor="accent5"/>
+              </w:rPr>
+              <w:t>concepts</w:t>
             </w:r>
             <w:proofErr w:type="spellEnd"/>
             <w:r>
               <w:rPr>
                 <w:color w:val="5B9BD5" w:themeColor="accent5"/>
               </w:rPr>
-              <w:t>[8].</w:t>
+              <w:t>[</w:t>
+            </w:r>
+            <w:proofErr w:type="gramEnd"/>
+            <w:r>
+              <w:rPr>
+                <w:color w:val="5B9BD5" w:themeColor="accent5"/>
+              </w:rPr>
+              <w:t>8</w:t>
+            </w:r>
+            <w:proofErr w:type="gramStart"/>
+            <w:r>
+              <w:rPr>
+                <w:color w:val="5B9BD5" w:themeColor="accent5"/>
+              </w:rPr>
+              <w:t>].</w:t>
             </w:r>
             <w:proofErr w:type="spellStart"/>
             <w:r>
               <w:rPr>
                 <w:color w:val="5B9BD5" w:themeColor="accent5"/>
               </w:rPr>
-              <w:t>done_well</w:t>
+              <w:t>done</w:t>
+            </w:r>
+            <w:proofErr w:type="gramEnd"/>
+            <w:r>
+              <w:rPr>
+                <w:color w:val="5B9BD5" w:themeColor="accent5"/>
+              </w:rPr>
+              <w:t>_well</w:t>
             </w:r>
             <w:proofErr w:type="spellEnd"/>
             <w:r>
@@ -5230,6 +7102,7 @@
                 <w:color w:val="5B9BD5" w:themeColor="accent5"/>
               </w:rPr>
             </w:pPr>
+            <w:proofErr w:type="gramStart"/>
             <w:r>
               <w:rPr>
                 <w:color w:val="5B9BD5" w:themeColor="accent5"/>
@@ -5241,14 +7114,49 @@
               <w:rPr>
                 <w:color w:val="5B9BD5" w:themeColor="accent5"/>
               </w:rPr>
-              <w:t>qr.concepts</w:t>
+              <w:t>qr</w:t>
+            </w:r>
+            <w:proofErr w:type="gramEnd"/>
+            <w:r>
+              <w:rPr>
+                <w:color w:val="5B9BD5" w:themeColor="accent5"/>
+              </w:rPr>
+              <w:t>.</w:t>
+            </w:r>
+            <w:proofErr w:type="gramStart"/>
+            <w:r>
+              <w:rPr>
+                <w:color w:val="5B9BD5" w:themeColor="accent5"/>
+              </w:rPr>
+              <w:t>concepts</w:t>
             </w:r>
             <w:proofErr w:type="spellEnd"/>
             <w:r>
               <w:rPr>
                 <w:color w:val="5B9BD5" w:themeColor="accent5"/>
               </w:rPr>
-              <w:t>[8].improve }}</w:t>
+              <w:t>[</w:t>
+            </w:r>
+            <w:proofErr w:type="gramEnd"/>
+            <w:r>
+              <w:rPr>
+                <w:color w:val="5B9BD5" w:themeColor="accent5"/>
+              </w:rPr>
+              <w:t>8</w:t>
+            </w:r>
+            <w:proofErr w:type="gramStart"/>
+            <w:r>
+              <w:rPr>
+                <w:color w:val="5B9BD5" w:themeColor="accent5"/>
+              </w:rPr>
+              <w:t>].improve</w:t>
+            </w:r>
+            <w:proofErr w:type="gramEnd"/>
+            <w:r>
+              <w:rPr>
+                <w:color w:val="5B9BD5" w:themeColor="accent5"/>
+              </w:rPr>
+              <w:t xml:space="preserve"> }}</w:t>
             </w:r>
           </w:p>
         </w:tc>
@@ -5305,6 +7213,7 @@
                 <w:color w:val="000000" w:themeColor="text1"/>
               </w:rPr>
             </w:pPr>
+            <w:proofErr w:type="gramStart"/>
             <w:r>
               <w:rPr>
                 <w:color w:val="000000" w:themeColor="text1"/>
@@ -5316,14 +7225,49 @@
               <w:rPr>
                 <w:color w:val="000000" w:themeColor="text1"/>
               </w:rPr>
-              <w:t>qr.concepts</w:t>
+              <w:t>qr</w:t>
+            </w:r>
+            <w:proofErr w:type="gramEnd"/>
+            <w:r>
+              <w:rPr>
+                <w:color w:val="000000" w:themeColor="text1"/>
+              </w:rPr>
+              <w:t>.</w:t>
+            </w:r>
+            <w:proofErr w:type="gramStart"/>
+            <w:r>
+              <w:rPr>
+                <w:color w:val="000000" w:themeColor="text1"/>
+              </w:rPr>
+              <w:t>concepts</w:t>
             </w:r>
             <w:proofErr w:type="spellEnd"/>
             <w:r>
               <w:rPr>
                 <w:color w:val="000000" w:themeColor="text1"/>
               </w:rPr>
-              <w:t>[9].questions }}</w:t>
+              <w:t>[</w:t>
+            </w:r>
+            <w:proofErr w:type="gramEnd"/>
+            <w:r>
+              <w:rPr>
+                <w:color w:val="000000" w:themeColor="text1"/>
+              </w:rPr>
+              <w:t>9</w:t>
+            </w:r>
+            <w:proofErr w:type="gramStart"/>
+            <w:r>
+              <w:rPr>
+                <w:color w:val="000000" w:themeColor="text1"/>
+              </w:rPr>
+              <w:t>].questions</w:t>
+            </w:r>
+            <w:proofErr w:type="gramEnd"/>
+            <w:r>
+              <w:rPr>
+                <w:color w:val="000000" w:themeColor="text1"/>
+              </w:rPr>
+              <w:t xml:space="preserve"> }}</w:t>
             </w:r>
           </w:p>
         </w:tc>
@@ -5350,6 +7294,7 @@
                 <w:color w:val="5B9BD5" w:themeColor="accent5"/>
               </w:rPr>
             </w:pPr>
+            <w:proofErr w:type="gramStart"/>
             <w:r>
               <w:rPr>
                 <w:color w:val="5B9BD5" w:themeColor="accent5"/>
@@ -5361,21 +7306,56 @@
               <w:rPr>
                 <w:color w:val="5B9BD5" w:themeColor="accent5"/>
               </w:rPr>
-              <w:t>qr.concepts</w:t>
+              <w:t>qr</w:t>
+            </w:r>
+            <w:proofErr w:type="gramEnd"/>
+            <w:r>
+              <w:rPr>
+                <w:color w:val="5B9BD5" w:themeColor="accent5"/>
+              </w:rPr>
+              <w:t>.</w:t>
+            </w:r>
+            <w:proofErr w:type="gramStart"/>
+            <w:r>
+              <w:rPr>
+                <w:color w:val="5B9BD5" w:themeColor="accent5"/>
+              </w:rPr>
+              <w:t>concepts</w:t>
             </w:r>
             <w:proofErr w:type="spellEnd"/>
             <w:r>
               <w:rPr>
                 <w:color w:val="5B9BD5" w:themeColor="accent5"/>
               </w:rPr>
-              <w:t>[9].</w:t>
+              <w:t>[</w:t>
+            </w:r>
+            <w:proofErr w:type="gramEnd"/>
+            <w:r>
+              <w:rPr>
+                <w:color w:val="5B9BD5" w:themeColor="accent5"/>
+              </w:rPr>
+              <w:t>9</w:t>
+            </w:r>
+            <w:proofErr w:type="gramStart"/>
+            <w:r>
+              <w:rPr>
+                <w:color w:val="5B9BD5" w:themeColor="accent5"/>
+              </w:rPr>
+              <w:t>].</w:t>
             </w:r>
             <w:proofErr w:type="spellStart"/>
             <w:r>
               <w:rPr>
                 <w:color w:val="5B9BD5" w:themeColor="accent5"/>
               </w:rPr>
-              <w:t>done_well</w:t>
+              <w:t>done</w:t>
+            </w:r>
+            <w:proofErr w:type="gramEnd"/>
+            <w:r>
+              <w:rPr>
+                <w:color w:val="5B9BD5" w:themeColor="accent5"/>
+              </w:rPr>
+              <w:t>_well</w:t>
             </w:r>
             <w:proofErr w:type="spellEnd"/>
             <w:r>
@@ -5409,6 +7389,7 @@
                 <w:color w:val="5B9BD5" w:themeColor="accent5"/>
               </w:rPr>
             </w:pPr>
+            <w:proofErr w:type="gramStart"/>
             <w:r>
               <w:rPr>
                 <w:color w:val="5B9BD5" w:themeColor="accent5"/>
@@ -5420,14 +7401,49 @@
               <w:rPr>
                 <w:color w:val="5B9BD5" w:themeColor="accent5"/>
               </w:rPr>
-              <w:t>qr.concepts</w:t>
+              <w:t>qr</w:t>
+            </w:r>
+            <w:proofErr w:type="gramEnd"/>
+            <w:r>
+              <w:rPr>
+                <w:color w:val="5B9BD5" w:themeColor="accent5"/>
+              </w:rPr>
+              <w:t>.</w:t>
+            </w:r>
+            <w:proofErr w:type="gramStart"/>
+            <w:r>
+              <w:rPr>
+                <w:color w:val="5B9BD5" w:themeColor="accent5"/>
+              </w:rPr>
+              <w:t>concepts</w:t>
             </w:r>
             <w:proofErr w:type="spellEnd"/>
             <w:r>
               <w:rPr>
                 <w:color w:val="5B9BD5" w:themeColor="accent5"/>
               </w:rPr>
-              <w:t>[9].improve }}</w:t>
+              <w:t>[</w:t>
+            </w:r>
+            <w:proofErr w:type="gramEnd"/>
+            <w:r>
+              <w:rPr>
+                <w:color w:val="5B9BD5" w:themeColor="accent5"/>
+              </w:rPr>
+              <w:t>9</w:t>
+            </w:r>
+            <w:proofErr w:type="gramStart"/>
+            <w:r>
+              <w:rPr>
+                <w:color w:val="5B9BD5" w:themeColor="accent5"/>
+              </w:rPr>
+              <w:t>].improve</w:t>
+            </w:r>
+            <w:proofErr w:type="gramEnd"/>
+            <w:r>
+              <w:rPr>
+                <w:color w:val="5B9BD5" w:themeColor="accent5"/>
+              </w:rPr>
+              <w:t xml:space="preserve"> }}</w:t>
             </w:r>
           </w:p>
         </w:tc>
@@ -5484,6 +7500,7 @@
                 <w:color w:val="000000" w:themeColor="text1"/>
               </w:rPr>
             </w:pPr>
+            <w:proofErr w:type="gramStart"/>
             <w:r>
               <w:rPr>
                 <w:color w:val="000000" w:themeColor="text1"/>
@@ -5495,14 +7512,49 @@
               <w:rPr>
                 <w:color w:val="000000" w:themeColor="text1"/>
               </w:rPr>
-              <w:t>qr.concepts</w:t>
+              <w:t>qr</w:t>
+            </w:r>
+            <w:proofErr w:type="gramEnd"/>
+            <w:r>
+              <w:rPr>
+                <w:color w:val="000000" w:themeColor="text1"/>
+              </w:rPr>
+              <w:t>.</w:t>
+            </w:r>
+            <w:proofErr w:type="gramStart"/>
+            <w:r>
+              <w:rPr>
+                <w:color w:val="000000" w:themeColor="text1"/>
+              </w:rPr>
+              <w:t>concepts</w:t>
             </w:r>
             <w:proofErr w:type="spellEnd"/>
             <w:r>
               <w:rPr>
                 <w:color w:val="000000" w:themeColor="text1"/>
               </w:rPr>
-              <w:t>[10].questions }}</w:t>
+              <w:t>[</w:t>
+            </w:r>
+            <w:proofErr w:type="gramEnd"/>
+            <w:r>
+              <w:rPr>
+                <w:color w:val="000000" w:themeColor="text1"/>
+              </w:rPr>
+              <w:t>10</w:t>
+            </w:r>
+            <w:proofErr w:type="gramStart"/>
+            <w:r>
+              <w:rPr>
+                <w:color w:val="000000" w:themeColor="text1"/>
+              </w:rPr>
+              <w:t>].questions</w:t>
+            </w:r>
+            <w:proofErr w:type="gramEnd"/>
+            <w:r>
+              <w:rPr>
+                <w:color w:val="000000" w:themeColor="text1"/>
+              </w:rPr>
+              <w:t xml:space="preserve"> }}</w:t>
             </w:r>
           </w:p>
         </w:tc>
@@ -5529,6 +7581,7 @@
                 <w:color w:val="5B9BD5" w:themeColor="accent5"/>
               </w:rPr>
             </w:pPr>
+            <w:proofErr w:type="gramStart"/>
             <w:r>
               <w:rPr>
                 <w:color w:val="5B9BD5" w:themeColor="accent5"/>
@@ -5540,21 +7593,56 @@
               <w:rPr>
                 <w:color w:val="5B9BD5" w:themeColor="accent5"/>
               </w:rPr>
-              <w:t>qr.concepts</w:t>
+              <w:t>qr</w:t>
+            </w:r>
+            <w:proofErr w:type="gramEnd"/>
+            <w:r>
+              <w:rPr>
+                <w:color w:val="5B9BD5" w:themeColor="accent5"/>
+              </w:rPr>
+              <w:t>.</w:t>
+            </w:r>
+            <w:proofErr w:type="gramStart"/>
+            <w:r>
+              <w:rPr>
+                <w:color w:val="5B9BD5" w:themeColor="accent5"/>
+              </w:rPr>
+              <w:t>concepts</w:t>
             </w:r>
             <w:proofErr w:type="spellEnd"/>
             <w:r>
               <w:rPr>
                 <w:color w:val="5B9BD5" w:themeColor="accent5"/>
               </w:rPr>
-              <w:t>[10].</w:t>
+              <w:t>[</w:t>
+            </w:r>
+            <w:proofErr w:type="gramEnd"/>
+            <w:r>
+              <w:rPr>
+                <w:color w:val="5B9BD5" w:themeColor="accent5"/>
+              </w:rPr>
+              <w:t>10</w:t>
+            </w:r>
+            <w:proofErr w:type="gramStart"/>
+            <w:r>
+              <w:rPr>
+                <w:color w:val="5B9BD5" w:themeColor="accent5"/>
+              </w:rPr>
+              <w:t>].</w:t>
             </w:r>
             <w:proofErr w:type="spellStart"/>
             <w:r>
               <w:rPr>
                 <w:color w:val="5B9BD5" w:themeColor="accent5"/>
               </w:rPr>
-              <w:t>done_well</w:t>
+              <w:t>done</w:t>
+            </w:r>
+            <w:proofErr w:type="gramEnd"/>
+            <w:r>
+              <w:rPr>
+                <w:color w:val="5B9BD5" w:themeColor="accent5"/>
+              </w:rPr>
+              <w:t>_well</w:t>
             </w:r>
             <w:proofErr w:type="spellEnd"/>
             <w:r>
@@ -5588,6 +7676,7 @@
                 <w:color w:val="5B9BD5" w:themeColor="accent5"/>
               </w:rPr>
             </w:pPr>
+            <w:proofErr w:type="gramStart"/>
             <w:r>
               <w:rPr>
                 <w:color w:val="5B9BD5" w:themeColor="accent5"/>
@@ -5599,14 +7688,49 @@
               <w:rPr>
                 <w:color w:val="5B9BD5" w:themeColor="accent5"/>
               </w:rPr>
-              <w:t>qr.concepts</w:t>
+              <w:t>qr</w:t>
+            </w:r>
+            <w:proofErr w:type="gramEnd"/>
+            <w:r>
+              <w:rPr>
+                <w:color w:val="5B9BD5" w:themeColor="accent5"/>
+              </w:rPr>
+              <w:t>.</w:t>
+            </w:r>
+            <w:proofErr w:type="gramStart"/>
+            <w:r>
+              <w:rPr>
+                <w:color w:val="5B9BD5" w:themeColor="accent5"/>
+              </w:rPr>
+              <w:t>concepts</w:t>
             </w:r>
             <w:proofErr w:type="spellEnd"/>
             <w:r>
               <w:rPr>
                 <w:color w:val="5B9BD5" w:themeColor="accent5"/>
               </w:rPr>
-              <w:t>[10].improve }}</w:t>
+              <w:t>[</w:t>
+            </w:r>
+            <w:proofErr w:type="gramEnd"/>
+            <w:r>
+              <w:rPr>
+                <w:color w:val="5B9BD5" w:themeColor="accent5"/>
+              </w:rPr>
+              <w:t>10</w:t>
+            </w:r>
+            <w:proofErr w:type="gramStart"/>
+            <w:r>
+              <w:rPr>
+                <w:color w:val="5B9BD5" w:themeColor="accent5"/>
+              </w:rPr>
+              <w:t>].improve</w:t>
+            </w:r>
+            <w:proofErr w:type="gramEnd"/>
+            <w:r>
+              <w:rPr>
+                <w:color w:val="5B9BD5" w:themeColor="accent5"/>
+              </w:rPr>
+              <w:t xml:space="preserve"> }}</w:t>
             </w:r>
           </w:p>
         </w:tc>
@@ -5932,7 +8056,21 @@
         <w:rPr>
           <w:color w:val="000000"/>
         </w:rPr>
-        <w:t>Keep track of patterns you weren’t able to figure out by yourself -&gt; Write them down and look through them regularly to keep familiar with these patterns</w:t>
+        <w:t xml:space="preserve">Keep track of patterns you </w:t>
+      </w:r>
+      <w:proofErr w:type="gramStart"/>
+      <w:r>
+        <w:rPr>
+          <w:color w:val="000000"/>
+        </w:rPr>
+        <w:t>weren’t able to</w:t>
+      </w:r>
+      <w:proofErr w:type="gramEnd"/>
+      <w:r>
+        <w:rPr>
+          <w:color w:val="000000"/>
+        </w:rPr>
+        <w:t xml:space="preserve"> figure out by yourself -&gt; Write them down and look through them regularly to keep familiar with these patterns</w:t>
       </w:r>
     </w:p>
     <w:p>
@@ -6085,7 +8223,23 @@
         <w:t xml:space="preserve">Leaving Questions Blank: </w:t>
       </w:r>
       <w:r>
-        <w:t>Students are leaving a lot of marks on the table by not attempting all of the questions. Even if they don’t have enough time to actually attempt each question, as soon as they hear that there is 1 minute left, they should guess the questions they didn’t finish, so they at least have a 25% chance of getting it right.</w:t>
+        <w:t xml:space="preserve">Students are leaving a lot of marks on the table by not attempting </w:t>
+      </w:r>
+      <w:proofErr w:type="gramStart"/>
+      <w:r>
+        <w:t>all of</w:t>
+      </w:r>
+      <w:proofErr w:type="gramEnd"/>
+      <w:r>
+        <w:t xml:space="preserve"> the questions. Even if they don’t have enough time to </w:t>
+      </w:r>
+      <w:proofErr w:type="gramStart"/>
+      <w:r>
+        <w:t>actually attempt</w:t>
+      </w:r>
+      <w:proofErr w:type="gramEnd"/>
+      <w:r>
+        <w:t xml:space="preserve"> each question, as soon as they hear that there is 1 minute left, they should guess the questions they didn’t finish, so they at least have a 25% chance of getting it right.</w:t>
       </w:r>
     </w:p>
     <w:p>
@@ -6108,7 +8262,15 @@
         <w:t xml:space="preserve">Spending too long on Questions: </w:t>
       </w:r>
       <w:r>
-        <w:t>Students usually have 1 minute or less per question type, they should keep a mental clock on their head so when they are spending too long on a question, they should either guess it or make a note of it to come back to it later and move on. They do not have enough time to thoroughly finish every question. It is clear that students need more practice under timed conditions so that they develop the mental timing.</w:t>
+        <w:t xml:space="preserve">Students usually have 1 minute or less per question type, they should keep a mental clock on their head so when they are spending too long on a question, they should either guess it or make a note of it to come back to it later and move on. They do not have enough time to thoroughly finish every question. </w:t>
+      </w:r>
+      <w:proofErr w:type="gramStart"/>
+      <w:r>
+        <w:t>It is clear that students</w:t>
+      </w:r>
+      <w:proofErr w:type="gramEnd"/>
+      <w:r>
+        <w:t xml:space="preserve"> need more practice under timed conditions so that they develop the mental timing.</w:t>
       </w:r>
     </w:p>
     <w:p>
@@ -6324,7 +8486,15 @@
         <w:t>Review and Practice</w:t>
       </w:r>
       <w:r>
-        <w:t>: Go through the areas marked for improvement in this report, and review the related topics. We will provide additional exercises and homework focused on these areas in the coming weeks.</w:t>
+        <w:t xml:space="preserve">: Go through the areas marked for improvement in this </w:t>
+      </w:r>
+      <w:proofErr w:type="gramStart"/>
+      <w:r>
+        <w:t>report, and</w:t>
+      </w:r>
+      <w:proofErr w:type="gramEnd"/>
+      <w:r>
+        <w:t xml:space="preserve"> review the related topics. We will provide additional exercises and homework focused on these areas in the coming weeks.</w:t>
       </w:r>
     </w:p>
     <w:p>
@@ -6392,7 +8562,15 @@
         </w:r>
       </w:hyperlink>
       <w:r>
-        <w:t xml:space="preserve">. The platform gives instant feedback, tracks progress, and covers a wide range of GATE-style questions. </w:t>
+        <w:t xml:space="preserve">. The platform gives instant feedback, tracks </w:t>
+      </w:r>
+      <w:proofErr w:type="gramStart"/>
+      <w:r>
+        <w:t>progress, and</w:t>
+      </w:r>
+      <w:proofErr w:type="gramEnd"/>
+      <w:r>
+        <w:t xml:space="preserve"> covers a wide range of GATE-style questions. </w:t>
       </w:r>
       <w:r>
         <w:lastRenderedPageBreak/>
@@ -6434,7 +8612,15 @@
         <w:t>mock</w:t>
       </w:r>
       <w:r>
-        <w:t xml:space="preserve"> exam, and there is still of time before the real ASET: under 3 months for Year 5s, and 14 months for Year 4s. Even if your child didn’t score as hoped, it’s not too late. With the right guidance and effort, they can absolutely work towards gaining entry into top GATE schools.</w:t>
+        <w:t xml:space="preserve"> exam, and there is still of time before the real ASET: under 3 months for Year 5s, and 14 months for Year 4s. Even if your child didn’t score as hoped, it’s not too late. With the right guidance and effort, they can absolutely work towards </w:t>
+      </w:r>
+      <w:proofErr w:type="gramStart"/>
+      <w:r>
+        <w:t>gaining entry into</w:t>
+      </w:r>
+      <w:proofErr w:type="gramEnd"/>
+      <w:r>
+        <w:t xml:space="preserve"> top GATE schools.</w:t>
       </w:r>
     </w:p>
     <w:p/>
@@ -6454,7 +8640,15 @@
           <w:highlight w:val="yellow"/>
           <w:u w:val="single"/>
         </w:rPr>
-        <w:t>April for our Weekly Classes in Term 1</w:t>
+        <w:t xml:space="preserve">April for our Weekly Classes in Term </w:t>
+      </w:r>
+      <w:r>
+        <w:rPr>
+          <w:b/>
+          <w:bCs/>
+          <w:u w:val="single"/>
+        </w:rPr>
+        <w:t>2</w:t>
       </w:r>
       <w:r>
         <w:rPr>
@@ -6528,16 +8722,29 @@
       </w:pPr>
     </w:p>
     <w:p>
+      <w:proofErr w:type="gramStart"/>
       <w:r>
         <w:t xml:space="preserve">{{ </w:t>
       </w:r>
       <w:proofErr w:type="spellStart"/>
       <w:r>
-        <w:t>graph_image</w:t>
+        <w:t>graph</w:t>
+      </w:r>
+      <w:proofErr w:type="gramEnd"/>
+      <w:r>
+        <w:t>_</w:t>
+      </w:r>
+      <w:proofErr w:type="gramStart"/>
+      <w:r>
+        <w:t>image</w:t>
       </w:r>
       <w:proofErr w:type="spellEnd"/>
       <w:r>
-        <w:t xml:space="preserve"> }}</w:t>
+        <w:t xml:space="preserve"> }</w:t>
+      </w:r>
+      <w:proofErr w:type="gramEnd"/>
+      <w:r>
+        <w:t>}</w:t>
       </w:r>
     </w:p>
     <w:sectPr>

</xml_diff>